<commit_message>
docs: embed official college logo and university crest across PDF, DOCX, HTML, and MD formats
</commit_message>
<xml_diff>
--- a/CampusNotify_Mini_Project_Logbook.docx
+++ b/CampusNotify_Mini_Project_Logbook.docx
@@ -2,9 +2,245 @@
 <file path=word/document.xml><?xml version="1.0" encoding="utf-8"?>
 <w:document xmlns:wpc="http://schemas.microsoft.com/office/word/2010/wordprocessingCanvas" xmlns:mo="http://schemas.microsoft.com/office/mac/office/2008/main" xmlns:mc="http://schemas.openxmlformats.org/markup-compatibility/2006" xmlns:mv="urn:schemas-microsoft-com:mac:vml" xmlns:o="urn:schemas-microsoft-com:office:office" xmlns:r="http://schemas.openxmlformats.org/officeDocument/2006/relationships" xmlns:m="http://schemas.openxmlformats.org/officeDocument/2006/math" xmlns:v="urn:schemas-microsoft-com:vml" xmlns:wp14="http://schemas.microsoft.com/office/word/2010/wordprocessingDrawing" xmlns:wp="http://schemas.openxmlformats.org/drawingml/2006/wordprocessingDrawing" xmlns:w10="urn:schemas-microsoft-com:office:word" xmlns:w="http://schemas.openxmlformats.org/wordprocessingml/2006/main" xmlns:w14="http://schemas.microsoft.com/office/word/2010/wordml" xmlns:wpg="http://schemas.microsoft.com/office/word/2010/wordprocessingGroup" xmlns:wpi="http://schemas.microsoft.com/office/word/2010/wordprocessingInk" xmlns:wne="http://schemas.microsoft.com/office/word/2006/wordml" xmlns:wps="http://schemas.microsoft.com/office/word/2010/wordprocessingShape" mc:Ignorable="w14 wp14">
   <w:body>
+    <w:tbl>
+      <w:tblPr>
+        <w:tblW w:type="auto" w:w="0"/>
+        <w:jc w:val="center"/>
+        <w:tblLook w:firstColumn="1" w:firstRow="1" w:lastColumn="0" w:lastRow="0" w:noHBand="0" w:noVBand="1" w:val="04A0"/>
+      </w:tblPr>
+      <w:tblGrid>
+        <w:gridCol w:w="3216"/>
+        <w:gridCol w:w="3216"/>
+        <w:gridCol w:w="3216"/>
+      </w:tblGrid>
+      <w:tr>
+        <w:tc>
+          <w:tcPr>
+            <w:tcW w:type="dxa" w:w="1728"/>
+            <w:tcBorders>
+              <w:top w:val="none"/>
+              <w:bottom w:val="single" w:sz="8" w:space="0" w:color="000000"/>
+              <w:left w:val="none"/>
+              <w:right w:val="none"/>
+            </w:tcBorders>
+            <w:tcMar>
+              <w:top w:w="20" w:type="dxa"/>
+              <w:bottom w:w="40" w:type="dxa"/>
+              <w:left w:w="20" w:type="dxa"/>
+              <w:right w:w="20" w:type="dxa"/>
+            </w:tcMar>
+          </w:tcPr>
+          <w:p>
+            <w:pPr>
+              <w:jc w:val="center"/>
+            </w:pPr>
+            <w:r>
+              <w:drawing>
+                <wp:inline xmlns:a="http://schemas.openxmlformats.org/drawingml/2006/main" xmlns:pic="http://schemas.openxmlformats.org/drawingml/2006/picture">
+                  <wp:extent cx="960120" cy="1222754"/>
+                  <wp:docPr id="1" name="Picture 1"/>
+                  <wp:cNvGraphicFramePr>
+                    <a:graphicFrameLocks noChangeAspect="1"/>
+                  </wp:cNvGraphicFramePr>
+                  <a:graphic>
+                    <a:graphicData uri="http://schemas.openxmlformats.org/drawingml/2006/picture">
+                      <pic:pic>
+                        <pic:nvPicPr>
+                          <pic:cNvPr id="0" name="college_logo.png"/>
+                          <pic:cNvPicPr/>
+                        </pic:nvPicPr>
+                        <pic:blipFill>
+                          <a:blip r:embed="rId9"/>
+                          <a:stretch>
+                            <a:fillRect/>
+                          </a:stretch>
+                        </pic:blipFill>
+                        <pic:spPr>
+                          <a:xfrm>
+                            <a:off x="0" y="0"/>
+                            <a:ext cx="960120" cy="1222754"/>
+                          </a:xfrm>
+                          <a:prstGeom prst="rect"/>
+                        </pic:spPr>
+                      </pic:pic>
+                    </a:graphicData>
+                  </a:graphic>
+                </wp:inline>
+              </w:drawing>
+            </w:r>
+          </w:p>
+        </w:tc>
+        <w:tc>
+          <w:tcPr>
+            <w:tcW w:type="dxa" w:w="6192"/>
+            <w:tcBorders>
+              <w:top w:val="none"/>
+              <w:bottom w:val="single" w:sz="8" w:space="0" w:color="000000"/>
+              <w:left w:val="none"/>
+              <w:right w:val="none"/>
+            </w:tcBorders>
+            <w:tcMar>
+              <w:top w:w="20" w:type="dxa"/>
+              <w:bottom w:w="40" w:type="dxa"/>
+              <w:left w:w="20" w:type="dxa"/>
+              <w:right w:w="20" w:type="dxa"/>
+            </w:tcMar>
+          </w:tcPr>
+          <w:p>
+            <w:pPr>
+              <w:spacing w:line="276" w:lineRule="auto" w:after="40"/>
+              <w:jc w:val="center"/>
+            </w:pPr>
+            <w:r>
+              <w:rPr>
+                <w:rFonts w:ascii="Times New Roman" w:hAnsi="Times New Roman"/>
+                <w:b/>
+                <w:i w:val="0"/>
+                <w:color w:val="000000"/>
+                <w:sz w:val="22"/>
+              </w:rPr>
+              <w:t>VASANTDADA PATIL PRATISHTHAN'S</w:t>
+              <w:br/>
+              <w:t>COLLEGE OF ENGINEERING AND VISUAL ARTS</w:t>
+              <w:br/>
+            </w:r>
+            <w:r>
+              <w:rPr>
+                <w:rFonts w:ascii="Times New Roman" w:hAnsi="Times New Roman"/>
+                <w:b w:val="0"/>
+                <w:i/>
+                <w:color w:val="000000"/>
+                <w:sz w:val="18"/>
+              </w:rPr>
+              <w:t>(An Autonomous Institute)</w:t>
+              <w:br/>
+              <w:t>NAAC 'A' Grade Accredited | ISO 9001:2015 Certified</w:t>
+              <w:br/>
+            </w:r>
+            <w:r>
+              <w:rPr>
+                <w:rFonts w:ascii="Times New Roman" w:hAnsi="Times New Roman"/>
+                <w:b/>
+                <w:i w:val="0"/>
+                <w:color w:val="000000"/>
+                <w:sz w:val="21"/>
+              </w:rPr>
+              <w:t>DEPARTMENT OF INFORMATION TECHNOLOGY</w:t>
+              <w:br/>
+            </w:r>
+            <w:r>
+              <w:rPr>
+                <w:rFonts w:ascii="Times New Roman" w:hAnsi="Times New Roman"/>
+                <w:b w:val="0"/>
+                <w:i/>
+                <w:color w:val="000000"/>
+                <w:sz w:val="17"/>
+              </w:rPr>
+              <w:t>NBA Accredited (Dated 01/07/2024 to 30/06/2027)</w:t>
+            </w:r>
+          </w:p>
+        </w:tc>
+        <w:tc>
+          <w:tcPr>
+            <w:tcW w:type="dxa" w:w="1728"/>
+            <w:tcBorders>
+              <w:top w:val="none"/>
+              <w:bottom w:val="single" w:sz="8" w:space="0" w:color="000000"/>
+              <w:left w:val="none"/>
+              <w:right w:val="none"/>
+            </w:tcBorders>
+            <w:tcMar>
+              <w:top w:w="20" w:type="dxa"/>
+              <w:bottom w:w="40" w:type="dxa"/>
+              <w:left w:w="20" w:type="dxa"/>
+              <w:right w:w="20" w:type="dxa"/>
+            </w:tcMar>
+          </w:tcPr>
+          <w:p>
+            <w:pPr>
+              <w:jc w:val="center"/>
+            </w:pPr>
+            <w:r>
+              <w:drawing>
+                <wp:inline xmlns:a="http://schemas.openxmlformats.org/drawingml/2006/main" xmlns:pic="http://schemas.openxmlformats.org/drawingml/2006/picture">
+                  <wp:extent cx="960120" cy="1286198"/>
+                  <wp:docPr id="2" name="Picture 2"/>
+                  <wp:cNvGraphicFramePr>
+                    <a:graphicFrameLocks noChangeAspect="1"/>
+                  </wp:cNvGraphicFramePr>
+                  <a:graphic>
+                    <a:graphicData uri="http://schemas.openxmlformats.org/drawingml/2006/picture">
+                      <pic:pic>
+                        <pic:nvPicPr>
+                          <pic:cNvPr id="0" name="it_dept_logo.png"/>
+                          <pic:cNvPicPr/>
+                        </pic:nvPicPr>
+                        <pic:blipFill>
+                          <a:blip r:embed="rId10"/>
+                          <a:stretch>
+                            <a:fillRect/>
+                          </a:stretch>
+                        </pic:blipFill>
+                        <pic:spPr>
+                          <a:xfrm>
+                            <a:off x="0" y="0"/>
+                            <a:ext cx="960120" cy="1286198"/>
+                          </a:xfrm>
+                          <a:prstGeom prst="rect"/>
+                        </pic:spPr>
+                      </pic:pic>
+                    </a:graphicData>
+                  </a:graphic>
+                </wp:inline>
+              </w:drawing>
+            </w:r>
+          </w:p>
+        </w:tc>
+      </w:tr>
+    </w:tbl>
     <w:p>
       <w:pPr>
-        <w:spacing w:after="40" w:before="0" w:line="276" w:lineRule="auto"/>
+        <w:spacing w:before="160" w:after="120"/>
+        <w:jc w:val="center"/>
+      </w:pPr>
+      <w:r>
+        <w:drawing>
+          <wp:inline xmlns:a="http://schemas.openxmlformats.org/drawingml/2006/main" xmlns:pic="http://schemas.openxmlformats.org/drawingml/2006/picture">
+            <wp:extent cx="1097280" cy="859692"/>
+            <wp:docPr id="3" name="Picture 3"/>
+            <wp:cNvGraphicFramePr>
+              <a:graphicFrameLocks noChangeAspect="1"/>
+            </wp:cNvGraphicFramePr>
+            <a:graphic>
+              <a:graphicData uri="http://schemas.openxmlformats.org/drawingml/2006/picture">
+                <pic:pic>
+                  <pic:nvPicPr>
+                    <pic:cNvPr id="0" name="university_crest.jpg"/>
+                    <pic:cNvPicPr/>
+                  </pic:nvPicPr>
+                  <pic:blipFill>
+                    <a:blip r:embed="rId11"/>
+                    <a:stretch>
+                      <a:fillRect/>
+                    </a:stretch>
+                  </pic:blipFill>
+                  <pic:spPr>
+                    <a:xfrm>
+                      <a:off x="0" y="0"/>
+                      <a:ext cx="1097280" cy="859692"/>
+                    </a:xfrm>
+                    <a:prstGeom prst="rect"/>
+                  </pic:spPr>
+                </pic:pic>
+              </a:graphicData>
+            </a:graphic>
+          </wp:inline>
+        </w:drawing>
+      </w:r>
+    </w:p>
+    <w:p>
+      <w:pPr>
+        <w:spacing w:after="60" w:before="0" w:line="276" w:lineRule="auto"/>
         <w:jc w:val="center"/>
       </w:pPr>
       <w:r>
@@ -13,71 +249,7 @@
           <w:b/>
           <w:i w:val="0"/>
           <w:color w:val="000000"/>
-          <w:sz w:val="26"/>
-        </w:rPr>
-        <w:t>VASANTDADA PATIL PRATISHTHAN'S COLLEGE OF ENGINEERING AND VISUAL ARTS</w:t>
-      </w:r>
-    </w:p>
-    <w:p>
-      <w:pPr>
-        <w:spacing w:after="40" w:before="0" w:line="276" w:lineRule="auto"/>
-        <w:jc w:val="center"/>
-      </w:pPr>
-      <w:r>
-        <w:rPr>
-          <w:rFonts w:ascii="Times New Roman" w:hAnsi="Times New Roman"/>
-          <w:b/>
-          <w:i w:val="0"/>
-          <w:color w:val="000000"/>
-          <w:sz w:val="22"/>
-        </w:rPr>
-        <w:t>DEPARTMENT OF INFORMATION TECHNOLOGY</w:t>
-      </w:r>
-    </w:p>
-    <w:p>
-      <w:pPr>
-        <w:spacing w:after="40" w:before="0" w:line="276" w:lineRule="auto"/>
-        <w:jc w:val="center"/>
-      </w:pPr>
-      <w:r>
-        <w:rPr>
-          <w:rFonts w:ascii="Times New Roman" w:hAnsi="Times New Roman"/>
-          <w:b w:val="0"/>
-          <w:i/>
-          <w:color w:val="000000"/>
-          <w:sz w:val="19"/>
-        </w:rPr>
-        <w:t>NAAC 'A' Grade Accredited | ISO 9001:2015 Certified Institute | NBA Accredited</w:t>
-      </w:r>
-    </w:p>
-    <w:p>
-      <w:pPr>
-        <w:spacing w:after="360" w:before="0" w:line="276" w:lineRule="auto"/>
-        <w:jc w:val="center"/>
-      </w:pPr>
-      <w:r>
-        <w:rPr>
-          <w:rFonts w:ascii="Times New Roman" w:hAnsi="Times New Roman"/>
-          <w:b w:val="0"/>
-          <w:i w:val="0"/>
-          <w:color w:val="000000"/>
-          <w:sz w:val="19"/>
-        </w:rPr>
-        <w:t>Sion, Mumbai - 400022 | University of Mumbai</w:t>
-      </w:r>
-    </w:p>
-    <w:p>
-      <w:pPr>
-        <w:spacing w:after="80" w:before="0" w:line="276" w:lineRule="auto"/>
-        <w:jc w:val="center"/>
-      </w:pPr>
-      <w:r>
-        <w:rPr>
-          <w:rFonts w:ascii="Times New Roman" w:hAnsi="Times New Roman"/>
-          <w:b/>
-          <w:i w:val="0"/>
-          <w:color w:val="000000"/>
-          <w:sz w:val="32"/>
+          <w:sz w:val="30"/>
         </w:rPr>
         <w:t>MINI-PROJECT LOGBOOK</w:t>
       </w:r>
@@ -100,7 +272,7 @@
     </w:p>
     <w:p>
       <w:pPr>
-        <w:spacing w:after="320" w:before="0" w:line="276" w:lineRule="auto"/>
+        <w:spacing w:after="200" w:before="0" w:line="276" w:lineRule="auto"/>
         <w:jc w:val="center"/>
       </w:pPr>
       <w:r>
@@ -116,7 +288,7 @@
     </w:p>
     <w:p>
       <w:pPr>
-        <w:spacing w:after="320" w:before="0" w:line="276" w:lineRule="auto"/>
+        <w:spacing w:after="240" w:before="0" w:line="276" w:lineRule="auto"/>
         <w:jc w:val="center"/>
       </w:pPr>
       <w:r>
@@ -137,15 +309,15 @@
         <w:tblLook w:firstColumn="1" w:firstRow="1" w:lastColumn="0" w:lastRow="0" w:noHBand="0" w:noVBand="1" w:val="04A0"/>
       </w:tblPr>
       <w:tblGrid>
-        <w:gridCol w:w="2340"/>
-        <w:gridCol w:w="2340"/>
-        <w:gridCol w:w="2340"/>
-        <w:gridCol w:w="2340"/>
+        <w:gridCol w:w="2412"/>
+        <w:gridCol w:w="2412"/>
+        <w:gridCol w:w="2412"/>
+        <w:gridCol w:w="2412"/>
       </w:tblGrid>
       <w:tr>
         <w:tc>
           <w:tcPr>
-            <w:tcW w:type="dxa" w:w="2340"/>
+            <w:tcW w:type="dxa" w:w="2412"/>
             <w:tcBorders>
               <w:top w:val="single" w:sz="4" w:space="0" w:color="000000"/>
               <w:bottom w:val="single" w:sz="4" w:space="0" w:color="000000"/>
@@ -153,10 +325,10 @@
               <w:right w:val="single" w:sz="4" w:space="0" w:color="000000"/>
             </w:tcBorders>
             <w:tcMar>
-              <w:top w:w="80" w:type="dxa"/>
-              <w:bottom w:w="80" w:type="dxa"/>
-              <w:left w:w="80" w:type="dxa"/>
-              <w:right w:w="80" w:type="dxa"/>
+              <w:top w:w="60" w:type="dxa"/>
+              <w:bottom w:w="60" w:type="dxa"/>
+              <w:left w:w="60" w:type="dxa"/>
+              <w:right w:w="60" w:type="dxa"/>
             </w:tcMar>
           </w:tcPr>
           <w:p>
@@ -169,7 +341,7 @@
                 <w:b/>
                 <w:i w:val="0"/>
                 <w:color w:val="000000"/>
-                <w:sz w:val="20"/>
+                <w:sz w:val="19"/>
               </w:rPr>
               <w:t>Sr.</w:t>
             </w:r>
@@ -177,7 +349,7 @@
         </w:tc>
         <w:tc>
           <w:tcPr>
-            <w:tcW w:type="dxa" w:w="2340"/>
+            <w:tcW w:type="dxa" w:w="2412"/>
             <w:tcBorders>
               <w:top w:val="single" w:sz="4" w:space="0" w:color="000000"/>
               <w:bottom w:val="single" w:sz="4" w:space="0" w:color="000000"/>
@@ -185,10 +357,10 @@
               <w:right w:val="single" w:sz="4" w:space="0" w:color="000000"/>
             </w:tcBorders>
             <w:tcMar>
-              <w:top w:w="80" w:type="dxa"/>
-              <w:bottom w:w="80" w:type="dxa"/>
-              <w:left w:w="80" w:type="dxa"/>
-              <w:right w:w="80" w:type="dxa"/>
+              <w:top w:w="60" w:type="dxa"/>
+              <w:bottom w:w="60" w:type="dxa"/>
+              <w:left w:w="60" w:type="dxa"/>
+              <w:right w:w="60" w:type="dxa"/>
             </w:tcMar>
           </w:tcPr>
           <w:p>
@@ -201,7 +373,7 @@
                 <w:b/>
                 <w:i w:val="0"/>
                 <w:color w:val="000000"/>
-                <w:sz w:val="20"/>
+                <w:sz w:val="19"/>
               </w:rPr>
               <w:t>Roll No.</w:t>
             </w:r>
@@ -209,7 +381,7 @@
         </w:tc>
         <w:tc>
           <w:tcPr>
-            <w:tcW w:type="dxa" w:w="2340"/>
+            <w:tcW w:type="dxa" w:w="2412"/>
             <w:tcBorders>
               <w:top w:val="single" w:sz="4" w:space="0" w:color="000000"/>
               <w:bottom w:val="single" w:sz="4" w:space="0" w:color="000000"/>
@@ -217,10 +389,10 @@
               <w:right w:val="single" w:sz="4" w:space="0" w:color="000000"/>
             </w:tcBorders>
             <w:tcMar>
-              <w:top w:w="80" w:type="dxa"/>
-              <w:bottom w:w="80" w:type="dxa"/>
-              <w:left w:w="80" w:type="dxa"/>
-              <w:right w:w="80" w:type="dxa"/>
+              <w:top w:w="60" w:type="dxa"/>
+              <w:bottom w:w="60" w:type="dxa"/>
+              <w:left w:w="60" w:type="dxa"/>
+              <w:right w:w="60" w:type="dxa"/>
             </w:tcMar>
           </w:tcPr>
           <w:p>
@@ -233,7 +405,7 @@
                 <w:b/>
                 <w:i w:val="0"/>
                 <w:color w:val="000000"/>
-                <w:sz w:val="20"/>
+                <w:sz w:val="19"/>
               </w:rPr>
               <w:t>Student Name</w:t>
             </w:r>
@@ -241,7 +413,7 @@
         </w:tc>
         <w:tc>
           <w:tcPr>
-            <w:tcW w:type="dxa" w:w="2340"/>
+            <w:tcW w:type="dxa" w:w="2412"/>
             <w:tcBorders>
               <w:top w:val="single" w:sz="4" w:space="0" w:color="000000"/>
               <w:bottom w:val="single" w:sz="4" w:space="0" w:color="000000"/>
@@ -249,10 +421,10 @@
               <w:right w:val="single" w:sz="4" w:space="0" w:color="000000"/>
             </w:tcBorders>
             <w:tcMar>
-              <w:top w:w="80" w:type="dxa"/>
-              <w:bottom w:w="80" w:type="dxa"/>
-              <w:left w:w="80" w:type="dxa"/>
-              <w:right w:w="80" w:type="dxa"/>
+              <w:top w:w="60" w:type="dxa"/>
+              <w:bottom w:w="60" w:type="dxa"/>
+              <w:left w:w="60" w:type="dxa"/>
+              <w:right w:w="60" w:type="dxa"/>
             </w:tcMar>
           </w:tcPr>
           <w:p>
@@ -265,7 +437,7 @@
                 <w:b/>
                 <w:i w:val="0"/>
                 <w:color w:val="000000"/>
-                <w:sz w:val="20"/>
+                <w:sz w:val="19"/>
               </w:rPr>
               <w:t>Student ID (VPPCOE)</w:t>
             </w:r>
@@ -275,7 +447,7 @@
       <w:tr>
         <w:tc>
           <w:tcPr>
-            <w:tcW w:type="dxa" w:w="2340"/>
+            <w:tcW w:type="dxa" w:w="2412"/>
             <w:tcBorders>
               <w:top w:val="single" w:sz="4" w:space="0" w:color="000000"/>
               <w:bottom w:val="single" w:sz="4" w:space="0" w:color="000000"/>
@@ -283,10 +455,10 @@
               <w:right w:val="single" w:sz="4" w:space="0" w:color="000000"/>
             </w:tcBorders>
             <w:tcMar>
-              <w:top w:w="80" w:type="dxa"/>
-              <w:bottom w:w="80" w:type="dxa"/>
-              <w:left w:w="80" w:type="dxa"/>
-              <w:right w:w="80" w:type="dxa"/>
+              <w:top w:w="50" w:type="dxa"/>
+              <w:bottom w:w="50" w:type="dxa"/>
+              <w:left w:w="50" w:type="dxa"/>
+              <w:right w:w="50" w:type="dxa"/>
             </w:tcMar>
           </w:tcPr>
           <w:p>
@@ -299,7 +471,7 @@
                 <w:b w:val="0"/>
                 <w:i w:val="0"/>
                 <w:color w:val="000000"/>
-                <w:sz w:val="19"/>
+                <w:sz w:val="18"/>
               </w:rPr>
               <w:t>1</w:t>
             </w:r>
@@ -307,7 +479,7 @@
         </w:tc>
         <w:tc>
           <w:tcPr>
-            <w:tcW w:type="dxa" w:w="2340"/>
+            <w:tcW w:type="dxa" w:w="2412"/>
             <w:tcBorders>
               <w:top w:val="single" w:sz="4" w:space="0" w:color="000000"/>
               <w:bottom w:val="single" w:sz="4" w:space="0" w:color="000000"/>
@@ -315,10 +487,10 @@
               <w:right w:val="single" w:sz="4" w:space="0" w:color="000000"/>
             </w:tcBorders>
             <w:tcMar>
-              <w:top w:w="80" w:type="dxa"/>
-              <w:bottom w:w="80" w:type="dxa"/>
-              <w:left w:w="80" w:type="dxa"/>
-              <w:right w:w="80" w:type="dxa"/>
+              <w:top w:w="50" w:type="dxa"/>
+              <w:bottom w:w="50" w:type="dxa"/>
+              <w:left w:w="50" w:type="dxa"/>
+              <w:right w:w="50" w:type="dxa"/>
             </w:tcMar>
           </w:tcPr>
           <w:p>
@@ -331,7 +503,7 @@
                 <w:b w:val="0"/>
                 <w:i w:val="0"/>
                 <w:color w:val="000000"/>
-                <w:sz w:val="19"/>
+                <w:sz w:val="18"/>
               </w:rPr>
               <w:t>____________</w:t>
             </w:r>
@@ -339,7 +511,7 @@
         </w:tc>
         <w:tc>
           <w:tcPr>
-            <w:tcW w:type="dxa" w:w="2340"/>
+            <w:tcW w:type="dxa" w:w="2412"/>
             <w:tcBorders>
               <w:top w:val="single" w:sz="4" w:space="0" w:color="000000"/>
               <w:bottom w:val="single" w:sz="4" w:space="0" w:color="000000"/>
@@ -347,10 +519,10 @@
               <w:right w:val="single" w:sz="4" w:space="0" w:color="000000"/>
             </w:tcBorders>
             <w:tcMar>
-              <w:top w:w="80" w:type="dxa"/>
-              <w:bottom w:w="80" w:type="dxa"/>
-              <w:left w:w="80" w:type="dxa"/>
-              <w:right w:w="80" w:type="dxa"/>
+              <w:top w:w="50" w:type="dxa"/>
+              <w:bottom w:w="50" w:type="dxa"/>
+              <w:left w:w="50" w:type="dxa"/>
+              <w:right w:w="50" w:type="dxa"/>
             </w:tcMar>
           </w:tcPr>
           <w:p>
@@ -360,7 +532,7 @@
                 <w:b w:val="0"/>
                 <w:i w:val="0"/>
                 <w:color w:val="000000"/>
-                <w:sz w:val="19"/>
+                <w:sz w:val="18"/>
               </w:rPr>
               <w:t>____________________________________</w:t>
             </w:r>
@@ -368,7 +540,7 @@
         </w:tc>
         <w:tc>
           <w:tcPr>
-            <w:tcW w:type="dxa" w:w="2340"/>
+            <w:tcW w:type="dxa" w:w="2412"/>
             <w:tcBorders>
               <w:top w:val="single" w:sz="4" w:space="0" w:color="000000"/>
               <w:bottom w:val="single" w:sz="4" w:space="0" w:color="000000"/>
@@ -376,10 +548,10 @@
               <w:right w:val="single" w:sz="4" w:space="0" w:color="000000"/>
             </w:tcBorders>
             <w:tcMar>
-              <w:top w:w="80" w:type="dxa"/>
-              <w:bottom w:w="80" w:type="dxa"/>
-              <w:left w:w="80" w:type="dxa"/>
-              <w:right w:w="80" w:type="dxa"/>
+              <w:top w:w="50" w:type="dxa"/>
+              <w:bottom w:w="50" w:type="dxa"/>
+              <w:left w:w="50" w:type="dxa"/>
+              <w:right w:w="50" w:type="dxa"/>
             </w:tcMar>
           </w:tcPr>
           <w:p>
@@ -392,7 +564,7 @@
                 <w:b w:val="0"/>
                 <w:i w:val="0"/>
                 <w:color w:val="000000"/>
-                <w:sz w:val="19"/>
+                <w:sz w:val="18"/>
               </w:rPr>
               <w:t>VU4F2425-________</w:t>
             </w:r>
@@ -402,7 +574,7 @@
       <w:tr>
         <w:tc>
           <w:tcPr>
-            <w:tcW w:type="dxa" w:w="2340"/>
+            <w:tcW w:type="dxa" w:w="2412"/>
             <w:tcBorders>
               <w:top w:val="single" w:sz="4" w:space="0" w:color="000000"/>
               <w:bottom w:val="single" w:sz="4" w:space="0" w:color="000000"/>
@@ -410,10 +582,10 @@
               <w:right w:val="single" w:sz="4" w:space="0" w:color="000000"/>
             </w:tcBorders>
             <w:tcMar>
-              <w:top w:w="80" w:type="dxa"/>
-              <w:bottom w:w="80" w:type="dxa"/>
-              <w:left w:w="80" w:type="dxa"/>
-              <w:right w:w="80" w:type="dxa"/>
+              <w:top w:w="50" w:type="dxa"/>
+              <w:bottom w:w="50" w:type="dxa"/>
+              <w:left w:w="50" w:type="dxa"/>
+              <w:right w:w="50" w:type="dxa"/>
             </w:tcMar>
           </w:tcPr>
           <w:p>
@@ -426,7 +598,7 @@
                 <w:b w:val="0"/>
                 <w:i w:val="0"/>
                 <w:color w:val="000000"/>
-                <w:sz w:val="19"/>
+                <w:sz w:val="18"/>
               </w:rPr>
               <w:t>2</w:t>
             </w:r>
@@ -434,7 +606,7 @@
         </w:tc>
         <w:tc>
           <w:tcPr>
-            <w:tcW w:type="dxa" w:w="2340"/>
+            <w:tcW w:type="dxa" w:w="2412"/>
             <w:tcBorders>
               <w:top w:val="single" w:sz="4" w:space="0" w:color="000000"/>
               <w:bottom w:val="single" w:sz="4" w:space="0" w:color="000000"/>
@@ -442,10 +614,10 @@
               <w:right w:val="single" w:sz="4" w:space="0" w:color="000000"/>
             </w:tcBorders>
             <w:tcMar>
-              <w:top w:w="80" w:type="dxa"/>
-              <w:bottom w:w="80" w:type="dxa"/>
-              <w:left w:w="80" w:type="dxa"/>
-              <w:right w:w="80" w:type="dxa"/>
+              <w:top w:w="50" w:type="dxa"/>
+              <w:bottom w:w="50" w:type="dxa"/>
+              <w:left w:w="50" w:type="dxa"/>
+              <w:right w:w="50" w:type="dxa"/>
             </w:tcMar>
           </w:tcPr>
           <w:p>
@@ -458,7 +630,7 @@
                 <w:b w:val="0"/>
                 <w:i w:val="0"/>
                 <w:color w:val="000000"/>
-                <w:sz w:val="19"/>
+                <w:sz w:val="18"/>
               </w:rPr>
               <w:t>____________</w:t>
             </w:r>
@@ -466,7 +638,7 @@
         </w:tc>
         <w:tc>
           <w:tcPr>
-            <w:tcW w:type="dxa" w:w="2340"/>
+            <w:tcW w:type="dxa" w:w="2412"/>
             <w:tcBorders>
               <w:top w:val="single" w:sz="4" w:space="0" w:color="000000"/>
               <w:bottom w:val="single" w:sz="4" w:space="0" w:color="000000"/>
@@ -474,10 +646,10 @@
               <w:right w:val="single" w:sz="4" w:space="0" w:color="000000"/>
             </w:tcBorders>
             <w:tcMar>
-              <w:top w:w="80" w:type="dxa"/>
-              <w:bottom w:w="80" w:type="dxa"/>
-              <w:left w:w="80" w:type="dxa"/>
-              <w:right w:w="80" w:type="dxa"/>
+              <w:top w:w="50" w:type="dxa"/>
+              <w:bottom w:w="50" w:type="dxa"/>
+              <w:left w:w="50" w:type="dxa"/>
+              <w:right w:w="50" w:type="dxa"/>
             </w:tcMar>
           </w:tcPr>
           <w:p>
@@ -487,7 +659,7 @@
                 <w:b w:val="0"/>
                 <w:i w:val="0"/>
                 <w:color w:val="000000"/>
-                <w:sz w:val="19"/>
+                <w:sz w:val="18"/>
               </w:rPr>
               <w:t>____________________________________</w:t>
             </w:r>
@@ -495,7 +667,7 @@
         </w:tc>
         <w:tc>
           <w:tcPr>
-            <w:tcW w:type="dxa" w:w="2340"/>
+            <w:tcW w:type="dxa" w:w="2412"/>
             <w:tcBorders>
               <w:top w:val="single" w:sz="4" w:space="0" w:color="000000"/>
               <w:bottom w:val="single" w:sz="4" w:space="0" w:color="000000"/>
@@ -503,10 +675,10 @@
               <w:right w:val="single" w:sz="4" w:space="0" w:color="000000"/>
             </w:tcBorders>
             <w:tcMar>
-              <w:top w:w="80" w:type="dxa"/>
-              <w:bottom w:w="80" w:type="dxa"/>
-              <w:left w:w="80" w:type="dxa"/>
-              <w:right w:w="80" w:type="dxa"/>
+              <w:top w:w="50" w:type="dxa"/>
+              <w:bottom w:w="50" w:type="dxa"/>
+              <w:left w:w="50" w:type="dxa"/>
+              <w:right w:w="50" w:type="dxa"/>
             </w:tcMar>
           </w:tcPr>
           <w:p>
@@ -519,7 +691,7 @@
                 <w:b w:val="0"/>
                 <w:i w:val="0"/>
                 <w:color w:val="000000"/>
-                <w:sz w:val="19"/>
+                <w:sz w:val="18"/>
               </w:rPr>
               <w:t>VU4F2425-________</w:t>
             </w:r>
@@ -529,7 +701,7 @@
       <w:tr>
         <w:tc>
           <w:tcPr>
-            <w:tcW w:type="dxa" w:w="2340"/>
+            <w:tcW w:type="dxa" w:w="2412"/>
             <w:tcBorders>
               <w:top w:val="single" w:sz="4" w:space="0" w:color="000000"/>
               <w:bottom w:val="single" w:sz="4" w:space="0" w:color="000000"/>
@@ -537,10 +709,10 @@
               <w:right w:val="single" w:sz="4" w:space="0" w:color="000000"/>
             </w:tcBorders>
             <w:tcMar>
-              <w:top w:w="80" w:type="dxa"/>
-              <w:bottom w:w="80" w:type="dxa"/>
-              <w:left w:w="80" w:type="dxa"/>
-              <w:right w:w="80" w:type="dxa"/>
+              <w:top w:w="50" w:type="dxa"/>
+              <w:bottom w:w="50" w:type="dxa"/>
+              <w:left w:w="50" w:type="dxa"/>
+              <w:right w:w="50" w:type="dxa"/>
             </w:tcMar>
           </w:tcPr>
           <w:p>
@@ -553,7 +725,7 @@
                 <w:b w:val="0"/>
                 <w:i w:val="0"/>
                 <w:color w:val="000000"/>
-                <w:sz w:val="19"/>
+                <w:sz w:val="18"/>
               </w:rPr>
               <w:t>3</w:t>
             </w:r>
@@ -561,7 +733,7 @@
         </w:tc>
         <w:tc>
           <w:tcPr>
-            <w:tcW w:type="dxa" w:w="2340"/>
+            <w:tcW w:type="dxa" w:w="2412"/>
             <w:tcBorders>
               <w:top w:val="single" w:sz="4" w:space="0" w:color="000000"/>
               <w:bottom w:val="single" w:sz="4" w:space="0" w:color="000000"/>
@@ -569,10 +741,10 @@
               <w:right w:val="single" w:sz="4" w:space="0" w:color="000000"/>
             </w:tcBorders>
             <w:tcMar>
-              <w:top w:w="80" w:type="dxa"/>
-              <w:bottom w:w="80" w:type="dxa"/>
-              <w:left w:w="80" w:type="dxa"/>
-              <w:right w:w="80" w:type="dxa"/>
+              <w:top w:w="50" w:type="dxa"/>
+              <w:bottom w:w="50" w:type="dxa"/>
+              <w:left w:w="50" w:type="dxa"/>
+              <w:right w:w="50" w:type="dxa"/>
             </w:tcMar>
           </w:tcPr>
           <w:p>
@@ -585,7 +757,7 @@
                 <w:b w:val="0"/>
                 <w:i w:val="0"/>
                 <w:color w:val="000000"/>
-                <w:sz w:val="19"/>
+                <w:sz w:val="18"/>
               </w:rPr>
               <w:t>____________</w:t>
             </w:r>
@@ -593,7 +765,7 @@
         </w:tc>
         <w:tc>
           <w:tcPr>
-            <w:tcW w:type="dxa" w:w="2340"/>
+            <w:tcW w:type="dxa" w:w="2412"/>
             <w:tcBorders>
               <w:top w:val="single" w:sz="4" w:space="0" w:color="000000"/>
               <w:bottom w:val="single" w:sz="4" w:space="0" w:color="000000"/>
@@ -601,10 +773,10 @@
               <w:right w:val="single" w:sz="4" w:space="0" w:color="000000"/>
             </w:tcBorders>
             <w:tcMar>
-              <w:top w:w="80" w:type="dxa"/>
-              <w:bottom w:w="80" w:type="dxa"/>
-              <w:left w:w="80" w:type="dxa"/>
-              <w:right w:w="80" w:type="dxa"/>
+              <w:top w:w="50" w:type="dxa"/>
+              <w:bottom w:w="50" w:type="dxa"/>
+              <w:left w:w="50" w:type="dxa"/>
+              <w:right w:w="50" w:type="dxa"/>
             </w:tcMar>
           </w:tcPr>
           <w:p>
@@ -614,7 +786,7 @@
                 <w:b w:val="0"/>
                 <w:i w:val="0"/>
                 <w:color w:val="000000"/>
-                <w:sz w:val="19"/>
+                <w:sz w:val="18"/>
               </w:rPr>
               <w:t>____________________________________</w:t>
             </w:r>
@@ -622,7 +794,7 @@
         </w:tc>
         <w:tc>
           <w:tcPr>
-            <w:tcW w:type="dxa" w:w="2340"/>
+            <w:tcW w:type="dxa" w:w="2412"/>
             <w:tcBorders>
               <w:top w:val="single" w:sz="4" w:space="0" w:color="000000"/>
               <w:bottom w:val="single" w:sz="4" w:space="0" w:color="000000"/>
@@ -630,10 +802,10 @@
               <w:right w:val="single" w:sz="4" w:space="0" w:color="000000"/>
             </w:tcBorders>
             <w:tcMar>
-              <w:top w:w="80" w:type="dxa"/>
-              <w:bottom w:w="80" w:type="dxa"/>
-              <w:left w:w="80" w:type="dxa"/>
-              <w:right w:w="80" w:type="dxa"/>
+              <w:top w:w="50" w:type="dxa"/>
+              <w:bottom w:w="50" w:type="dxa"/>
+              <w:left w:w="50" w:type="dxa"/>
+              <w:right w:w="50" w:type="dxa"/>
             </w:tcMar>
           </w:tcPr>
           <w:p>
@@ -646,7 +818,7 @@
                 <w:b w:val="0"/>
                 <w:i w:val="0"/>
                 <w:color w:val="000000"/>
-                <w:sz w:val="19"/>
+                <w:sz w:val="18"/>
               </w:rPr>
               <w:t>VU4F2425-________</w:t>
             </w:r>
@@ -656,7 +828,7 @@
       <w:tr>
         <w:tc>
           <w:tcPr>
-            <w:tcW w:type="dxa" w:w="2340"/>
+            <w:tcW w:type="dxa" w:w="2412"/>
             <w:tcBorders>
               <w:top w:val="single" w:sz="4" w:space="0" w:color="000000"/>
               <w:bottom w:val="single" w:sz="4" w:space="0" w:color="000000"/>
@@ -664,10 +836,10 @@
               <w:right w:val="single" w:sz="4" w:space="0" w:color="000000"/>
             </w:tcBorders>
             <w:tcMar>
-              <w:top w:w="80" w:type="dxa"/>
-              <w:bottom w:w="80" w:type="dxa"/>
-              <w:left w:w="80" w:type="dxa"/>
-              <w:right w:w="80" w:type="dxa"/>
+              <w:top w:w="50" w:type="dxa"/>
+              <w:bottom w:w="50" w:type="dxa"/>
+              <w:left w:w="50" w:type="dxa"/>
+              <w:right w:w="50" w:type="dxa"/>
             </w:tcMar>
           </w:tcPr>
           <w:p>
@@ -680,7 +852,7 @@
                 <w:b w:val="0"/>
                 <w:i w:val="0"/>
                 <w:color w:val="000000"/>
-                <w:sz w:val="19"/>
+                <w:sz w:val="18"/>
               </w:rPr>
               <w:t>4</w:t>
             </w:r>
@@ -688,7 +860,7 @@
         </w:tc>
         <w:tc>
           <w:tcPr>
-            <w:tcW w:type="dxa" w:w="2340"/>
+            <w:tcW w:type="dxa" w:w="2412"/>
             <w:tcBorders>
               <w:top w:val="single" w:sz="4" w:space="0" w:color="000000"/>
               <w:bottom w:val="single" w:sz="4" w:space="0" w:color="000000"/>
@@ -696,10 +868,10 @@
               <w:right w:val="single" w:sz="4" w:space="0" w:color="000000"/>
             </w:tcBorders>
             <w:tcMar>
-              <w:top w:w="80" w:type="dxa"/>
-              <w:bottom w:w="80" w:type="dxa"/>
-              <w:left w:w="80" w:type="dxa"/>
-              <w:right w:w="80" w:type="dxa"/>
+              <w:top w:w="50" w:type="dxa"/>
+              <w:bottom w:w="50" w:type="dxa"/>
+              <w:left w:w="50" w:type="dxa"/>
+              <w:right w:w="50" w:type="dxa"/>
             </w:tcMar>
           </w:tcPr>
           <w:p>
@@ -712,7 +884,7 @@
                 <w:b w:val="0"/>
                 <w:i w:val="0"/>
                 <w:color w:val="000000"/>
-                <w:sz w:val="19"/>
+                <w:sz w:val="18"/>
               </w:rPr>
               <w:t>____________</w:t>
             </w:r>
@@ -720,7 +892,7 @@
         </w:tc>
         <w:tc>
           <w:tcPr>
-            <w:tcW w:type="dxa" w:w="2340"/>
+            <w:tcW w:type="dxa" w:w="2412"/>
             <w:tcBorders>
               <w:top w:val="single" w:sz="4" w:space="0" w:color="000000"/>
               <w:bottom w:val="single" w:sz="4" w:space="0" w:color="000000"/>
@@ -728,10 +900,10 @@
               <w:right w:val="single" w:sz="4" w:space="0" w:color="000000"/>
             </w:tcBorders>
             <w:tcMar>
-              <w:top w:w="80" w:type="dxa"/>
-              <w:bottom w:w="80" w:type="dxa"/>
-              <w:left w:w="80" w:type="dxa"/>
-              <w:right w:w="80" w:type="dxa"/>
+              <w:top w:w="50" w:type="dxa"/>
+              <w:bottom w:w="50" w:type="dxa"/>
+              <w:left w:w="50" w:type="dxa"/>
+              <w:right w:w="50" w:type="dxa"/>
             </w:tcMar>
           </w:tcPr>
           <w:p>
@@ -741,7 +913,7 @@
                 <w:b w:val="0"/>
                 <w:i w:val="0"/>
                 <w:color w:val="000000"/>
-                <w:sz w:val="19"/>
+                <w:sz w:val="18"/>
               </w:rPr>
               <w:t>____________________________________</w:t>
             </w:r>
@@ -749,7 +921,7 @@
         </w:tc>
         <w:tc>
           <w:tcPr>
-            <w:tcW w:type="dxa" w:w="2340"/>
+            <w:tcW w:type="dxa" w:w="2412"/>
             <w:tcBorders>
               <w:top w:val="single" w:sz="4" w:space="0" w:color="000000"/>
               <w:bottom w:val="single" w:sz="4" w:space="0" w:color="000000"/>
@@ -757,10 +929,10 @@
               <w:right w:val="single" w:sz="4" w:space="0" w:color="000000"/>
             </w:tcBorders>
             <w:tcMar>
-              <w:top w:w="80" w:type="dxa"/>
-              <w:bottom w:w="80" w:type="dxa"/>
-              <w:left w:w="80" w:type="dxa"/>
-              <w:right w:w="80" w:type="dxa"/>
+              <w:top w:w="50" w:type="dxa"/>
+              <w:bottom w:w="50" w:type="dxa"/>
+              <w:left w:w="50" w:type="dxa"/>
+              <w:right w:w="50" w:type="dxa"/>
             </w:tcMar>
           </w:tcPr>
           <w:p>
@@ -773,7 +945,7 @@
                 <w:b w:val="0"/>
                 <w:i w:val="0"/>
                 <w:color w:val="000000"/>
-                <w:sz w:val="19"/>
+                <w:sz w:val="18"/>
               </w:rPr>
               <w:t>VU4F2425-________</w:t>
             </w:r>
@@ -783,7 +955,7 @@
     </w:tbl>
     <w:p>
       <w:pPr>
-        <w:spacing w:after="280" w:before="0" w:line="276" w:lineRule="auto"/>
+        <w:spacing w:after="200" w:before="0" w:line="276" w:lineRule="auto"/>
         <w:jc w:val="left"/>
       </w:pPr>
     </w:p>
@@ -794,13 +966,13 @@
         <w:tblLook w:firstColumn="1" w:firstRow="1" w:lastColumn="0" w:lastRow="0" w:noHBand="0" w:noVBand="1" w:val="04A0"/>
       </w:tblPr>
       <w:tblGrid>
-        <w:gridCol w:w="4680"/>
-        <w:gridCol w:w="4680"/>
+        <w:gridCol w:w="4824"/>
+        <w:gridCol w:w="4824"/>
       </w:tblGrid>
       <w:tr>
         <w:tc>
           <w:tcPr>
-            <w:tcW w:type="dxa" w:w="4608"/>
+            <w:tcW w:type="dxa" w:w="4752"/>
             <w:tcBorders>
               <w:top w:val="single" w:sz="4" w:space="0" w:color="000000"/>
               <w:bottom w:val="single" w:sz="4" w:space="0" w:color="000000"/>
@@ -808,10 +980,10 @@
               <w:right w:val="single" w:sz="4" w:space="0" w:color="000000"/>
             </w:tcBorders>
             <w:tcMar>
-              <w:top w:w="100" w:type="dxa"/>
-              <w:bottom w:w="100" w:type="dxa"/>
-              <w:left w:w="100" w:type="dxa"/>
-              <w:right w:w="100" w:type="dxa"/>
+              <w:top w:w="80" w:type="dxa"/>
+              <w:bottom w:w="80" w:type="dxa"/>
+              <w:left w:w="80" w:type="dxa"/>
+              <w:right w:w="80" w:type="dxa"/>
             </w:tcMar>
           </w:tcPr>
           <w:p>
@@ -835,7 +1007,7 @@
         </w:tc>
         <w:tc>
           <w:tcPr>
-            <w:tcW w:type="dxa" w:w="4608"/>
+            <w:tcW w:type="dxa" w:w="4752"/>
             <w:tcBorders>
               <w:top w:val="single" w:sz="4" w:space="0" w:color="000000"/>
               <w:bottom w:val="single" w:sz="4" w:space="0" w:color="000000"/>
@@ -843,10 +1015,10 @@
               <w:right w:val="single" w:sz="4" w:space="0" w:color="000000"/>
             </w:tcBorders>
             <w:tcMar>
-              <w:top w:w="100" w:type="dxa"/>
-              <w:bottom w:w="100" w:type="dxa"/>
-              <w:left w:w="100" w:type="dxa"/>
-              <w:right w:w="100" w:type="dxa"/>
+              <w:top w:w="80" w:type="dxa"/>
+              <w:bottom w:w="80" w:type="dxa"/>
+              <w:left w:w="80" w:type="dxa"/>
+              <w:right w:w="80" w:type="dxa"/>
             </w:tcMar>
           </w:tcPr>
           <w:p>
@@ -867,20 +1039,6 @@
               <w:t>Department of Information Technology</w:t>
             </w:r>
           </w:p>
-        </w:tc>
-      </w:tr>
-      <w:tr>
-        <w:tc>
-          <w:tcPr>
-            <w:tcW w:type="dxa" w:w="4680"/>
-          </w:tcPr>
-          <w:p/>
-        </w:tc>
-        <w:tc>
-          <w:tcPr>
-            <w:tcW w:type="dxa" w:w="4680"/>
-          </w:tcPr>
-          <w:p/>
         </w:tc>
       </w:tr>
     </w:tbl>
@@ -925,7 +1083,7 @@
     </w:p>
     <w:p>
       <w:pPr>
-        <w:spacing w:after="240" w:before="0" w:line="276" w:lineRule="auto"/>
+        <w:spacing w:after="200" w:before="0" w:line="276" w:lineRule="auto"/>
         <w:jc w:val="left"/>
       </w:pPr>
       <w:r>
@@ -1025,7 +1183,7 @@
     </w:p>
     <w:p>
       <w:pPr>
-        <w:spacing w:after="240" w:before="0" w:line="276" w:lineRule="auto"/>
+        <w:spacing w:after="200" w:before="0" w:line="276" w:lineRule="auto"/>
         <w:jc w:val="left"/>
       </w:pPr>
       <w:r>
@@ -1071,15 +1229,15 @@
         <w:tblLook w:firstColumn="1" w:firstRow="1" w:lastColumn="0" w:lastRow="0" w:noHBand="0" w:noVBand="1" w:val="04A0"/>
       </w:tblPr>
       <w:tblGrid>
-        <w:gridCol w:w="2340"/>
-        <w:gridCol w:w="2340"/>
-        <w:gridCol w:w="2340"/>
-        <w:gridCol w:w="2340"/>
+        <w:gridCol w:w="2412"/>
+        <w:gridCol w:w="2412"/>
+        <w:gridCol w:w="2412"/>
+        <w:gridCol w:w="2412"/>
       </w:tblGrid>
       <w:tr>
         <w:tc>
           <w:tcPr>
-            <w:tcW w:type="dxa" w:w="2340"/>
+            <w:tcW w:type="dxa" w:w="2412"/>
             <w:tcBorders>
               <w:top w:val="single" w:sz="4" w:space="0" w:color="000000"/>
               <w:bottom w:val="single" w:sz="4" w:space="0" w:color="000000"/>
@@ -1087,10 +1245,10 @@
               <w:right w:val="single" w:sz="4" w:space="0" w:color="000000"/>
             </w:tcBorders>
             <w:tcMar>
-              <w:top w:w="60" w:type="dxa"/>
-              <w:bottom w:w="60" w:type="dxa"/>
-              <w:left w:w="60" w:type="dxa"/>
-              <w:right w:w="60" w:type="dxa"/>
+              <w:top w:w="50" w:type="dxa"/>
+              <w:bottom w:w="50" w:type="dxa"/>
+              <w:left w:w="50" w:type="dxa"/>
+              <w:right w:w="50" w:type="dxa"/>
             </w:tcMar>
           </w:tcPr>
           <w:p>
@@ -1111,7 +1269,7 @@
         </w:tc>
         <w:tc>
           <w:tcPr>
-            <w:tcW w:type="dxa" w:w="2340"/>
+            <w:tcW w:type="dxa" w:w="2412"/>
             <w:tcBorders>
               <w:top w:val="single" w:sz="4" w:space="0" w:color="000000"/>
               <w:bottom w:val="single" w:sz="4" w:space="0" w:color="000000"/>
@@ -1119,10 +1277,10 @@
               <w:right w:val="single" w:sz="4" w:space="0" w:color="000000"/>
             </w:tcBorders>
             <w:tcMar>
-              <w:top w:w="60" w:type="dxa"/>
-              <w:bottom w:w="60" w:type="dxa"/>
-              <w:left w:w="60" w:type="dxa"/>
-              <w:right w:w="60" w:type="dxa"/>
+              <w:top w:w="50" w:type="dxa"/>
+              <w:bottom w:w="50" w:type="dxa"/>
+              <w:left w:w="50" w:type="dxa"/>
+              <w:right w:w="50" w:type="dxa"/>
             </w:tcMar>
           </w:tcPr>
           <w:p>
@@ -1143,7 +1301,7 @@
         </w:tc>
         <w:tc>
           <w:tcPr>
-            <w:tcW w:type="dxa" w:w="2340"/>
+            <w:tcW w:type="dxa" w:w="2412"/>
             <w:tcBorders>
               <w:top w:val="single" w:sz="4" w:space="0" w:color="000000"/>
               <w:bottom w:val="single" w:sz="4" w:space="0" w:color="000000"/>
@@ -1151,10 +1309,10 @@
               <w:right w:val="single" w:sz="4" w:space="0" w:color="000000"/>
             </w:tcBorders>
             <w:tcMar>
-              <w:top w:w="60" w:type="dxa"/>
-              <w:bottom w:w="60" w:type="dxa"/>
-              <w:left w:w="60" w:type="dxa"/>
-              <w:right w:w="60" w:type="dxa"/>
+              <w:top w:w="50" w:type="dxa"/>
+              <w:bottom w:w="50" w:type="dxa"/>
+              <w:left w:w="50" w:type="dxa"/>
+              <w:right w:w="50" w:type="dxa"/>
             </w:tcMar>
           </w:tcPr>
           <w:p>
@@ -1175,7 +1333,7 @@
         </w:tc>
         <w:tc>
           <w:tcPr>
-            <w:tcW w:type="dxa" w:w="2340"/>
+            <w:tcW w:type="dxa" w:w="2412"/>
             <w:tcBorders>
               <w:top w:val="single" w:sz="4" w:space="0" w:color="000000"/>
               <w:bottom w:val="single" w:sz="4" w:space="0" w:color="000000"/>
@@ -1183,10 +1341,10 @@
               <w:right w:val="single" w:sz="4" w:space="0" w:color="000000"/>
             </w:tcBorders>
             <w:tcMar>
-              <w:top w:w="60" w:type="dxa"/>
-              <w:bottom w:w="60" w:type="dxa"/>
-              <w:left w:w="60" w:type="dxa"/>
-              <w:right w:w="60" w:type="dxa"/>
+              <w:top w:w="50" w:type="dxa"/>
+              <w:bottom w:w="50" w:type="dxa"/>
+              <w:left w:w="50" w:type="dxa"/>
+              <w:right w:w="50" w:type="dxa"/>
             </w:tcMar>
           </w:tcPr>
           <w:p>
@@ -1209,7 +1367,7 @@
       <w:tr>
         <w:tc>
           <w:tcPr>
-            <w:tcW w:type="dxa" w:w="2340"/>
+            <w:tcW w:type="dxa" w:w="2412"/>
             <w:tcBorders>
               <w:top w:val="single" w:sz="4" w:space="0" w:color="000000"/>
               <w:bottom w:val="single" w:sz="4" w:space="0" w:color="000000"/>
@@ -1217,10 +1375,10 @@
               <w:right w:val="single" w:sz="4" w:space="0" w:color="000000"/>
             </w:tcBorders>
             <w:tcMar>
-              <w:top w:w="40" w:type="dxa"/>
-              <w:bottom w:w="40" w:type="dxa"/>
-              <w:left w:w="50" w:type="dxa"/>
-              <w:right w:w="50" w:type="dxa"/>
+              <w:top w:w="35" w:type="dxa"/>
+              <w:bottom w:w="35" w:type="dxa"/>
+              <w:left w:w="45" w:type="dxa"/>
+              <w:right w:w="45" w:type="dxa"/>
             </w:tcMar>
           </w:tcPr>
           <w:p>
@@ -1241,7 +1399,7 @@
         </w:tc>
         <w:tc>
           <w:tcPr>
-            <w:tcW w:type="dxa" w:w="2340"/>
+            <w:tcW w:type="dxa" w:w="2412"/>
             <w:tcBorders>
               <w:top w:val="single" w:sz="4" w:space="0" w:color="000000"/>
               <w:bottom w:val="single" w:sz="4" w:space="0" w:color="000000"/>
@@ -1249,10 +1407,10 @@
               <w:right w:val="single" w:sz="4" w:space="0" w:color="000000"/>
             </w:tcBorders>
             <w:tcMar>
-              <w:top w:w="40" w:type="dxa"/>
-              <w:bottom w:w="40" w:type="dxa"/>
-              <w:left w:w="50" w:type="dxa"/>
-              <w:right w:w="50" w:type="dxa"/>
+              <w:top w:w="35" w:type="dxa"/>
+              <w:bottom w:w="35" w:type="dxa"/>
+              <w:left w:w="45" w:type="dxa"/>
+              <w:right w:w="45" w:type="dxa"/>
             </w:tcMar>
           </w:tcPr>
           <w:p>
@@ -1270,7 +1428,7 @@
         </w:tc>
         <w:tc>
           <w:tcPr>
-            <w:tcW w:type="dxa" w:w="2340"/>
+            <w:tcW w:type="dxa" w:w="2412"/>
             <w:tcBorders>
               <w:top w:val="single" w:sz="4" w:space="0" w:color="000000"/>
               <w:bottom w:val="single" w:sz="4" w:space="0" w:color="000000"/>
@@ -1278,10 +1436,10 @@
               <w:right w:val="single" w:sz="4" w:space="0" w:color="000000"/>
             </w:tcBorders>
             <w:tcMar>
-              <w:top w:w="40" w:type="dxa"/>
-              <w:bottom w:w="40" w:type="dxa"/>
-              <w:left w:w="50" w:type="dxa"/>
-              <w:right w:w="50" w:type="dxa"/>
+              <w:top w:w="35" w:type="dxa"/>
+              <w:bottom w:w="35" w:type="dxa"/>
+              <w:left w:w="45" w:type="dxa"/>
+              <w:right w:w="45" w:type="dxa"/>
             </w:tcMar>
           </w:tcPr>
           <w:p>
@@ -1302,7 +1460,7 @@
         </w:tc>
         <w:tc>
           <w:tcPr>
-            <w:tcW w:type="dxa" w:w="2340"/>
+            <w:tcW w:type="dxa" w:w="2412"/>
             <w:tcBorders>
               <w:top w:val="single" w:sz="4" w:space="0" w:color="000000"/>
               <w:bottom w:val="single" w:sz="4" w:space="0" w:color="000000"/>
@@ -1310,10 +1468,10 @@
               <w:right w:val="single" w:sz="4" w:space="0" w:color="000000"/>
             </w:tcBorders>
             <w:tcMar>
-              <w:top w:w="40" w:type="dxa"/>
-              <w:bottom w:w="40" w:type="dxa"/>
-              <w:left w:w="50" w:type="dxa"/>
-              <w:right w:w="50" w:type="dxa"/>
+              <w:top w:w="35" w:type="dxa"/>
+              <w:bottom w:w="35" w:type="dxa"/>
+              <w:left w:w="45" w:type="dxa"/>
+              <w:right w:w="45" w:type="dxa"/>
             </w:tcMar>
           </w:tcPr>
           <w:p>
@@ -1336,7 +1494,7 @@
       <w:tr>
         <w:tc>
           <w:tcPr>
-            <w:tcW w:type="dxa" w:w="2340"/>
+            <w:tcW w:type="dxa" w:w="2412"/>
             <w:tcBorders>
               <w:top w:val="single" w:sz="4" w:space="0" w:color="000000"/>
               <w:bottom w:val="single" w:sz="4" w:space="0" w:color="000000"/>
@@ -1344,10 +1502,10 @@
               <w:right w:val="single" w:sz="4" w:space="0" w:color="000000"/>
             </w:tcBorders>
             <w:tcMar>
-              <w:top w:w="40" w:type="dxa"/>
-              <w:bottom w:w="40" w:type="dxa"/>
-              <w:left w:w="50" w:type="dxa"/>
-              <w:right w:w="50" w:type="dxa"/>
+              <w:top w:w="35" w:type="dxa"/>
+              <w:bottom w:w="35" w:type="dxa"/>
+              <w:left w:w="45" w:type="dxa"/>
+              <w:right w:w="45" w:type="dxa"/>
             </w:tcMar>
           </w:tcPr>
           <w:p>
@@ -1368,7 +1526,7 @@
         </w:tc>
         <w:tc>
           <w:tcPr>
-            <w:tcW w:type="dxa" w:w="2340"/>
+            <w:tcW w:type="dxa" w:w="2412"/>
             <w:tcBorders>
               <w:top w:val="single" w:sz="4" w:space="0" w:color="000000"/>
               <w:bottom w:val="single" w:sz="4" w:space="0" w:color="000000"/>
@@ -1376,10 +1534,10 @@
               <w:right w:val="single" w:sz="4" w:space="0" w:color="000000"/>
             </w:tcBorders>
             <w:tcMar>
-              <w:top w:w="40" w:type="dxa"/>
-              <w:bottom w:w="40" w:type="dxa"/>
-              <w:left w:w="50" w:type="dxa"/>
-              <w:right w:w="50" w:type="dxa"/>
+              <w:top w:w="35" w:type="dxa"/>
+              <w:bottom w:w="35" w:type="dxa"/>
+              <w:left w:w="45" w:type="dxa"/>
+              <w:right w:w="45" w:type="dxa"/>
             </w:tcMar>
           </w:tcPr>
           <w:p>
@@ -1397,7 +1555,7 @@
         </w:tc>
         <w:tc>
           <w:tcPr>
-            <w:tcW w:type="dxa" w:w="2340"/>
+            <w:tcW w:type="dxa" w:w="2412"/>
             <w:tcBorders>
               <w:top w:val="single" w:sz="4" w:space="0" w:color="000000"/>
               <w:bottom w:val="single" w:sz="4" w:space="0" w:color="000000"/>
@@ -1405,10 +1563,10 @@
               <w:right w:val="single" w:sz="4" w:space="0" w:color="000000"/>
             </w:tcBorders>
             <w:tcMar>
-              <w:top w:w="40" w:type="dxa"/>
-              <w:bottom w:w="40" w:type="dxa"/>
-              <w:left w:w="50" w:type="dxa"/>
-              <w:right w:w="50" w:type="dxa"/>
+              <w:top w:w="35" w:type="dxa"/>
+              <w:bottom w:w="35" w:type="dxa"/>
+              <w:left w:w="45" w:type="dxa"/>
+              <w:right w:w="45" w:type="dxa"/>
             </w:tcMar>
           </w:tcPr>
           <w:p>
@@ -1429,7 +1587,7 @@
         </w:tc>
         <w:tc>
           <w:tcPr>
-            <w:tcW w:type="dxa" w:w="2340"/>
+            <w:tcW w:type="dxa" w:w="2412"/>
             <w:tcBorders>
               <w:top w:val="single" w:sz="4" w:space="0" w:color="000000"/>
               <w:bottom w:val="single" w:sz="4" w:space="0" w:color="000000"/>
@@ -1437,10 +1595,10 @@
               <w:right w:val="single" w:sz="4" w:space="0" w:color="000000"/>
             </w:tcBorders>
             <w:tcMar>
-              <w:top w:w="40" w:type="dxa"/>
-              <w:bottom w:w="40" w:type="dxa"/>
-              <w:left w:w="50" w:type="dxa"/>
-              <w:right w:w="50" w:type="dxa"/>
+              <w:top w:w="35" w:type="dxa"/>
+              <w:bottom w:w="35" w:type="dxa"/>
+              <w:left w:w="45" w:type="dxa"/>
+              <w:right w:w="45" w:type="dxa"/>
             </w:tcMar>
           </w:tcPr>
           <w:p>
@@ -1463,7 +1621,7 @@
       <w:tr>
         <w:tc>
           <w:tcPr>
-            <w:tcW w:type="dxa" w:w="2340"/>
+            <w:tcW w:type="dxa" w:w="2412"/>
             <w:tcBorders>
               <w:top w:val="single" w:sz="4" w:space="0" w:color="000000"/>
               <w:bottom w:val="single" w:sz="4" w:space="0" w:color="000000"/>
@@ -1471,10 +1629,10 @@
               <w:right w:val="single" w:sz="4" w:space="0" w:color="000000"/>
             </w:tcBorders>
             <w:tcMar>
-              <w:top w:w="40" w:type="dxa"/>
-              <w:bottom w:w="40" w:type="dxa"/>
-              <w:left w:w="50" w:type="dxa"/>
-              <w:right w:w="50" w:type="dxa"/>
+              <w:top w:w="35" w:type="dxa"/>
+              <w:bottom w:w="35" w:type="dxa"/>
+              <w:left w:w="45" w:type="dxa"/>
+              <w:right w:w="45" w:type="dxa"/>
             </w:tcMar>
           </w:tcPr>
           <w:p>
@@ -1495,7 +1653,7 @@
         </w:tc>
         <w:tc>
           <w:tcPr>
-            <w:tcW w:type="dxa" w:w="2340"/>
+            <w:tcW w:type="dxa" w:w="2412"/>
             <w:tcBorders>
               <w:top w:val="single" w:sz="4" w:space="0" w:color="000000"/>
               <w:bottom w:val="single" w:sz="4" w:space="0" w:color="000000"/>
@@ -1503,10 +1661,10 @@
               <w:right w:val="single" w:sz="4" w:space="0" w:color="000000"/>
             </w:tcBorders>
             <w:tcMar>
-              <w:top w:w="40" w:type="dxa"/>
-              <w:bottom w:w="40" w:type="dxa"/>
-              <w:left w:w="50" w:type="dxa"/>
-              <w:right w:w="50" w:type="dxa"/>
+              <w:top w:w="35" w:type="dxa"/>
+              <w:bottom w:w="35" w:type="dxa"/>
+              <w:left w:w="45" w:type="dxa"/>
+              <w:right w:w="45" w:type="dxa"/>
             </w:tcMar>
           </w:tcPr>
           <w:p>
@@ -1524,7 +1682,7 @@
         </w:tc>
         <w:tc>
           <w:tcPr>
-            <w:tcW w:type="dxa" w:w="2340"/>
+            <w:tcW w:type="dxa" w:w="2412"/>
             <w:tcBorders>
               <w:top w:val="single" w:sz="4" w:space="0" w:color="000000"/>
               <w:bottom w:val="single" w:sz="4" w:space="0" w:color="000000"/>
@@ -1532,10 +1690,10 @@
               <w:right w:val="single" w:sz="4" w:space="0" w:color="000000"/>
             </w:tcBorders>
             <w:tcMar>
-              <w:top w:w="40" w:type="dxa"/>
-              <w:bottom w:w="40" w:type="dxa"/>
-              <w:left w:w="50" w:type="dxa"/>
-              <w:right w:w="50" w:type="dxa"/>
+              <w:top w:w="35" w:type="dxa"/>
+              <w:bottom w:w="35" w:type="dxa"/>
+              <w:left w:w="45" w:type="dxa"/>
+              <w:right w:w="45" w:type="dxa"/>
             </w:tcMar>
           </w:tcPr>
           <w:p>
@@ -1556,7 +1714,7 @@
         </w:tc>
         <w:tc>
           <w:tcPr>
-            <w:tcW w:type="dxa" w:w="2340"/>
+            <w:tcW w:type="dxa" w:w="2412"/>
             <w:tcBorders>
               <w:top w:val="single" w:sz="4" w:space="0" w:color="000000"/>
               <w:bottom w:val="single" w:sz="4" w:space="0" w:color="000000"/>
@@ -1564,10 +1722,10 @@
               <w:right w:val="single" w:sz="4" w:space="0" w:color="000000"/>
             </w:tcBorders>
             <w:tcMar>
-              <w:top w:w="40" w:type="dxa"/>
-              <w:bottom w:w="40" w:type="dxa"/>
-              <w:left w:w="50" w:type="dxa"/>
-              <w:right w:w="50" w:type="dxa"/>
+              <w:top w:w="35" w:type="dxa"/>
+              <w:bottom w:w="35" w:type="dxa"/>
+              <w:left w:w="45" w:type="dxa"/>
+              <w:right w:w="45" w:type="dxa"/>
             </w:tcMar>
           </w:tcPr>
           <w:p>
@@ -1590,7 +1748,7 @@
       <w:tr>
         <w:tc>
           <w:tcPr>
-            <w:tcW w:type="dxa" w:w="2340"/>
+            <w:tcW w:type="dxa" w:w="2412"/>
             <w:tcBorders>
               <w:top w:val="single" w:sz="4" w:space="0" w:color="000000"/>
               <w:bottom w:val="single" w:sz="4" w:space="0" w:color="000000"/>
@@ -1598,10 +1756,10 @@
               <w:right w:val="single" w:sz="4" w:space="0" w:color="000000"/>
             </w:tcBorders>
             <w:tcMar>
-              <w:top w:w="40" w:type="dxa"/>
-              <w:bottom w:w="40" w:type="dxa"/>
-              <w:left w:w="50" w:type="dxa"/>
-              <w:right w:w="50" w:type="dxa"/>
+              <w:top w:w="35" w:type="dxa"/>
+              <w:bottom w:w="35" w:type="dxa"/>
+              <w:left w:w="45" w:type="dxa"/>
+              <w:right w:w="45" w:type="dxa"/>
             </w:tcMar>
           </w:tcPr>
           <w:p>
@@ -1622,7 +1780,7 @@
         </w:tc>
         <w:tc>
           <w:tcPr>
-            <w:tcW w:type="dxa" w:w="2340"/>
+            <w:tcW w:type="dxa" w:w="2412"/>
             <w:tcBorders>
               <w:top w:val="single" w:sz="4" w:space="0" w:color="000000"/>
               <w:bottom w:val="single" w:sz="4" w:space="0" w:color="000000"/>
@@ -1630,10 +1788,10 @@
               <w:right w:val="single" w:sz="4" w:space="0" w:color="000000"/>
             </w:tcBorders>
             <w:tcMar>
-              <w:top w:w="40" w:type="dxa"/>
-              <w:bottom w:w="40" w:type="dxa"/>
-              <w:left w:w="50" w:type="dxa"/>
-              <w:right w:w="50" w:type="dxa"/>
+              <w:top w:w="35" w:type="dxa"/>
+              <w:bottom w:w="35" w:type="dxa"/>
+              <w:left w:w="45" w:type="dxa"/>
+              <w:right w:w="45" w:type="dxa"/>
             </w:tcMar>
           </w:tcPr>
           <w:p>
@@ -1651,7 +1809,7 @@
         </w:tc>
         <w:tc>
           <w:tcPr>
-            <w:tcW w:type="dxa" w:w="2340"/>
+            <w:tcW w:type="dxa" w:w="2412"/>
             <w:tcBorders>
               <w:top w:val="single" w:sz="4" w:space="0" w:color="000000"/>
               <w:bottom w:val="single" w:sz="4" w:space="0" w:color="000000"/>
@@ -1659,10 +1817,10 @@
               <w:right w:val="single" w:sz="4" w:space="0" w:color="000000"/>
             </w:tcBorders>
             <w:tcMar>
-              <w:top w:w="40" w:type="dxa"/>
-              <w:bottom w:w="40" w:type="dxa"/>
-              <w:left w:w="50" w:type="dxa"/>
-              <w:right w:w="50" w:type="dxa"/>
+              <w:top w:w="35" w:type="dxa"/>
+              <w:bottom w:w="35" w:type="dxa"/>
+              <w:left w:w="45" w:type="dxa"/>
+              <w:right w:w="45" w:type="dxa"/>
             </w:tcMar>
           </w:tcPr>
           <w:p>
@@ -1683,7 +1841,7 @@
         </w:tc>
         <w:tc>
           <w:tcPr>
-            <w:tcW w:type="dxa" w:w="2340"/>
+            <w:tcW w:type="dxa" w:w="2412"/>
             <w:tcBorders>
               <w:top w:val="single" w:sz="4" w:space="0" w:color="000000"/>
               <w:bottom w:val="single" w:sz="4" w:space="0" w:color="000000"/>
@@ -1691,10 +1849,10 @@
               <w:right w:val="single" w:sz="4" w:space="0" w:color="000000"/>
             </w:tcBorders>
             <w:tcMar>
-              <w:top w:w="40" w:type="dxa"/>
-              <w:bottom w:w="40" w:type="dxa"/>
-              <w:left w:w="50" w:type="dxa"/>
-              <w:right w:w="50" w:type="dxa"/>
+              <w:top w:w="35" w:type="dxa"/>
+              <w:bottom w:w="35" w:type="dxa"/>
+              <w:left w:w="45" w:type="dxa"/>
+              <w:right w:w="45" w:type="dxa"/>
             </w:tcMar>
           </w:tcPr>
           <w:p>
@@ -1717,7 +1875,7 @@
       <w:tr>
         <w:tc>
           <w:tcPr>
-            <w:tcW w:type="dxa" w:w="2340"/>
+            <w:tcW w:type="dxa" w:w="2412"/>
             <w:tcBorders>
               <w:top w:val="single" w:sz="4" w:space="0" w:color="000000"/>
               <w:bottom w:val="single" w:sz="4" w:space="0" w:color="000000"/>
@@ -1725,10 +1883,10 @@
               <w:right w:val="single" w:sz="4" w:space="0" w:color="000000"/>
             </w:tcBorders>
             <w:tcMar>
-              <w:top w:w="40" w:type="dxa"/>
-              <w:bottom w:w="40" w:type="dxa"/>
-              <w:left w:w="50" w:type="dxa"/>
-              <w:right w:w="50" w:type="dxa"/>
+              <w:top w:w="35" w:type="dxa"/>
+              <w:bottom w:w="35" w:type="dxa"/>
+              <w:left w:w="45" w:type="dxa"/>
+              <w:right w:w="45" w:type="dxa"/>
             </w:tcMar>
           </w:tcPr>
           <w:p>
@@ -1749,7 +1907,7 @@
         </w:tc>
         <w:tc>
           <w:tcPr>
-            <w:tcW w:type="dxa" w:w="2340"/>
+            <w:tcW w:type="dxa" w:w="2412"/>
             <w:tcBorders>
               <w:top w:val="single" w:sz="4" w:space="0" w:color="000000"/>
               <w:bottom w:val="single" w:sz="4" w:space="0" w:color="000000"/>
@@ -1757,10 +1915,10 @@
               <w:right w:val="single" w:sz="4" w:space="0" w:color="000000"/>
             </w:tcBorders>
             <w:tcMar>
-              <w:top w:w="40" w:type="dxa"/>
-              <w:bottom w:w="40" w:type="dxa"/>
-              <w:left w:w="50" w:type="dxa"/>
-              <w:right w:w="50" w:type="dxa"/>
+              <w:top w:w="35" w:type="dxa"/>
+              <w:bottom w:w="35" w:type="dxa"/>
+              <w:left w:w="45" w:type="dxa"/>
+              <w:right w:w="45" w:type="dxa"/>
             </w:tcMar>
           </w:tcPr>
           <w:p>
@@ -1778,7 +1936,7 @@
         </w:tc>
         <w:tc>
           <w:tcPr>
-            <w:tcW w:type="dxa" w:w="2340"/>
+            <w:tcW w:type="dxa" w:w="2412"/>
             <w:tcBorders>
               <w:top w:val="single" w:sz="4" w:space="0" w:color="000000"/>
               <w:bottom w:val="single" w:sz="4" w:space="0" w:color="000000"/>
@@ -1786,10 +1944,10 @@
               <w:right w:val="single" w:sz="4" w:space="0" w:color="000000"/>
             </w:tcBorders>
             <w:tcMar>
-              <w:top w:w="40" w:type="dxa"/>
-              <w:bottom w:w="40" w:type="dxa"/>
-              <w:left w:w="50" w:type="dxa"/>
-              <w:right w:w="50" w:type="dxa"/>
+              <w:top w:w="35" w:type="dxa"/>
+              <w:bottom w:w="35" w:type="dxa"/>
+              <w:left w:w="45" w:type="dxa"/>
+              <w:right w:w="45" w:type="dxa"/>
             </w:tcMar>
           </w:tcPr>
           <w:p>
@@ -1810,7 +1968,7 @@
         </w:tc>
         <w:tc>
           <w:tcPr>
-            <w:tcW w:type="dxa" w:w="2340"/>
+            <w:tcW w:type="dxa" w:w="2412"/>
             <w:tcBorders>
               <w:top w:val="single" w:sz="4" w:space="0" w:color="000000"/>
               <w:bottom w:val="single" w:sz="4" w:space="0" w:color="000000"/>
@@ -1818,10 +1976,10 @@
               <w:right w:val="single" w:sz="4" w:space="0" w:color="000000"/>
             </w:tcBorders>
             <w:tcMar>
-              <w:top w:w="40" w:type="dxa"/>
-              <w:bottom w:w="40" w:type="dxa"/>
-              <w:left w:w="50" w:type="dxa"/>
-              <w:right w:w="50" w:type="dxa"/>
+              <w:top w:w="35" w:type="dxa"/>
+              <w:bottom w:w="35" w:type="dxa"/>
+              <w:left w:w="45" w:type="dxa"/>
+              <w:right w:w="45" w:type="dxa"/>
             </w:tcMar>
           </w:tcPr>
           <w:p>
@@ -1844,7 +2002,7 @@
       <w:tr>
         <w:tc>
           <w:tcPr>
-            <w:tcW w:type="dxa" w:w="2340"/>
+            <w:tcW w:type="dxa" w:w="2412"/>
             <w:tcBorders>
               <w:top w:val="single" w:sz="4" w:space="0" w:color="000000"/>
               <w:bottom w:val="single" w:sz="4" w:space="0" w:color="000000"/>
@@ -1852,10 +2010,10 @@
               <w:right w:val="single" w:sz="4" w:space="0" w:color="000000"/>
             </w:tcBorders>
             <w:tcMar>
-              <w:top w:w="40" w:type="dxa"/>
-              <w:bottom w:w="40" w:type="dxa"/>
-              <w:left w:w="50" w:type="dxa"/>
-              <w:right w:w="50" w:type="dxa"/>
+              <w:top w:w="35" w:type="dxa"/>
+              <w:bottom w:w="35" w:type="dxa"/>
+              <w:left w:w="45" w:type="dxa"/>
+              <w:right w:w="45" w:type="dxa"/>
             </w:tcMar>
           </w:tcPr>
           <w:p>
@@ -1876,7 +2034,7 @@
         </w:tc>
         <w:tc>
           <w:tcPr>
-            <w:tcW w:type="dxa" w:w="2340"/>
+            <w:tcW w:type="dxa" w:w="2412"/>
             <w:tcBorders>
               <w:top w:val="single" w:sz="4" w:space="0" w:color="000000"/>
               <w:bottom w:val="single" w:sz="4" w:space="0" w:color="000000"/>
@@ -1884,10 +2042,10 @@
               <w:right w:val="single" w:sz="4" w:space="0" w:color="000000"/>
             </w:tcBorders>
             <w:tcMar>
-              <w:top w:w="40" w:type="dxa"/>
-              <w:bottom w:w="40" w:type="dxa"/>
-              <w:left w:w="50" w:type="dxa"/>
-              <w:right w:w="50" w:type="dxa"/>
+              <w:top w:w="35" w:type="dxa"/>
+              <w:bottom w:w="35" w:type="dxa"/>
+              <w:left w:w="45" w:type="dxa"/>
+              <w:right w:w="45" w:type="dxa"/>
             </w:tcMar>
           </w:tcPr>
           <w:p>
@@ -1905,7 +2063,7 @@
         </w:tc>
         <w:tc>
           <w:tcPr>
-            <w:tcW w:type="dxa" w:w="2340"/>
+            <w:tcW w:type="dxa" w:w="2412"/>
             <w:tcBorders>
               <w:top w:val="single" w:sz="4" w:space="0" w:color="000000"/>
               <w:bottom w:val="single" w:sz="4" w:space="0" w:color="000000"/>
@@ -1913,10 +2071,10 @@
               <w:right w:val="single" w:sz="4" w:space="0" w:color="000000"/>
             </w:tcBorders>
             <w:tcMar>
-              <w:top w:w="40" w:type="dxa"/>
-              <w:bottom w:w="40" w:type="dxa"/>
-              <w:left w:w="50" w:type="dxa"/>
-              <w:right w:w="50" w:type="dxa"/>
+              <w:top w:w="35" w:type="dxa"/>
+              <w:bottom w:w="35" w:type="dxa"/>
+              <w:left w:w="45" w:type="dxa"/>
+              <w:right w:w="45" w:type="dxa"/>
             </w:tcMar>
           </w:tcPr>
           <w:p>
@@ -1937,7 +2095,7 @@
         </w:tc>
         <w:tc>
           <w:tcPr>
-            <w:tcW w:type="dxa" w:w="2340"/>
+            <w:tcW w:type="dxa" w:w="2412"/>
             <w:tcBorders>
               <w:top w:val="single" w:sz="4" w:space="0" w:color="000000"/>
               <w:bottom w:val="single" w:sz="4" w:space="0" w:color="000000"/>
@@ -1945,10 +2103,10 @@
               <w:right w:val="single" w:sz="4" w:space="0" w:color="000000"/>
             </w:tcBorders>
             <w:tcMar>
-              <w:top w:w="40" w:type="dxa"/>
-              <w:bottom w:w="40" w:type="dxa"/>
-              <w:left w:w="50" w:type="dxa"/>
-              <w:right w:w="50" w:type="dxa"/>
+              <w:top w:w="35" w:type="dxa"/>
+              <w:bottom w:w="35" w:type="dxa"/>
+              <w:left w:w="45" w:type="dxa"/>
+              <w:right w:w="45" w:type="dxa"/>
             </w:tcMar>
           </w:tcPr>
           <w:p>
@@ -1971,7 +2129,7 @@
       <w:tr>
         <w:tc>
           <w:tcPr>
-            <w:tcW w:type="dxa" w:w="2340"/>
+            <w:tcW w:type="dxa" w:w="2412"/>
             <w:tcBorders>
               <w:top w:val="single" w:sz="4" w:space="0" w:color="000000"/>
               <w:bottom w:val="single" w:sz="4" w:space="0" w:color="000000"/>
@@ -1979,10 +2137,10 @@
               <w:right w:val="single" w:sz="4" w:space="0" w:color="000000"/>
             </w:tcBorders>
             <w:tcMar>
-              <w:top w:w="40" w:type="dxa"/>
-              <w:bottom w:w="40" w:type="dxa"/>
-              <w:left w:w="50" w:type="dxa"/>
-              <w:right w:w="50" w:type="dxa"/>
+              <w:top w:w="35" w:type="dxa"/>
+              <w:bottom w:w="35" w:type="dxa"/>
+              <w:left w:w="45" w:type="dxa"/>
+              <w:right w:w="45" w:type="dxa"/>
             </w:tcMar>
           </w:tcPr>
           <w:p>
@@ -2003,7 +2161,7 @@
         </w:tc>
         <w:tc>
           <w:tcPr>
-            <w:tcW w:type="dxa" w:w="2340"/>
+            <w:tcW w:type="dxa" w:w="2412"/>
             <w:tcBorders>
               <w:top w:val="single" w:sz="4" w:space="0" w:color="000000"/>
               <w:bottom w:val="single" w:sz="4" w:space="0" w:color="000000"/>
@@ -2011,10 +2169,10 @@
               <w:right w:val="single" w:sz="4" w:space="0" w:color="000000"/>
             </w:tcBorders>
             <w:tcMar>
-              <w:top w:w="40" w:type="dxa"/>
-              <w:bottom w:w="40" w:type="dxa"/>
-              <w:left w:w="50" w:type="dxa"/>
-              <w:right w:w="50" w:type="dxa"/>
+              <w:top w:w="35" w:type="dxa"/>
+              <w:bottom w:w="35" w:type="dxa"/>
+              <w:left w:w="45" w:type="dxa"/>
+              <w:right w:w="45" w:type="dxa"/>
             </w:tcMar>
           </w:tcPr>
           <w:p>
@@ -2032,7 +2190,7 @@
         </w:tc>
         <w:tc>
           <w:tcPr>
-            <w:tcW w:type="dxa" w:w="2340"/>
+            <w:tcW w:type="dxa" w:w="2412"/>
             <w:tcBorders>
               <w:top w:val="single" w:sz="4" w:space="0" w:color="000000"/>
               <w:bottom w:val="single" w:sz="4" w:space="0" w:color="000000"/>
@@ -2040,10 +2198,10 @@
               <w:right w:val="single" w:sz="4" w:space="0" w:color="000000"/>
             </w:tcBorders>
             <w:tcMar>
-              <w:top w:w="40" w:type="dxa"/>
-              <w:bottom w:w="40" w:type="dxa"/>
-              <w:left w:w="50" w:type="dxa"/>
-              <w:right w:w="50" w:type="dxa"/>
+              <w:top w:w="35" w:type="dxa"/>
+              <w:bottom w:w="35" w:type="dxa"/>
+              <w:left w:w="45" w:type="dxa"/>
+              <w:right w:w="45" w:type="dxa"/>
             </w:tcMar>
           </w:tcPr>
           <w:p>
@@ -2064,7 +2222,7 @@
         </w:tc>
         <w:tc>
           <w:tcPr>
-            <w:tcW w:type="dxa" w:w="2340"/>
+            <w:tcW w:type="dxa" w:w="2412"/>
             <w:tcBorders>
               <w:top w:val="single" w:sz="4" w:space="0" w:color="000000"/>
               <w:bottom w:val="single" w:sz="4" w:space="0" w:color="000000"/>
@@ -2072,10 +2230,10 @@
               <w:right w:val="single" w:sz="4" w:space="0" w:color="000000"/>
             </w:tcBorders>
             <w:tcMar>
-              <w:top w:w="40" w:type="dxa"/>
-              <w:bottom w:w="40" w:type="dxa"/>
-              <w:left w:w="50" w:type="dxa"/>
-              <w:right w:w="50" w:type="dxa"/>
+              <w:top w:w="35" w:type="dxa"/>
+              <w:bottom w:w="35" w:type="dxa"/>
+              <w:left w:w="45" w:type="dxa"/>
+              <w:right w:w="45" w:type="dxa"/>
             </w:tcMar>
           </w:tcPr>
           <w:p>
@@ -2098,7 +2256,7 @@
       <w:tr>
         <w:tc>
           <w:tcPr>
-            <w:tcW w:type="dxa" w:w="2340"/>
+            <w:tcW w:type="dxa" w:w="2412"/>
             <w:tcBorders>
               <w:top w:val="single" w:sz="4" w:space="0" w:color="000000"/>
               <w:bottom w:val="single" w:sz="4" w:space="0" w:color="000000"/>
@@ -2106,10 +2264,10 @@
               <w:right w:val="single" w:sz="4" w:space="0" w:color="000000"/>
             </w:tcBorders>
             <w:tcMar>
-              <w:top w:w="40" w:type="dxa"/>
-              <w:bottom w:w="40" w:type="dxa"/>
-              <w:left w:w="50" w:type="dxa"/>
-              <w:right w:w="50" w:type="dxa"/>
+              <w:top w:w="35" w:type="dxa"/>
+              <w:bottom w:w="35" w:type="dxa"/>
+              <w:left w:w="45" w:type="dxa"/>
+              <w:right w:w="45" w:type="dxa"/>
             </w:tcMar>
           </w:tcPr>
           <w:p>
@@ -2130,7 +2288,7 @@
         </w:tc>
         <w:tc>
           <w:tcPr>
-            <w:tcW w:type="dxa" w:w="2340"/>
+            <w:tcW w:type="dxa" w:w="2412"/>
             <w:tcBorders>
               <w:top w:val="single" w:sz="4" w:space="0" w:color="000000"/>
               <w:bottom w:val="single" w:sz="4" w:space="0" w:color="000000"/>
@@ -2138,10 +2296,10 @@
               <w:right w:val="single" w:sz="4" w:space="0" w:color="000000"/>
             </w:tcBorders>
             <w:tcMar>
-              <w:top w:w="40" w:type="dxa"/>
-              <w:bottom w:w="40" w:type="dxa"/>
-              <w:left w:w="50" w:type="dxa"/>
-              <w:right w:w="50" w:type="dxa"/>
+              <w:top w:w="35" w:type="dxa"/>
+              <w:bottom w:w="35" w:type="dxa"/>
+              <w:left w:w="45" w:type="dxa"/>
+              <w:right w:w="45" w:type="dxa"/>
             </w:tcMar>
           </w:tcPr>
           <w:p>
@@ -2159,7 +2317,7 @@
         </w:tc>
         <w:tc>
           <w:tcPr>
-            <w:tcW w:type="dxa" w:w="2340"/>
+            <w:tcW w:type="dxa" w:w="2412"/>
             <w:tcBorders>
               <w:top w:val="single" w:sz="4" w:space="0" w:color="000000"/>
               <w:bottom w:val="single" w:sz="4" w:space="0" w:color="000000"/>
@@ -2167,10 +2325,10 @@
               <w:right w:val="single" w:sz="4" w:space="0" w:color="000000"/>
             </w:tcBorders>
             <w:tcMar>
-              <w:top w:w="40" w:type="dxa"/>
-              <w:bottom w:w="40" w:type="dxa"/>
-              <w:left w:w="50" w:type="dxa"/>
-              <w:right w:w="50" w:type="dxa"/>
+              <w:top w:w="35" w:type="dxa"/>
+              <w:bottom w:w="35" w:type="dxa"/>
+              <w:left w:w="45" w:type="dxa"/>
+              <w:right w:w="45" w:type="dxa"/>
             </w:tcMar>
           </w:tcPr>
           <w:p>
@@ -2191,7 +2349,7 @@
         </w:tc>
         <w:tc>
           <w:tcPr>
-            <w:tcW w:type="dxa" w:w="2340"/>
+            <w:tcW w:type="dxa" w:w="2412"/>
             <w:tcBorders>
               <w:top w:val="single" w:sz="4" w:space="0" w:color="000000"/>
               <w:bottom w:val="single" w:sz="4" w:space="0" w:color="000000"/>
@@ -2199,10 +2357,10 @@
               <w:right w:val="single" w:sz="4" w:space="0" w:color="000000"/>
             </w:tcBorders>
             <w:tcMar>
-              <w:top w:w="40" w:type="dxa"/>
-              <w:bottom w:w="40" w:type="dxa"/>
-              <w:left w:w="50" w:type="dxa"/>
-              <w:right w:w="50" w:type="dxa"/>
+              <w:top w:w="35" w:type="dxa"/>
+              <w:bottom w:w="35" w:type="dxa"/>
+              <w:left w:w="45" w:type="dxa"/>
+              <w:right w:w="45" w:type="dxa"/>
             </w:tcMar>
           </w:tcPr>
           <w:p>
@@ -2225,7 +2383,7 @@
       <w:tr>
         <w:tc>
           <w:tcPr>
-            <w:tcW w:type="dxa" w:w="2340"/>
+            <w:tcW w:type="dxa" w:w="2412"/>
             <w:tcBorders>
               <w:top w:val="single" w:sz="4" w:space="0" w:color="000000"/>
               <w:bottom w:val="single" w:sz="4" w:space="0" w:color="000000"/>
@@ -2233,10 +2391,10 @@
               <w:right w:val="single" w:sz="4" w:space="0" w:color="000000"/>
             </w:tcBorders>
             <w:tcMar>
-              <w:top w:w="40" w:type="dxa"/>
-              <w:bottom w:w="40" w:type="dxa"/>
-              <w:left w:w="50" w:type="dxa"/>
-              <w:right w:w="50" w:type="dxa"/>
+              <w:top w:w="35" w:type="dxa"/>
+              <w:bottom w:w="35" w:type="dxa"/>
+              <w:left w:w="45" w:type="dxa"/>
+              <w:right w:w="45" w:type="dxa"/>
             </w:tcMar>
           </w:tcPr>
           <w:p>
@@ -2257,7 +2415,7 @@
         </w:tc>
         <w:tc>
           <w:tcPr>
-            <w:tcW w:type="dxa" w:w="2340"/>
+            <w:tcW w:type="dxa" w:w="2412"/>
             <w:tcBorders>
               <w:top w:val="single" w:sz="4" w:space="0" w:color="000000"/>
               <w:bottom w:val="single" w:sz="4" w:space="0" w:color="000000"/>
@@ -2265,10 +2423,10 @@
               <w:right w:val="single" w:sz="4" w:space="0" w:color="000000"/>
             </w:tcBorders>
             <w:tcMar>
-              <w:top w:w="40" w:type="dxa"/>
-              <w:bottom w:w="40" w:type="dxa"/>
-              <w:left w:w="50" w:type="dxa"/>
-              <w:right w:w="50" w:type="dxa"/>
+              <w:top w:w="35" w:type="dxa"/>
+              <w:bottom w:w="35" w:type="dxa"/>
+              <w:left w:w="45" w:type="dxa"/>
+              <w:right w:w="45" w:type="dxa"/>
             </w:tcMar>
           </w:tcPr>
           <w:p>
@@ -2286,7 +2444,7 @@
         </w:tc>
         <w:tc>
           <w:tcPr>
-            <w:tcW w:type="dxa" w:w="2340"/>
+            <w:tcW w:type="dxa" w:w="2412"/>
             <w:tcBorders>
               <w:top w:val="single" w:sz="4" w:space="0" w:color="000000"/>
               <w:bottom w:val="single" w:sz="4" w:space="0" w:color="000000"/>
@@ -2294,10 +2452,10 @@
               <w:right w:val="single" w:sz="4" w:space="0" w:color="000000"/>
             </w:tcBorders>
             <w:tcMar>
-              <w:top w:w="40" w:type="dxa"/>
-              <w:bottom w:w="40" w:type="dxa"/>
-              <w:left w:w="50" w:type="dxa"/>
-              <w:right w:w="50" w:type="dxa"/>
+              <w:top w:w="35" w:type="dxa"/>
+              <w:bottom w:w="35" w:type="dxa"/>
+              <w:left w:w="45" w:type="dxa"/>
+              <w:right w:w="45" w:type="dxa"/>
             </w:tcMar>
           </w:tcPr>
           <w:p>
@@ -2318,7 +2476,7 @@
         </w:tc>
         <w:tc>
           <w:tcPr>
-            <w:tcW w:type="dxa" w:w="2340"/>
+            <w:tcW w:type="dxa" w:w="2412"/>
             <w:tcBorders>
               <w:top w:val="single" w:sz="4" w:space="0" w:color="000000"/>
               <w:bottom w:val="single" w:sz="4" w:space="0" w:color="000000"/>
@@ -2326,10 +2484,10 @@
               <w:right w:val="single" w:sz="4" w:space="0" w:color="000000"/>
             </w:tcBorders>
             <w:tcMar>
-              <w:top w:w="40" w:type="dxa"/>
-              <w:bottom w:w="40" w:type="dxa"/>
-              <w:left w:w="50" w:type="dxa"/>
-              <w:right w:w="50" w:type="dxa"/>
+              <w:top w:w="35" w:type="dxa"/>
+              <w:bottom w:w="35" w:type="dxa"/>
+              <w:left w:w="45" w:type="dxa"/>
+              <w:right w:w="45" w:type="dxa"/>
             </w:tcMar>
           </w:tcPr>
           <w:p>
@@ -2352,7 +2510,7 @@
       <w:tr>
         <w:tc>
           <w:tcPr>
-            <w:tcW w:type="dxa" w:w="2340"/>
+            <w:tcW w:type="dxa" w:w="2412"/>
             <w:tcBorders>
               <w:top w:val="single" w:sz="4" w:space="0" w:color="000000"/>
               <w:bottom w:val="single" w:sz="4" w:space="0" w:color="000000"/>
@@ -2360,10 +2518,10 @@
               <w:right w:val="single" w:sz="4" w:space="0" w:color="000000"/>
             </w:tcBorders>
             <w:tcMar>
-              <w:top w:w="40" w:type="dxa"/>
-              <w:bottom w:w="40" w:type="dxa"/>
-              <w:left w:w="50" w:type="dxa"/>
-              <w:right w:w="50" w:type="dxa"/>
+              <w:top w:w="35" w:type="dxa"/>
+              <w:bottom w:w="35" w:type="dxa"/>
+              <w:left w:w="45" w:type="dxa"/>
+              <w:right w:w="45" w:type="dxa"/>
             </w:tcMar>
           </w:tcPr>
           <w:p>
@@ -2384,7 +2542,7 @@
         </w:tc>
         <w:tc>
           <w:tcPr>
-            <w:tcW w:type="dxa" w:w="2340"/>
+            <w:tcW w:type="dxa" w:w="2412"/>
             <w:tcBorders>
               <w:top w:val="single" w:sz="4" w:space="0" w:color="000000"/>
               <w:bottom w:val="single" w:sz="4" w:space="0" w:color="000000"/>
@@ -2392,10 +2550,10 @@
               <w:right w:val="single" w:sz="4" w:space="0" w:color="000000"/>
             </w:tcBorders>
             <w:tcMar>
-              <w:top w:w="40" w:type="dxa"/>
-              <w:bottom w:w="40" w:type="dxa"/>
-              <w:left w:w="50" w:type="dxa"/>
-              <w:right w:w="50" w:type="dxa"/>
+              <w:top w:w="35" w:type="dxa"/>
+              <w:bottom w:w="35" w:type="dxa"/>
+              <w:left w:w="45" w:type="dxa"/>
+              <w:right w:w="45" w:type="dxa"/>
             </w:tcMar>
           </w:tcPr>
           <w:p>
@@ -2413,7 +2571,7 @@
         </w:tc>
         <w:tc>
           <w:tcPr>
-            <w:tcW w:type="dxa" w:w="2340"/>
+            <w:tcW w:type="dxa" w:w="2412"/>
             <w:tcBorders>
               <w:top w:val="single" w:sz="4" w:space="0" w:color="000000"/>
               <w:bottom w:val="single" w:sz="4" w:space="0" w:color="000000"/>
@@ -2421,10 +2579,10 @@
               <w:right w:val="single" w:sz="4" w:space="0" w:color="000000"/>
             </w:tcBorders>
             <w:tcMar>
-              <w:top w:w="40" w:type="dxa"/>
-              <w:bottom w:w="40" w:type="dxa"/>
-              <w:left w:w="50" w:type="dxa"/>
-              <w:right w:w="50" w:type="dxa"/>
+              <w:top w:w="35" w:type="dxa"/>
+              <w:bottom w:w="35" w:type="dxa"/>
+              <w:left w:w="45" w:type="dxa"/>
+              <w:right w:w="45" w:type="dxa"/>
             </w:tcMar>
           </w:tcPr>
           <w:p>
@@ -2445,7 +2603,7 @@
         </w:tc>
         <w:tc>
           <w:tcPr>
-            <w:tcW w:type="dxa" w:w="2340"/>
+            <w:tcW w:type="dxa" w:w="2412"/>
             <w:tcBorders>
               <w:top w:val="single" w:sz="4" w:space="0" w:color="000000"/>
               <w:bottom w:val="single" w:sz="4" w:space="0" w:color="000000"/>
@@ -2453,10 +2611,10 @@
               <w:right w:val="single" w:sz="4" w:space="0" w:color="000000"/>
             </w:tcBorders>
             <w:tcMar>
-              <w:top w:w="40" w:type="dxa"/>
-              <w:bottom w:w="40" w:type="dxa"/>
-              <w:left w:w="50" w:type="dxa"/>
-              <w:right w:w="50" w:type="dxa"/>
+              <w:top w:w="35" w:type="dxa"/>
+              <w:bottom w:w="35" w:type="dxa"/>
+              <w:left w:w="45" w:type="dxa"/>
+              <w:right w:w="45" w:type="dxa"/>
             </w:tcMar>
           </w:tcPr>
           <w:p>
@@ -2479,7 +2637,7 @@
       <w:tr>
         <w:tc>
           <w:tcPr>
-            <w:tcW w:type="dxa" w:w="2340"/>
+            <w:tcW w:type="dxa" w:w="2412"/>
             <w:tcBorders>
               <w:top w:val="single" w:sz="4" w:space="0" w:color="000000"/>
               <w:bottom w:val="single" w:sz="4" w:space="0" w:color="000000"/>
@@ -2487,10 +2645,10 @@
               <w:right w:val="single" w:sz="4" w:space="0" w:color="000000"/>
             </w:tcBorders>
             <w:tcMar>
-              <w:top w:w="40" w:type="dxa"/>
-              <w:bottom w:w="40" w:type="dxa"/>
-              <w:left w:w="50" w:type="dxa"/>
-              <w:right w:w="50" w:type="dxa"/>
+              <w:top w:w="35" w:type="dxa"/>
+              <w:bottom w:w="35" w:type="dxa"/>
+              <w:left w:w="45" w:type="dxa"/>
+              <w:right w:w="45" w:type="dxa"/>
             </w:tcMar>
           </w:tcPr>
           <w:p>
@@ -2511,7 +2669,7 @@
         </w:tc>
         <w:tc>
           <w:tcPr>
-            <w:tcW w:type="dxa" w:w="2340"/>
+            <w:tcW w:type="dxa" w:w="2412"/>
             <w:tcBorders>
               <w:top w:val="single" w:sz="4" w:space="0" w:color="000000"/>
               <w:bottom w:val="single" w:sz="4" w:space="0" w:color="000000"/>
@@ -2519,10 +2677,10 @@
               <w:right w:val="single" w:sz="4" w:space="0" w:color="000000"/>
             </w:tcBorders>
             <w:tcMar>
-              <w:top w:w="40" w:type="dxa"/>
-              <w:bottom w:w="40" w:type="dxa"/>
-              <w:left w:w="50" w:type="dxa"/>
-              <w:right w:w="50" w:type="dxa"/>
+              <w:top w:w="35" w:type="dxa"/>
+              <w:bottom w:w="35" w:type="dxa"/>
+              <w:left w:w="45" w:type="dxa"/>
+              <w:right w:w="45" w:type="dxa"/>
             </w:tcMar>
           </w:tcPr>
           <w:p>
@@ -2540,7 +2698,7 @@
         </w:tc>
         <w:tc>
           <w:tcPr>
-            <w:tcW w:type="dxa" w:w="2340"/>
+            <w:tcW w:type="dxa" w:w="2412"/>
             <w:tcBorders>
               <w:top w:val="single" w:sz="4" w:space="0" w:color="000000"/>
               <w:bottom w:val="single" w:sz="4" w:space="0" w:color="000000"/>
@@ -2548,10 +2706,10 @@
               <w:right w:val="single" w:sz="4" w:space="0" w:color="000000"/>
             </w:tcBorders>
             <w:tcMar>
-              <w:top w:w="40" w:type="dxa"/>
-              <w:bottom w:w="40" w:type="dxa"/>
-              <w:left w:w="50" w:type="dxa"/>
-              <w:right w:w="50" w:type="dxa"/>
+              <w:top w:w="35" w:type="dxa"/>
+              <w:bottom w:w="35" w:type="dxa"/>
+              <w:left w:w="45" w:type="dxa"/>
+              <w:right w:w="45" w:type="dxa"/>
             </w:tcMar>
           </w:tcPr>
           <w:p>
@@ -2572,7 +2730,7 @@
         </w:tc>
         <w:tc>
           <w:tcPr>
-            <w:tcW w:type="dxa" w:w="2340"/>
+            <w:tcW w:type="dxa" w:w="2412"/>
             <w:tcBorders>
               <w:top w:val="single" w:sz="4" w:space="0" w:color="000000"/>
               <w:bottom w:val="single" w:sz="4" w:space="0" w:color="000000"/>
@@ -2580,10 +2738,10 @@
               <w:right w:val="single" w:sz="4" w:space="0" w:color="000000"/>
             </w:tcBorders>
             <w:tcMar>
-              <w:top w:w="40" w:type="dxa"/>
-              <w:bottom w:w="40" w:type="dxa"/>
-              <w:left w:w="50" w:type="dxa"/>
-              <w:right w:w="50" w:type="dxa"/>
+              <w:top w:w="35" w:type="dxa"/>
+              <w:bottom w:w="35" w:type="dxa"/>
+              <w:left w:w="45" w:type="dxa"/>
+              <w:right w:w="45" w:type="dxa"/>
             </w:tcMar>
           </w:tcPr>
           <w:p>
@@ -2606,7 +2764,7 @@
       <w:tr>
         <w:tc>
           <w:tcPr>
-            <w:tcW w:type="dxa" w:w="2340"/>
+            <w:tcW w:type="dxa" w:w="2412"/>
             <w:tcBorders>
               <w:top w:val="single" w:sz="4" w:space="0" w:color="000000"/>
               <w:bottom w:val="single" w:sz="4" w:space="0" w:color="000000"/>
@@ -2614,10 +2772,10 @@
               <w:right w:val="single" w:sz="4" w:space="0" w:color="000000"/>
             </w:tcBorders>
             <w:tcMar>
-              <w:top w:w="40" w:type="dxa"/>
-              <w:bottom w:w="40" w:type="dxa"/>
-              <w:left w:w="50" w:type="dxa"/>
-              <w:right w:w="50" w:type="dxa"/>
+              <w:top w:w="35" w:type="dxa"/>
+              <w:bottom w:w="35" w:type="dxa"/>
+              <w:left w:w="45" w:type="dxa"/>
+              <w:right w:w="45" w:type="dxa"/>
             </w:tcMar>
           </w:tcPr>
           <w:p>
@@ -2638,7 +2796,7 @@
         </w:tc>
         <w:tc>
           <w:tcPr>
-            <w:tcW w:type="dxa" w:w="2340"/>
+            <w:tcW w:type="dxa" w:w="2412"/>
             <w:tcBorders>
               <w:top w:val="single" w:sz="4" w:space="0" w:color="000000"/>
               <w:bottom w:val="single" w:sz="4" w:space="0" w:color="000000"/>
@@ -2646,10 +2804,10 @@
               <w:right w:val="single" w:sz="4" w:space="0" w:color="000000"/>
             </w:tcBorders>
             <w:tcMar>
-              <w:top w:w="40" w:type="dxa"/>
-              <w:bottom w:w="40" w:type="dxa"/>
-              <w:left w:w="50" w:type="dxa"/>
-              <w:right w:w="50" w:type="dxa"/>
+              <w:top w:w="35" w:type="dxa"/>
+              <w:bottom w:w="35" w:type="dxa"/>
+              <w:left w:w="45" w:type="dxa"/>
+              <w:right w:w="45" w:type="dxa"/>
             </w:tcMar>
           </w:tcPr>
           <w:p>
@@ -2667,7 +2825,7 @@
         </w:tc>
         <w:tc>
           <w:tcPr>
-            <w:tcW w:type="dxa" w:w="2340"/>
+            <w:tcW w:type="dxa" w:w="2412"/>
             <w:tcBorders>
               <w:top w:val="single" w:sz="4" w:space="0" w:color="000000"/>
               <w:bottom w:val="single" w:sz="4" w:space="0" w:color="000000"/>
@@ -2675,10 +2833,10 @@
               <w:right w:val="single" w:sz="4" w:space="0" w:color="000000"/>
             </w:tcBorders>
             <w:tcMar>
-              <w:top w:w="40" w:type="dxa"/>
-              <w:bottom w:w="40" w:type="dxa"/>
-              <w:left w:w="50" w:type="dxa"/>
-              <w:right w:w="50" w:type="dxa"/>
+              <w:top w:w="35" w:type="dxa"/>
+              <w:bottom w:w="35" w:type="dxa"/>
+              <w:left w:w="45" w:type="dxa"/>
+              <w:right w:w="45" w:type="dxa"/>
             </w:tcMar>
           </w:tcPr>
           <w:p>
@@ -2699,7 +2857,7 @@
         </w:tc>
         <w:tc>
           <w:tcPr>
-            <w:tcW w:type="dxa" w:w="2340"/>
+            <w:tcW w:type="dxa" w:w="2412"/>
             <w:tcBorders>
               <w:top w:val="single" w:sz="4" w:space="0" w:color="000000"/>
               <w:bottom w:val="single" w:sz="4" w:space="0" w:color="000000"/>
@@ -2707,10 +2865,10 @@
               <w:right w:val="single" w:sz="4" w:space="0" w:color="000000"/>
             </w:tcBorders>
             <w:tcMar>
-              <w:top w:w="40" w:type="dxa"/>
-              <w:bottom w:w="40" w:type="dxa"/>
-              <w:left w:w="50" w:type="dxa"/>
-              <w:right w:w="50" w:type="dxa"/>
+              <w:top w:w="35" w:type="dxa"/>
+              <w:bottom w:w="35" w:type="dxa"/>
+              <w:left w:w="45" w:type="dxa"/>
+              <w:right w:w="45" w:type="dxa"/>
             </w:tcMar>
           </w:tcPr>
           <w:p>
@@ -2733,7 +2891,7 @@
       <w:tr>
         <w:tc>
           <w:tcPr>
-            <w:tcW w:type="dxa" w:w="2340"/>
+            <w:tcW w:type="dxa" w:w="2412"/>
             <w:tcBorders>
               <w:top w:val="single" w:sz="4" w:space="0" w:color="000000"/>
               <w:bottom w:val="single" w:sz="4" w:space="0" w:color="000000"/>
@@ -2741,10 +2899,10 @@
               <w:right w:val="single" w:sz="4" w:space="0" w:color="000000"/>
             </w:tcBorders>
             <w:tcMar>
-              <w:top w:w="40" w:type="dxa"/>
-              <w:bottom w:w="40" w:type="dxa"/>
-              <w:left w:w="50" w:type="dxa"/>
-              <w:right w:w="50" w:type="dxa"/>
+              <w:top w:w="35" w:type="dxa"/>
+              <w:bottom w:w="35" w:type="dxa"/>
+              <w:left w:w="45" w:type="dxa"/>
+              <w:right w:w="45" w:type="dxa"/>
             </w:tcMar>
           </w:tcPr>
           <w:p>
@@ -2765,7 +2923,7 @@
         </w:tc>
         <w:tc>
           <w:tcPr>
-            <w:tcW w:type="dxa" w:w="2340"/>
+            <w:tcW w:type="dxa" w:w="2412"/>
             <w:tcBorders>
               <w:top w:val="single" w:sz="4" w:space="0" w:color="000000"/>
               <w:bottom w:val="single" w:sz="4" w:space="0" w:color="000000"/>
@@ -2773,10 +2931,10 @@
               <w:right w:val="single" w:sz="4" w:space="0" w:color="000000"/>
             </w:tcBorders>
             <w:tcMar>
-              <w:top w:w="40" w:type="dxa"/>
-              <w:bottom w:w="40" w:type="dxa"/>
-              <w:left w:w="50" w:type="dxa"/>
-              <w:right w:w="50" w:type="dxa"/>
+              <w:top w:w="35" w:type="dxa"/>
+              <w:bottom w:w="35" w:type="dxa"/>
+              <w:left w:w="45" w:type="dxa"/>
+              <w:right w:w="45" w:type="dxa"/>
             </w:tcMar>
           </w:tcPr>
           <w:p>
@@ -2794,7 +2952,7 @@
         </w:tc>
         <w:tc>
           <w:tcPr>
-            <w:tcW w:type="dxa" w:w="2340"/>
+            <w:tcW w:type="dxa" w:w="2412"/>
             <w:tcBorders>
               <w:top w:val="single" w:sz="4" w:space="0" w:color="000000"/>
               <w:bottom w:val="single" w:sz="4" w:space="0" w:color="000000"/>
@@ -2802,10 +2960,10 @@
               <w:right w:val="single" w:sz="4" w:space="0" w:color="000000"/>
             </w:tcBorders>
             <w:tcMar>
-              <w:top w:w="40" w:type="dxa"/>
-              <w:bottom w:w="40" w:type="dxa"/>
-              <w:left w:w="50" w:type="dxa"/>
-              <w:right w:w="50" w:type="dxa"/>
+              <w:top w:w="35" w:type="dxa"/>
+              <w:bottom w:w="35" w:type="dxa"/>
+              <w:left w:w="45" w:type="dxa"/>
+              <w:right w:w="45" w:type="dxa"/>
             </w:tcMar>
           </w:tcPr>
           <w:p>
@@ -2826,7 +2984,7 @@
         </w:tc>
         <w:tc>
           <w:tcPr>
-            <w:tcW w:type="dxa" w:w="2340"/>
+            <w:tcW w:type="dxa" w:w="2412"/>
             <w:tcBorders>
               <w:top w:val="single" w:sz="4" w:space="0" w:color="000000"/>
               <w:bottom w:val="single" w:sz="4" w:space="0" w:color="000000"/>
@@ -2834,10 +2992,10 @@
               <w:right w:val="single" w:sz="4" w:space="0" w:color="000000"/>
             </w:tcBorders>
             <w:tcMar>
-              <w:top w:w="40" w:type="dxa"/>
-              <w:bottom w:w="40" w:type="dxa"/>
-              <w:left w:w="50" w:type="dxa"/>
-              <w:right w:w="50" w:type="dxa"/>
+              <w:top w:w="35" w:type="dxa"/>
+              <w:bottom w:w="35" w:type="dxa"/>
+              <w:left w:w="45" w:type="dxa"/>
+              <w:right w:w="45" w:type="dxa"/>
             </w:tcMar>
           </w:tcPr>
           <w:p>
@@ -2886,16 +3044,16 @@
         <w:tblLook w:firstColumn="1" w:firstRow="1" w:lastColumn="0" w:lastRow="0" w:noHBand="0" w:noVBand="1" w:val="04A0"/>
       </w:tblPr>
       <w:tblGrid>
-        <w:gridCol w:w="1872"/>
-        <w:gridCol w:w="1872"/>
-        <w:gridCol w:w="1872"/>
-        <w:gridCol w:w="1872"/>
-        <w:gridCol w:w="1872"/>
+        <w:gridCol w:w="1930"/>
+        <w:gridCol w:w="1930"/>
+        <w:gridCol w:w="1930"/>
+        <w:gridCol w:w="1930"/>
+        <w:gridCol w:w="1930"/>
       </w:tblGrid>
       <w:tr>
         <w:tc>
           <w:tcPr>
-            <w:tcW w:type="dxa" w:w="1872"/>
+            <w:tcW w:type="dxa" w:w="1930"/>
             <w:tcBorders>
               <w:top w:val="single" w:sz="4" w:space="0" w:color="000000"/>
               <w:bottom w:val="single" w:sz="4" w:space="0" w:color="000000"/>
@@ -2903,10 +3061,10 @@
               <w:right w:val="single" w:sz="4" w:space="0" w:color="000000"/>
             </w:tcBorders>
             <w:tcMar>
-              <w:top w:w="60" w:type="dxa"/>
-              <w:bottom w:w="60" w:type="dxa"/>
-              <w:left w:w="60" w:type="dxa"/>
-              <w:right w:w="60" w:type="dxa"/>
+              <w:top w:w="50" w:type="dxa"/>
+              <w:bottom w:w="50" w:type="dxa"/>
+              <w:left w:w="50" w:type="dxa"/>
+              <w:right w:w="50" w:type="dxa"/>
             </w:tcMar>
           </w:tcPr>
           <w:p>
@@ -2927,7 +3085,7 @@
         </w:tc>
         <w:tc>
           <w:tcPr>
-            <w:tcW w:type="dxa" w:w="1872"/>
+            <w:tcW w:type="dxa" w:w="1930"/>
             <w:tcBorders>
               <w:top w:val="single" w:sz="4" w:space="0" w:color="000000"/>
               <w:bottom w:val="single" w:sz="4" w:space="0" w:color="000000"/>
@@ -2935,10 +3093,10 @@
               <w:right w:val="single" w:sz="4" w:space="0" w:color="000000"/>
             </w:tcBorders>
             <w:tcMar>
-              <w:top w:w="60" w:type="dxa"/>
-              <w:bottom w:w="60" w:type="dxa"/>
-              <w:left w:w="60" w:type="dxa"/>
-              <w:right w:w="60" w:type="dxa"/>
+              <w:top w:w="50" w:type="dxa"/>
+              <w:bottom w:w="50" w:type="dxa"/>
+              <w:left w:w="50" w:type="dxa"/>
+              <w:right w:w="50" w:type="dxa"/>
             </w:tcMar>
           </w:tcPr>
           <w:p>
@@ -2959,7 +3117,7 @@
         </w:tc>
         <w:tc>
           <w:tcPr>
-            <w:tcW w:type="dxa" w:w="1872"/>
+            <w:tcW w:type="dxa" w:w="1930"/>
             <w:tcBorders>
               <w:top w:val="single" w:sz="4" w:space="0" w:color="000000"/>
               <w:bottom w:val="single" w:sz="4" w:space="0" w:color="000000"/>
@@ -2967,10 +3125,10 @@
               <w:right w:val="single" w:sz="4" w:space="0" w:color="000000"/>
             </w:tcBorders>
             <w:tcMar>
-              <w:top w:w="60" w:type="dxa"/>
-              <w:bottom w:w="60" w:type="dxa"/>
-              <w:left w:w="60" w:type="dxa"/>
-              <w:right w:w="60" w:type="dxa"/>
+              <w:top w:w="50" w:type="dxa"/>
+              <w:bottom w:w="50" w:type="dxa"/>
+              <w:left w:w="50" w:type="dxa"/>
+              <w:right w:w="50" w:type="dxa"/>
             </w:tcMar>
           </w:tcPr>
           <w:p>
@@ -2991,7 +3149,7 @@
         </w:tc>
         <w:tc>
           <w:tcPr>
-            <w:tcW w:type="dxa" w:w="1872"/>
+            <w:tcW w:type="dxa" w:w="1930"/>
             <w:tcBorders>
               <w:top w:val="single" w:sz="4" w:space="0" w:color="000000"/>
               <w:bottom w:val="single" w:sz="4" w:space="0" w:color="000000"/>
@@ -2999,10 +3157,10 @@
               <w:right w:val="single" w:sz="4" w:space="0" w:color="000000"/>
             </w:tcBorders>
             <w:tcMar>
-              <w:top w:w="60" w:type="dxa"/>
-              <w:bottom w:w="60" w:type="dxa"/>
-              <w:left w:w="60" w:type="dxa"/>
-              <w:right w:w="60" w:type="dxa"/>
+              <w:top w:w="50" w:type="dxa"/>
+              <w:bottom w:w="50" w:type="dxa"/>
+              <w:left w:w="50" w:type="dxa"/>
+              <w:right w:w="50" w:type="dxa"/>
             </w:tcMar>
           </w:tcPr>
           <w:p>
@@ -3023,7 +3181,7 @@
         </w:tc>
         <w:tc>
           <w:tcPr>
-            <w:tcW w:type="dxa" w:w="1872"/>
+            <w:tcW w:type="dxa" w:w="1930"/>
             <w:tcBorders>
               <w:top w:val="single" w:sz="4" w:space="0" w:color="000000"/>
               <w:bottom w:val="single" w:sz="4" w:space="0" w:color="000000"/>
@@ -3031,10 +3189,10 @@
               <w:right w:val="single" w:sz="4" w:space="0" w:color="000000"/>
             </w:tcBorders>
             <w:tcMar>
-              <w:top w:w="60" w:type="dxa"/>
-              <w:bottom w:w="60" w:type="dxa"/>
-              <w:left w:w="60" w:type="dxa"/>
-              <w:right w:w="60" w:type="dxa"/>
+              <w:top w:w="50" w:type="dxa"/>
+              <w:bottom w:w="50" w:type="dxa"/>
+              <w:left w:w="50" w:type="dxa"/>
+              <w:right w:w="50" w:type="dxa"/>
             </w:tcMar>
           </w:tcPr>
           <w:p>
@@ -3057,7 +3215,7 @@
       <w:tr>
         <w:tc>
           <w:tcPr>
-            <w:tcW w:type="dxa" w:w="1872"/>
+            <w:tcW w:type="dxa" w:w="1930"/>
             <w:tcBorders>
               <w:top w:val="single" w:sz="4" w:space="0" w:color="000000"/>
               <w:bottom w:val="single" w:sz="4" w:space="0" w:color="000000"/>
@@ -3065,10 +3223,10 @@
               <w:right w:val="single" w:sz="4" w:space="0" w:color="000000"/>
             </w:tcBorders>
             <w:tcMar>
-              <w:top w:w="40" w:type="dxa"/>
-              <w:bottom w:w="40" w:type="dxa"/>
-              <w:left w:w="40" w:type="dxa"/>
-              <w:right w:w="40" w:type="dxa"/>
+              <w:top w:w="35" w:type="dxa"/>
+              <w:bottom w:w="35" w:type="dxa"/>
+              <w:left w:w="35" w:type="dxa"/>
+              <w:right w:w="35" w:type="dxa"/>
             </w:tcMar>
           </w:tcPr>
           <w:p>
@@ -3089,7 +3247,7 @@
         </w:tc>
         <w:tc>
           <w:tcPr>
-            <w:tcW w:type="dxa" w:w="1872"/>
+            <w:tcW w:type="dxa" w:w="1930"/>
             <w:tcBorders>
               <w:top w:val="single" w:sz="4" w:space="0" w:color="000000"/>
               <w:bottom w:val="single" w:sz="4" w:space="0" w:color="000000"/>
@@ -3097,10 +3255,10 @@
               <w:right w:val="single" w:sz="4" w:space="0" w:color="000000"/>
             </w:tcBorders>
             <w:tcMar>
-              <w:top w:w="40" w:type="dxa"/>
-              <w:bottom w:w="40" w:type="dxa"/>
-              <w:left w:w="40" w:type="dxa"/>
-              <w:right w:w="40" w:type="dxa"/>
+              <w:top w:w="35" w:type="dxa"/>
+              <w:bottom w:w="35" w:type="dxa"/>
+              <w:left w:w="35" w:type="dxa"/>
+              <w:right w:w="35" w:type="dxa"/>
             </w:tcMar>
           </w:tcPr>
           <w:p>
@@ -3121,7 +3279,7 @@
         </w:tc>
         <w:tc>
           <w:tcPr>
-            <w:tcW w:type="dxa" w:w="1872"/>
+            <w:tcW w:type="dxa" w:w="1930"/>
             <w:tcBorders>
               <w:top w:val="single" w:sz="4" w:space="0" w:color="000000"/>
               <w:bottom w:val="single" w:sz="4" w:space="0" w:color="000000"/>
@@ -3129,10 +3287,10 @@
               <w:right w:val="single" w:sz="4" w:space="0" w:color="000000"/>
             </w:tcBorders>
             <w:tcMar>
-              <w:top w:w="40" w:type="dxa"/>
-              <w:bottom w:w="40" w:type="dxa"/>
-              <w:left w:w="40" w:type="dxa"/>
-              <w:right w:w="40" w:type="dxa"/>
+              <w:top w:w="35" w:type="dxa"/>
+              <w:bottom w:w="35" w:type="dxa"/>
+              <w:left w:w="35" w:type="dxa"/>
+              <w:right w:w="35" w:type="dxa"/>
             </w:tcMar>
           </w:tcPr>
           <w:p>
@@ -3150,7 +3308,7 @@
         </w:tc>
         <w:tc>
           <w:tcPr>
-            <w:tcW w:type="dxa" w:w="1872"/>
+            <w:tcW w:type="dxa" w:w="1930"/>
             <w:tcBorders>
               <w:top w:val="single" w:sz="4" w:space="0" w:color="000000"/>
               <w:bottom w:val="single" w:sz="4" w:space="0" w:color="000000"/>
@@ -3158,10 +3316,10 @@
               <w:right w:val="single" w:sz="4" w:space="0" w:color="000000"/>
             </w:tcBorders>
             <w:tcMar>
-              <w:top w:w="40" w:type="dxa"/>
-              <w:bottom w:w="40" w:type="dxa"/>
-              <w:left w:w="40" w:type="dxa"/>
-              <w:right w:w="40" w:type="dxa"/>
+              <w:top w:w="35" w:type="dxa"/>
+              <w:bottom w:w="35" w:type="dxa"/>
+              <w:left w:w="35" w:type="dxa"/>
+              <w:right w:w="35" w:type="dxa"/>
             </w:tcMar>
           </w:tcPr>
           <w:p>
@@ -3179,7 +3337,7 @@
         </w:tc>
         <w:tc>
           <w:tcPr>
-            <w:tcW w:type="dxa" w:w="1872"/>
+            <w:tcW w:type="dxa" w:w="1930"/>
             <w:tcBorders>
               <w:top w:val="single" w:sz="4" w:space="0" w:color="000000"/>
               <w:bottom w:val="single" w:sz="4" w:space="0" w:color="000000"/>
@@ -3187,10 +3345,10 @@
               <w:right w:val="single" w:sz="4" w:space="0" w:color="000000"/>
             </w:tcBorders>
             <w:tcMar>
-              <w:top w:w="40" w:type="dxa"/>
-              <w:bottom w:w="40" w:type="dxa"/>
-              <w:left w:w="40" w:type="dxa"/>
-              <w:right w:w="40" w:type="dxa"/>
+              <w:top w:w="35" w:type="dxa"/>
+              <w:bottom w:w="35" w:type="dxa"/>
+              <w:left w:w="35" w:type="dxa"/>
+              <w:right w:w="35" w:type="dxa"/>
             </w:tcMar>
           </w:tcPr>
           <w:p>
@@ -3213,7 +3371,7 @@
       <w:tr>
         <w:tc>
           <w:tcPr>
-            <w:tcW w:type="dxa" w:w="1872"/>
+            <w:tcW w:type="dxa" w:w="1930"/>
             <w:tcBorders>
               <w:top w:val="single" w:sz="4" w:space="0" w:color="000000"/>
               <w:bottom w:val="single" w:sz="4" w:space="0" w:color="000000"/>
@@ -3221,10 +3379,10 @@
               <w:right w:val="single" w:sz="4" w:space="0" w:color="000000"/>
             </w:tcBorders>
             <w:tcMar>
-              <w:top w:w="40" w:type="dxa"/>
-              <w:bottom w:w="40" w:type="dxa"/>
-              <w:left w:w="40" w:type="dxa"/>
-              <w:right w:w="40" w:type="dxa"/>
+              <w:top w:w="35" w:type="dxa"/>
+              <w:bottom w:w="35" w:type="dxa"/>
+              <w:left w:w="35" w:type="dxa"/>
+              <w:right w:w="35" w:type="dxa"/>
             </w:tcMar>
           </w:tcPr>
           <w:p>
@@ -3245,7 +3403,7 @@
         </w:tc>
         <w:tc>
           <w:tcPr>
-            <w:tcW w:type="dxa" w:w="1872"/>
+            <w:tcW w:type="dxa" w:w="1930"/>
             <w:tcBorders>
               <w:top w:val="single" w:sz="4" w:space="0" w:color="000000"/>
               <w:bottom w:val="single" w:sz="4" w:space="0" w:color="000000"/>
@@ -3253,10 +3411,10 @@
               <w:right w:val="single" w:sz="4" w:space="0" w:color="000000"/>
             </w:tcBorders>
             <w:tcMar>
-              <w:top w:w="40" w:type="dxa"/>
-              <w:bottom w:w="40" w:type="dxa"/>
-              <w:left w:w="40" w:type="dxa"/>
-              <w:right w:w="40" w:type="dxa"/>
+              <w:top w:w="35" w:type="dxa"/>
+              <w:bottom w:w="35" w:type="dxa"/>
+              <w:left w:w="35" w:type="dxa"/>
+              <w:right w:w="35" w:type="dxa"/>
             </w:tcMar>
           </w:tcPr>
           <w:p>
@@ -3277,7 +3435,7 @@
         </w:tc>
         <w:tc>
           <w:tcPr>
-            <w:tcW w:type="dxa" w:w="1872"/>
+            <w:tcW w:type="dxa" w:w="1930"/>
             <w:tcBorders>
               <w:top w:val="single" w:sz="4" w:space="0" w:color="000000"/>
               <w:bottom w:val="single" w:sz="4" w:space="0" w:color="000000"/>
@@ -3285,10 +3443,10 @@
               <w:right w:val="single" w:sz="4" w:space="0" w:color="000000"/>
             </w:tcBorders>
             <w:tcMar>
-              <w:top w:w="40" w:type="dxa"/>
-              <w:bottom w:w="40" w:type="dxa"/>
-              <w:left w:w="40" w:type="dxa"/>
-              <w:right w:w="40" w:type="dxa"/>
+              <w:top w:w="35" w:type="dxa"/>
+              <w:bottom w:w="35" w:type="dxa"/>
+              <w:left w:w="35" w:type="dxa"/>
+              <w:right w:w="35" w:type="dxa"/>
             </w:tcMar>
           </w:tcPr>
           <w:p>
@@ -3306,7 +3464,7 @@
         </w:tc>
         <w:tc>
           <w:tcPr>
-            <w:tcW w:type="dxa" w:w="1872"/>
+            <w:tcW w:type="dxa" w:w="1930"/>
             <w:tcBorders>
               <w:top w:val="single" w:sz="4" w:space="0" w:color="000000"/>
               <w:bottom w:val="single" w:sz="4" w:space="0" w:color="000000"/>
@@ -3314,10 +3472,10 @@
               <w:right w:val="single" w:sz="4" w:space="0" w:color="000000"/>
             </w:tcBorders>
             <w:tcMar>
-              <w:top w:w="40" w:type="dxa"/>
-              <w:bottom w:w="40" w:type="dxa"/>
-              <w:left w:w="40" w:type="dxa"/>
-              <w:right w:w="40" w:type="dxa"/>
+              <w:top w:w="35" w:type="dxa"/>
+              <w:bottom w:w="35" w:type="dxa"/>
+              <w:left w:w="35" w:type="dxa"/>
+              <w:right w:w="35" w:type="dxa"/>
             </w:tcMar>
           </w:tcPr>
           <w:p>
@@ -3335,7 +3493,7 @@
         </w:tc>
         <w:tc>
           <w:tcPr>
-            <w:tcW w:type="dxa" w:w="1872"/>
+            <w:tcW w:type="dxa" w:w="1930"/>
             <w:tcBorders>
               <w:top w:val="single" w:sz="4" w:space="0" w:color="000000"/>
               <w:bottom w:val="single" w:sz="4" w:space="0" w:color="000000"/>
@@ -3343,10 +3501,10 @@
               <w:right w:val="single" w:sz="4" w:space="0" w:color="000000"/>
             </w:tcBorders>
             <w:tcMar>
-              <w:top w:w="40" w:type="dxa"/>
-              <w:bottom w:w="40" w:type="dxa"/>
-              <w:left w:w="40" w:type="dxa"/>
-              <w:right w:w="40" w:type="dxa"/>
+              <w:top w:w="35" w:type="dxa"/>
+              <w:bottom w:w="35" w:type="dxa"/>
+              <w:left w:w="35" w:type="dxa"/>
+              <w:right w:w="35" w:type="dxa"/>
             </w:tcMar>
           </w:tcPr>
           <w:p>
@@ -3369,7 +3527,7 @@
       <w:tr>
         <w:tc>
           <w:tcPr>
-            <w:tcW w:type="dxa" w:w="1872"/>
+            <w:tcW w:type="dxa" w:w="1930"/>
             <w:tcBorders>
               <w:top w:val="single" w:sz="4" w:space="0" w:color="000000"/>
               <w:bottom w:val="single" w:sz="4" w:space="0" w:color="000000"/>
@@ -3377,10 +3535,10 @@
               <w:right w:val="single" w:sz="4" w:space="0" w:color="000000"/>
             </w:tcBorders>
             <w:tcMar>
-              <w:top w:w="40" w:type="dxa"/>
-              <w:bottom w:w="40" w:type="dxa"/>
-              <w:left w:w="40" w:type="dxa"/>
-              <w:right w:w="40" w:type="dxa"/>
+              <w:top w:w="35" w:type="dxa"/>
+              <w:bottom w:w="35" w:type="dxa"/>
+              <w:left w:w="35" w:type="dxa"/>
+              <w:right w:w="35" w:type="dxa"/>
             </w:tcMar>
           </w:tcPr>
           <w:p>
@@ -3401,7 +3559,7 @@
         </w:tc>
         <w:tc>
           <w:tcPr>
-            <w:tcW w:type="dxa" w:w="1872"/>
+            <w:tcW w:type="dxa" w:w="1930"/>
             <w:tcBorders>
               <w:top w:val="single" w:sz="4" w:space="0" w:color="000000"/>
               <w:bottom w:val="single" w:sz="4" w:space="0" w:color="000000"/>
@@ -3409,10 +3567,10 @@
               <w:right w:val="single" w:sz="4" w:space="0" w:color="000000"/>
             </w:tcBorders>
             <w:tcMar>
-              <w:top w:w="40" w:type="dxa"/>
-              <w:bottom w:w="40" w:type="dxa"/>
-              <w:left w:w="40" w:type="dxa"/>
-              <w:right w:w="40" w:type="dxa"/>
+              <w:top w:w="35" w:type="dxa"/>
+              <w:bottom w:w="35" w:type="dxa"/>
+              <w:left w:w="35" w:type="dxa"/>
+              <w:right w:w="35" w:type="dxa"/>
             </w:tcMar>
           </w:tcPr>
           <w:p>
@@ -3433,7 +3591,7 @@
         </w:tc>
         <w:tc>
           <w:tcPr>
-            <w:tcW w:type="dxa" w:w="1872"/>
+            <w:tcW w:type="dxa" w:w="1930"/>
             <w:tcBorders>
               <w:top w:val="single" w:sz="4" w:space="0" w:color="000000"/>
               <w:bottom w:val="single" w:sz="4" w:space="0" w:color="000000"/>
@@ -3441,10 +3599,10 @@
               <w:right w:val="single" w:sz="4" w:space="0" w:color="000000"/>
             </w:tcBorders>
             <w:tcMar>
-              <w:top w:w="40" w:type="dxa"/>
-              <w:bottom w:w="40" w:type="dxa"/>
-              <w:left w:w="40" w:type="dxa"/>
-              <w:right w:w="40" w:type="dxa"/>
+              <w:top w:w="35" w:type="dxa"/>
+              <w:bottom w:w="35" w:type="dxa"/>
+              <w:left w:w="35" w:type="dxa"/>
+              <w:right w:w="35" w:type="dxa"/>
             </w:tcMar>
           </w:tcPr>
           <w:p>
@@ -3462,7 +3620,7 @@
         </w:tc>
         <w:tc>
           <w:tcPr>
-            <w:tcW w:type="dxa" w:w="1872"/>
+            <w:tcW w:type="dxa" w:w="1930"/>
             <w:tcBorders>
               <w:top w:val="single" w:sz="4" w:space="0" w:color="000000"/>
               <w:bottom w:val="single" w:sz="4" w:space="0" w:color="000000"/>
@@ -3470,10 +3628,10 @@
               <w:right w:val="single" w:sz="4" w:space="0" w:color="000000"/>
             </w:tcBorders>
             <w:tcMar>
-              <w:top w:w="40" w:type="dxa"/>
-              <w:bottom w:w="40" w:type="dxa"/>
-              <w:left w:w="40" w:type="dxa"/>
-              <w:right w:w="40" w:type="dxa"/>
+              <w:top w:w="35" w:type="dxa"/>
+              <w:bottom w:w="35" w:type="dxa"/>
+              <w:left w:w="35" w:type="dxa"/>
+              <w:right w:w="35" w:type="dxa"/>
             </w:tcMar>
           </w:tcPr>
           <w:p>
@@ -3491,7 +3649,7 @@
         </w:tc>
         <w:tc>
           <w:tcPr>
-            <w:tcW w:type="dxa" w:w="1872"/>
+            <w:tcW w:type="dxa" w:w="1930"/>
             <w:tcBorders>
               <w:top w:val="single" w:sz="4" w:space="0" w:color="000000"/>
               <w:bottom w:val="single" w:sz="4" w:space="0" w:color="000000"/>
@@ -3499,10 +3657,10 @@
               <w:right w:val="single" w:sz="4" w:space="0" w:color="000000"/>
             </w:tcBorders>
             <w:tcMar>
-              <w:top w:w="40" w:type="dxa"/>
-              <w:bottom w:w="40" w:type="dxa"/>
-              <w:left w:w="40" w:type="dxa"/>
-              <w:right w:w="40" w:type="dxa"/>
+              <w:top w:w="35" w:type="dxa"/>
+              <w:bottom w:w="35" w:type="dxa"/>
+              <w:left w:w="35" w:type="dxa"/>
+              <w:right w:w="35" w:type="dxa"/>
             </w:tcMar>
           </w:tcPr>
           <w:p>
@@ -3525,7 +3683,7 @@
       <w:tr>
         <w:tc>
           <w:tcPr>
-            <w:tcW w:type="dxa" w:w="1872"/>
+            <w:tcW w:type="dxa" w:w="1930"/>
             <w:tcBorders>
               <w:top w:val="single" w:sz="4" w:space="0" w:color="000000"/>
               <w:bottom w:val="single" w:sz="4" w:space="0" w:color="000000"/>
@@ -3533,10 +3691,10 @@
               <w:right w:val="single" w:sz="4" w:space="0" w:color="000000"/>
             </w:tcBorders>
             <w:tcMar>
-              <w:top w:w="40" w:type="dxa"/>
-              <w:bottom w:w="40" w:type="dxa"/>
-              <w:left w:w="40" w:type="dxa"/>
-              <w:right w:w="40" w:type="dxa"/>
+              <w:top w:w="35" w:type="dxa"/>
+              <w:bottom w:w="35" w:type="dxa"/>
+              <w:left w:w="35" w:type="dxa"/>
+              <w:right w:w="35" w:type="dxa"/>
             </w:tcMar>
           </w:tcPr>
           <w:p>
@@ -3557,7 +3715,7 @@
         </w:tc>
         <w:tc>
           <w:tcPr>
-            <w:tcW w:type="dxa" w:w="1872"/>
+            <w:tcW w:type="dxa" w:w="1930"/>
             <w:tcBorders>
               <w:top w:val="single" w:sz="4" w:space="0" w:color="000000"/>
               <w:bottom w:val="single" w:sz="4" w:space="0" w:color="000000"/>
@@ -3565,10 +3723,10 @@
               <w:right w:val="single" w:sz="4" w:space="0" w:color="000000"/>
             </w:tcBorders>
             <w:tcMar>
-              <w:top w:w="40" w:type="dxa"/>
-              <w:bottom w:w="40" w:type="dxa"/>
-              <w:left w:w="40" w:type="dxa"/>
-              <w:right w:w="40" w:type="dxa"/>
+              <w:top w:w="35" w:type="dxa"/>
+              <w:bottom w:w="35" w:type="dxa"/>
+              <w:left w:w="35" w:type="dxa"/>
+              <w:right w:w="35" w:type="dxa"/>
             </w:tcMar>
           </w:tcPr>
           <w:p>
@@ -3589,7 +3747,7 @@
         </w:tc>
         <w:tc>
           <w:tcPr>
-            <w:tcW w:type="dxa" w:w="1872"/>
+            <w:tcW w:type="dxa" w:w="1930"/>
             <w:tcBorders>
               <w:top w:val="single" w:sz="4" w:space="0" w:color="000000"/>
               <w:bottom w:val="single" w:sz="4" w:space="0" w:color="000000"/>
@@ -3597,10 +3755,10 @@
               <w:right w:val="single" w:sz="4" w:space="0" w:color="000000"/>
             </w:tcBorders>
             <w:tcMar>
-              <w:top w:w="40" w:type="dxa"/>
-              <w:bottom w:w="40" w:type="dxa"/>
-              <w:left w:w="40" w:type="dxa"/>
-              <w:right w:w="40" w:type="dxa"/>
+              <w:top w:w="35" w:type="dxa"/>
+              <w:bottom w:w="35" w:type="dxa"/>
+              <w:left w:w="35" w:type="dxa"/>
+              <w:right w:w="35" w:type="dxa"/>
             </w:tcMar>
           </w:tcPr>
           <w:p>
@@ -3618,7 +3776,7 @@
         </w:tc>
         <w:tc>
           <w:tcPr>
-            <w:tcW w:type="dxa" w:w="1872"/>
+            <w:tcW w:type="dxa" w:w="1930"/>
             <w:tcBorders>
               <w:top w:val="single" w:sz="4" w:space="0" w:color="000000"/>
               <w:bottom w:val="single" w:sz="4" w:space="0" w:color="000000"/>
@@ -3626,10 +3784,10 @@
               <w:right w:val="single" w:sz="4" w:space="0" w:color="000000"/>
             </w:tcBorders>
             <w:tcMar>
-              <w:top w:w="40" w:type="dxa"/>
-              <w:bottom w:w="40" w:type="dxa"/>
-              <w:left w:w="40" w:type="dxa"/>
-              <w:right w:w="40" w:type="dxa"/>
+              <w:top w:w="35" w:type="dxa"/>
+              <w:bottom w:w="35" w:type="dxa"/>
+              <w:left w:w="35" w:type="dxa"/>
+              <w:right w:w="35" w:type="dxa"/>
             </w:tcMar>
           </w:tcPr>
           <w:p>
@@ -3647,7 +3805,7 @@
         </w:tc>
         <w:tc>
           <w:tcPr>
-            <w:tcW w:type="dxa" w:w="1872"/>
+            <w:tcW w:type="dxa" w:w="1930"/>
             <w:tcBorders>
               <w:top w:val="single" w:sz="4" w:space="0" w:color="000000"/>
               <w:bottom w:val="single" w:sz="4" w:space="0" w:color="000000"/>
@@ -3655,10 +3813,10 @@
               <w:right w:val="single" w:sz="4" w:space="0" w:color="000000"/>
             </w:tcBorders>
             <w:tcMar>
-              <w:top w:w="40" w:type="dxa"/>
-              <w:bottom w:w="40" w:type="dxa"/>
-              <w:left w:w="40" w:type="dxa"/>
-              <w:right w:w="40" w:type="dxa"/>
+              <w:top w:w="35" w:type="dxa"/>
+              <w:bottom w:w="35" w:type="dxa"/>
+              <w:left w:w="35" w:type="dxa"/>
+              <w:right w:w="35" w:type="dxa"/>
             </w:tcMar>
           </w:tcPr>
           <w:p>
@@ -3681,7 +3839,7 @@
       <w:tr>
         <w:tc>
           <w:tcPr>
-            <w:tcW w:type="dxa" w:w="1872"/>
+            <w:tcW w:type="dxa" w:w="1930"/>
             <w:tcBorders>
               <w:top w:val="single" w:sz="4" w:space="0" w:color="000000"/>
               <w:bottom w:val="single" w:sz="4" w:space="0" w:color="000000"/>
@@ -3689,10 +3847,10 @@
               <w:right w:val="single" w:sz="4" w:space="0" w:color="000000"/>
             </w:tcBorders>
             <w:tcMar>
-              <w:top w:w="40" w:type="dxa"/>
-              <w:bottom w:w="40" w:type="dxa"/>
-              <w:left w:w="40" w:type="dxa"/>
-              <w:right w:w="40" w:type="dxa"/>
+              <w:top w:w="35" w:type="dxa"/>
+              <w:bottom w:w="35" w:type="dxa"/>
+              <w:left w:w="35" w:type="dxa"/>
+              <w:right w:w="35" w:type="dxa"/>
             </w:tcMar>
           </w:tcPr>
           <w:p>
@@ -3713,7 +3871,7 @@
         </w:tc>
         <w:tc>
           <w:tcPr>
-            <w:tcW w:type="dxa" w:w="1872"/>
+            <w:tcW w:type="dxa" w:w="1930"/>
             <w:tcBorders>
               <w:top w:val="single" w:sz="4" w:space="0" w:color="000000"/>
               <w:bottom w:val="single" w:sz="4" w:space="0" w:color="000000"/>
@@ -3721,10 +3879,10 @@
               <w:right w:val="single" w:sz="4" w:space="0" w:color="000000"/>
             </w:tcBorders>
             <w:tcMar>
-              <w:top w:w="40" w:type="dxa"/>
-              <w:bottom w:w="40" w:type="dxa"/>
-              <w:left w:w="40" w:type="dxa"/>
-              <w:right w:w="40" w:type="dxa"/>
+              <w:top w:w="35" w:type="dxa"/>
+              <w:bottom w:w="35" w:type="dxa"/>
+              <w:left w:w="35" w:type="dxa"/>
+              <w:right w:w="35" w:type="dxa"/>
             </w:tcMar>
           </w:tcPr>
           <w:p>
@@ -3745,7 +3903,7 @@
         </w:tc>
         <w:tc>
           <w:tcPr>
-            <w:tcW w:type="dxa" w:w="1872"/>
+            <w:tcW w:type="dxa" w:w="1930"/>
             <w:tcBorders>
               <w:top w:val="single" w:sz="4" w:space="0" w:color="000000"/>
               <w:bottom w:val="single" w:sz="4" w:space="0" w:color="000000"/>
@@ -3753,10 +3911,10 @@
               <w:right w:val="single" w:sz="4" w:space="0" w:color="000000"/>
             </w:tcBorders>
             <w:tcMar>
-              <w:top w:w="40" w:type="dxa"/>
-              <w:bottom w:w="40" w:type="dxa"/>
-              <w:left w:w="40" w:type="dxa"/>
-              <w:right w:w="40" w:type="dxa"/>
+              <w:top w:w="35" w:type="dxa"/>
+              <w:bottom w:w="35" w:type="dxa"/>
+              <w:left w:w="35" w:type="dxa"/>
+              <w:right w:w="35" w:type="dxa"/>
             </w:tcMar>
           </w:tcPr>
           <w:p>
@@ -3774,7 +3932,7 @@
         </w:tc>
         <w:tc>
           <w:tcPr>
-            <w:tcW w:type="dxa" w:w="1872"/>
+            <w:tcW w:type="dxa" w:w="1930"/>
             <w:tcBorders>
               <w:top w:val="single" w:sz="4" w:space="0" w:color="000000"/>
               <w:bottom w:val="single" w:sz="4" w:space="0" w:color="000000"/>
@@ -3782,10 +3940,10 @@
               <w:right w:val="single" w:sz="4" w:space="0" w:color="000000"/>
             </w:tcBorders>
             <w:tcMar>
-              <w:top w:w="40" w:type="dxa"/>
-              <w:bottom w:w="40" w:type="dxa"/>
-              <w:left w:w="40" w:type="dxa"/>
-              <w:right w:w="40" w:type="dxa"/>
+              <w:top w:w="35" w:type="dxa"/>
+              <w:bottom w:w="35" w:type="dxa"/>
+              <w:left w:w="35" w:type="dxa"/>
+              <w:right w:w="35" w:type="dxa"/>
             </w:tcMar>
           </w:tcPr>
           <w:p>
@@ -3803,7 +3961,7 @@
         </w:tc>
         <w:tc>
           <w:tcPr>
-            <w:tcW w:type="dxa" w:w="1872"/>
+            <w:tcW w:type="dxa" w:w="1930"/>
             <w:tcBorders>
               <w:top w:val="single" w:sz="4" w:space="0" w:color="000000"/>
               <w:bottom w:val="single" w:sz="4" w:space="0" w:color="000000"/>
@@ -3811,10 +3969,10 @@
               <w:right w:val="single" w:sz="4" w:space="0" w:color="000000"/>
             </w:tcBorders>
             <w:tcMar>
-              <w:top w:w="40" w:type="dxa"/>
-              <w:bottom w:w="40" w:type="dxa"/>
-              <w:left w:w="40" w:type="dxa"/>
-              <w:right w:w="40" w:type="dxa"/>
+              <w:top w:w="35" w:type="dxa"/>
+              <w:bottom w:w="35" w:type="dxa"/>
+              <w:left w:w="35" w:type="dxa"/>
+              <w:right w:w="35" w:type="dxa"/>
             </w:tcMar>
           </w:tcPr>
           <w:p>
@@ -3837,7 +3995,7 @@
       <w:tr>
         <w:tc>
           <w:tcPr>
-            <w:tcW w:type="dxa" w:w="1872"/>
+            <w:tcW w:type="dxa" w:w="1930"/>
             <w:tcBorders>
               <w:top w:val="single" w:sz="4" w:space="0" w:color="000000"/>
               <w:bottom w:val="single" w:sz="4" w:space="0" w:color="000000"/>
@@ -3845,10 +4003,10 @@
               <w:right w:val="single" w:sz="4" w:space="0" w:color="000000"/>
             </w:tcBorders>
             <w:tcMar>
-              <w:top w:w="40" w:type="dxa"/>
-              <w:bottom w:w="40" w:type="dxa"/>
-              <w:left w:w="40" w:type="dxa"/>
-              <w:right w:w="40" w:type="dxa"/>
+              <w:top w:w="35" w:type="dxa"/>
+              <w:bottom w:w="35" w:type="dxa"/>
+              <w:left w:w="35" w:type="dxa"/>
+              <w:right w:w="35" w:type="dxa"/>
             </w:tcMar>
           </w:tcPr>
           <w:p>
@@ -3869,7 +4027,7 @@
         </w:tc>
         <w:tc>
           <w:tcPr>
-            <w:tcW w:type="dxa" w:w="1872"/>
+            <w:tcW w:type="dxa" w:w="1930"/>
             <w:tcBorders>
               <w:top w:val="single" w:sz="4" w:space="0" w:color="000000"/>
               <w:bottom w:val="single" w:sz="4" w:space="0" w:color="000000"/>
@@ -3877,10 +4035,10 @@
               <w:right w:val="single" w:sz="4" w:space="0" w:color="000000"/>
             </w:tcBorders>
             <w:tcMar>
-              <w:top w:w="40" w:type="dxa"/>
-              <w:bottom w:w="40" w:type="dxa"/>
-              <w:left w:w="40" w:type="dxa"/>
-              <w:right w:w="40" w:type="dxa"/>
+              <w:top w:w="35" w:type="dxa"/>
+              <w:bottom w:w="35" w:type="dxa"/>
+              <w:left w:w="35" w:type="dxa"/>
+              <w:right w:w="35" w:type="dxa"/>
             </w:tcMar>
           </w:tcPr>
           <w:p>
@@ -3901,7 +4059,7 @@
         </w:tc>
         <w:tc>
           <w:tcPr>
-            <w:tcW w:type="dxa" w:w="1872"/>
+            <w:tcW w:type="dxa" w:w="1930"/>
             <w:tcBorders>
               <w:top w:val="single" w:sz="4" w:space="0" w:color="000000"/>
               <w:bottom w:val="single" w:sz="4" w:space="0" w:color="000000"/>
@@ -3909,10 +4067,10 @@
               <w:right w:val="single" w:sz="4" w:space="0" w:color="000000"/>
             </w:tcBorders>
             <w:tcMar>
-              <w:top w:w="40" w:type="dxa"/>
-              <w:bottom w:w="40" w:type="dxa"/>
-              <w:left w:w="40" w:type="dxa"/>
-              <w:right w:w="40" w:type="dxa"/>
+              <w:top w:w="35" w:type="dxa"/>
+              <w:bottom w:w="35" w:type="dxa"/>
+              <w:left w:w="35" w:type="dxa"/>
+              <w:right w:w="35" w:type="dxa"/>
             </w:tcMar>
           </w:tcPr>
           <w:p>
@@ -3930,7 +4088,7 @@
         </w:tc>
         <w:tc>
           <w:tcPr>
-            <w:tcW w:type="dxa" w:w="1872"/>
+            <w:tcW w:type="dxa" w:w="1930"/>
             <w:tcBorders>
               <w:top w:val="single" w:sz="4" w:space="0" w:color="000000"/>
               <w:bottom w:val="single" w:sz="4" w:space="0" w:color="000000"/>
@@ -3938,10 +4096,10 @@
               <w:right w:val="single" w:sz="4" w:space="0" w:color="000000"/>
             </w:tcBorders>
             <w:tcMar>
-              <w:top w:w="40" w:type="dxa"/>
-              <w:bottom w:w="40" w:type="dxa"/>
-              <w:left w:w="40" w:type="dxa"/>
-              <w:right w:w="40" w:type="dxa"/>
+              <w:top w:w="35" w:type="dxa"/>
+              <w:bottom w:w="35" w:type="dxa"/>
+              <w:left w:w="35" w:type="dxa"/>
+              <w:right w:w="35" w:type="dxa"/>
             </w:tcMar>
           </w:tcPr>
           <w:p>
@@ -3959,7 +4117,7 @@
         </w:tc>
         <w:tc>
           <w:tcPr>
-            <w:tcW w:type="dxa" w:w="1872"/>
+            <w:tcW w:type="dxa" w:w="1930"/>
             <w:tcBorders>
               <w:top w:val="single" w:sz="4" w:space="0" w:color="000000"/>
               <w:bottom w:val="single" w:sz="4" w:space="0" w:color="000000"/>
@@ -3967,10 +4125,10 @@
               <w:right w:val="single" w:sz="4" w:space="0" w:color="000000"/>
             </w:tcBorders>
             <w:tcMar>
-              <w:top w:w="40" w:type="dxa"/>
-              <w:bottom w:w="40" w:type="dxa"/>
-              <w:left w:w="40" w:type="dxa"/>
-              <w:right w:w="40" w:type="dxa"/>
+              <w:top w:w="35" w:type="dxa"/>
+              <w:bottom w:w="35" w:type="dxa"/>
+              <w:left w:w="35" w:type="dxa"/>
+              <w:right w:w="35" w:type="dxa"/>
             </w:tcMar>
           </w:tcPr>
           <w:p>
@@ -3993,7 +4151,7 @@
       <w:tr>
         <w:tc>
           <w:tcPr>
-            <w:tcW w:type="dxa" w:w="1872"/>
+            <w:tcW w:type="dxa" w:w="1930"/>
             <w:tcBorders>
               <w:top w:val="single" w:sz="4" w:space="0" w:color="000000"/>
               <w:bottom w:val="single" w:sz="4" w:space="0" w:color="000000"/>
@@ -4001,10 +4159,10 @@
               <w:right w:val="single" w:sz="4" w:space="0" w:color="000000"/>
             </w:tcBorders>
             <w:tcMar>
-              <w:top w:w="40" w:type="dxa"/>
-              <w:bottom w:w="40" w:type="dxa"/>
-              <w:left w:w="40" w:type="dxa"/>
-              <w:right w:w="40" w:type="dxa"/>
+              <w:top w:w="35" w:type="dxa"/>
+              <w:bottom w:w="35" w:type="dxa"/>
+              <w:left w:w="35" w:type="dxa"/>
+              <w:right w:w="35" w:type="dxa"/>
             </w:tcMar>
           </w:tcPr>
           <w:p>
@@ -4025,7 +4183,7 @@
         </w:tc>
         <w:tc>
           <w:tcPr>
-            <w:tcW w:type="dxa" w:w="1872"/>
+            <w:tcW w:type="dxa" w:w="1930"/>
             <w:tcBorders>
               <w:top w:val="single" w:sz="4" w:space="0" w:color="000000"/>
               <w:bottom w:val="single" w:sz="4" w:space="0" w:color="000000"/>
@@ -4033,10 +4191,10 @@
               <w:right w:val="single" w:sz="4" w:space="0" w:color="000000"/>
             </w:tcBorders>
             <w:tcMar>
-              <w:top w:w="40" w:type="dxa"/>
-              <w:bottom w:w="40" w:type="dxa"/>
-              <w:left w:w="40" w:type="dxa"/>
-              <w:right w:w="40" w:type="dxa"/>
+              <w:top w:w="35" w:type="dxa"/>
+              <w:bottom w:w="35" w:type="dxa"/>
+              <w:left w:w="35" w:type="dxa"/>
+              <w:right w:w="35" w:type="dxa"/>
             </w:tcMar>
           </w:tcPr>
           <w:p>
@@ -4057,7 +4215,7 @@
         </w:tc>
         <w:tc>
           <w:tcPr>
-            <w:tcW w:type="dxa" w:w="1872"/>
+            <w:tcW w:type="dxa" w:w="1930"/>
             <w:tcBorders>
               <w:top w:val="single" w:sz="4" w:space="0" w:color="000000"/>
               <w:bottom w:val="single" w:sz="4" w:space="0" w:color="000000"/>
@@ -4065,10 +4223,10 @@
               <w:right w:val="single" w:sz="4" w:space="0" w:color="000000"/>
             </w:tcBorders>
             <w:tcMar>
-              <w:top w:w="40" w:type="dxa"/>
-              <w:bottom w:w="40" w:type="dxa"/>
-              <w:left w:w="40" w:type="dxa"/>
-              <w:right w:w="40" w:type="dxa"/>
+              <w:top w:w="35" w:type="dxa"/>
+              <w:bottom w:w="35" w:type="dxa"/>
+              <w:left w:w="35" w:type="dxa"/>
+              <w:right w:w="35" w:type="dxa"/>
             </w:tcMar>
           </w:tcPr>
           <w:p>
@@ -4086,7 +4244,7 @@
         </w:tc>
         <w:tc>
           <w:tcPr>
-            <w:tcW w:type="dxa" w:w="1872"/>
+            <w:tcW w:type="dxa" w:w="1930"/>
             <w:tcBorders>
               <w:top w:val="single" w:sz="4" w:space="0" w:color="000000"/>
               <w:bottom w:val="single" w:sz="4" w:space="0" w:color="000000"/>
@@ -4094,10 +4252,10 @@
               <w:right w:val="single" w:sz="4" w:space="0" w:color="000000"/>
             </w:tcBorders>
             <w:tcMar>
-              <w:top w:w="40" w:type="dxa"/>
-              <w:bottom w:w="40" w:type="dxa"/>
-              <w:left w:w="40" w:type="dxa"/>
-              <w:right w:w="40" w:type="dxa"/>
+              <w:top w:w="35" w:type="dxa"/>
+              <w:bottom w:w="35" w:type="dxa"/>
+              <w:left w:w="35" w:type="dxa"/>
+              <w:right w:w="35" w:type="dxa"/>
             </w:tcMar>
           </w:tcPr>
           <w:p>
@@ -4115,7 +4273,7 @@
         </w:tc>
         <w:tc>
           <w:tcPr>
-            <w:tcW w:type="dxa" w:w="1872"/>
+            <w:tcW w:type="dxa" w:w="1930"/>
             <w:tcBorders>
               <w:top w:val="single" w:sz="4" w:space="0" w:color="000000"/>
               <w:bottom w:val="single" w:sz="4" w:space="0" w:color="000000"/>
@@ -4123,10 +4281,10 @@
               <w:right w:val="single" w:sz="4" w:space="0" w:color="000000"/>
             </w:tcBorders>
             <w:tcMar>
-              <w:top w:w="40" w:type="dxa"/>
-              <w:bottom w:w="40" w:type="dxa"/>
-              <w:left w:w="40" w:type="dxa"/>
-              <w:right w:w="40" w:type="dxa"/>
+              <w:top w:w="35" w:type="dxa"/>
+              <w:bottom w:w="35" w:type="dxa"/>
+              <w:left w:w="35" w:type="dxa"/>
+              <w:right w:w="35" w:type="dxa"/>
             </w:tcMar>
           </w:tcPr>
           <w:p>
@@ -4149,7 +4307,7 @@
       <w:tr>
         <w:tc>
           <w:tcPr>
-            <w:tcW w:type="dxa" w:w="1872"/>
+            <w:tcW w:type="dxa" w:w="1930"/>
             <w:tcBorders>
               <w:top w:val="single" w:sz="4" w:space="0" w:color="000000"/>
               <w:bottom w:val="single" w:sz="4" w:space="0" w:color="000000"/>
@@ -4157,10 +4315,10 @@
               <w:right w:val="single" w:sz="4" w:space="0" w:color="000000"/>
             </w:tcBorders>
             <w:tcMar>
-              <w:top w:w="40" w:type="dxa"/>
-              <w:bottom w:w="40" w:type="dxa"/>
-              <w:left w:w="40" w:type="dxa"/>
-              <w:right w:w="40" w:type="dxa"/>
+              <w:top w:w="35" w:type="dxa"/>
+              <w:bottom w:w="35" w:type="dxa"/>
+              <w:left w:w="35" w:type="dxa"/>
+              <w:right w:w="35" w:type="dxa"/>
             </w:tcMar>
           </w:tcPr>
           <w:p>
@@ -4181,7 +4339,7 @@
         </w:tc>
         <w:tc>
           <w:tcPr>
-            <w:tcW w:type="dxa" w:w="1872"/>
+            <w:tcW w:type="dxa" w:w="1930"/>
             <w:tcBorders>
               <w:top w:val="single" w:sz="4" w:space="0" w:color="000000"/>
               <w:bottom w:val="single" w:sz="4" w:space="0" w:color="000000"/>
@@ -4189,10 +4347,10 @@
               <w:right w:val="single" w:sz="4" w:space="0" w:color="000000"/>
             </w:tcBorders>
             <w:tcMar>
-              <w:top w:w="40" w:type="dxa"/>
-              <w:bottom w:w="40" w:type="dxa"/>
-              <w:left w:w="40" w:type="dxa"/>
-              <w:right w:w="40" w:type="dxa"/>
+              <w:top w:w="35" w:type="dxa"/>
+              <w:bottom w:w="35" w:type="dxa"/>
+              <w:left w:w="35" w:type="dxa"/>
+              <w:right w:w="35" w:type="dxa"/>
             </w:tcMar>
           </w:tcPr>
           <w:p>
@@ -4213,7 +4371,7 @@
         </w:tc>
         <w:tc>
           <w:tcPr>
-            <w:tcW w:type="dxa" w:w="1872"/>
+            <w:tcW w:type="dxa" w:w="1930"/>
             <w:tcBorders>
               <w:top w:val="single" w:sz="4" w:space="0" w:color="000000"/>
               <w:bottom w:val="single" w:sz="4" w:space="0" w:color="000000"/>
@@ -4221,10 +4379,10 @@
               <w:right w:val="single" w:sz="4" w:space="0" w:color="000000"/>
             </w:tcBorders>
             <w:tcMar>
-              <w:top w:w="40" w:type="dxa"/>
-              <w:bottom w:w="40" w:type="dxa"/>
-              <w:left w:w="40" w:type="dxa"/>
-              <w:right w:w="40" w:type="dxa"/>
+              <w:top w:w="35" w:type="dxa"/>
+              <w:bottom w:w="35" w:type="dxa"/>
+              <w:left w:w="35" w:type="dxa"/>
+              <w:right w:w="35" w:type="dxa"/>
             </w:tcMar>
           </w:tcPr>
           <w:p>
@@ -4242,7 +4400,7 @@
         </w:tc>
         <w:tc>
           <w:tcPr>
-            <w:tcW w:type="dxa" w:w="1872"/>
+            <w:tcW w:type="dxa" w:w="1930"/>
             <w:tcBorders>
               <w:top w:val="single" w:sz="4" w:space="0" w:color="000000"/>
               <w:bottom w:val="single" w:sz="4" w:space="0" w:color="000000"/>
@@ -4250,10 +4408,10 @@
               <w:right w:val="single" w:sz="4" w:space="0" w:color="000000"/>
             </w:tcBorders>
             <w:tcMar>
-              <w:top w:w="40" w:type="dxa"/>
-              <w:bottom w:w="40" w:type="dxa"/>
-              <w:left w:w="40" w:type="dxa"/>
-              <w:right w:w="40" w:type="dxa"/>
+              <w:top w:w="35" w:type="dxa"/>
+              <w:bottom w:w="35" w:type="dxa"/>
+              <w:left w:w="35" w:type="dxa"/>
+              <w:right w:w="35" w:type="dxa"/>
             </w:tcMar>
           </w:tcPr>
           <w:p>
@@ -4271,7 +4429,7 @@
         </w:tc>
         <w:tc>
           <w:tcPr>
-            <w:tcW w:type="dxa" w:w="1872"/>
+            <w:tcW w:type="dxa" w:w="1930"/>
             <w:tcBorders>
               <w:top w:val="single" w:sz="4" w:space="0" w:color="000000"/>
               <w:bottom w:val="single" w:sz="4" w:space="0" w:color="000000"/>
@@ -4279,10 +4437,10 @@
               <w:right w:val="single" w:sz="4" w:space="0" w:color="000000"/>
             </w:tcBorders>
             <w:tcMar>
-              <w:top w:w="40" w:type="dxa"/>
-              <w:bottom w:w="40" w:type="dxa"/>
-              <w:left w:w="40" w:type="dxa"/>
-              <w:right w:w="40" w:type="dxa"/>
+              <w:top w:w="35" w:type="dxa"/>
+              <w:bottom w:w="35" w:type="dxa"/>
+              <w:left w:w="35" w:type="dxa"/>
+              <w:right w:w="35" w:type="dxa"/>
             </w:tcMar>
           </w:tcPr>
           <w:p>
@@ -4305,7 +4463,7 @@
       <w:tr>
         <w:tc>
           <w:tcPr>
-            <w:tcW w:type="dxa" w:w="1872"/>
+            <w:tcW w:type="dxa" w:w="1930"/>
             <w:tcBorders>
               <w:top w:val="single" w:sz="4" w:space="0" w:color="000000"/>
               <w:bottom w:val="single" w:sz="4" w:space="0" w:color="000000"/>
@@ -4313,10 +4471,10 @@
               <w:right w:val="single" w:sz="4" w:space="0" w:color="000000"/>
             </w:tcBorders>
             <w:tcMar>
-              <w:top w:w="40" w:type="dxa"/>
-              <w:bottom w:w="40" w:type="dxa"/>
-              <w:left w:w="40" w:type="dxa"/>
-              <w:right w:w="40" w:type="dxa"/>
+              <w:top w:w="35" w:type="dxa"/>
+              <w:bottom w:w="35" w:type="dxa"/>
+              <w:left w:w="35" w:type="dxa"/>
+              <w:right w:w="35" w:type="dxa"/>
             </w:tcMar>
           </w:tcPr>
           <w:p>
@@ -4337,7 +4495,7 @@
         </w:tc>
         <w:tc>
           <w:tcPr>
-            <w:tcW w:type="dxa" w:w="1872"/>
+            <w:tcW w:type="dxa" w:w="1930"/>
             <w:tcBorders>
               <w:top w:val="single" w:sz="4" w:space="0" w:color="000000"/>
               <w:bottom w:val="single" w:sz="4" w:space="0" w:color="000000"/>
@@ -4345,10 +4503,10 @@
               <w:right w:val="single" w:sz="4" w:space="0" w:color="000000"/>
             </w:tcBorders>
             <w:tcMar>
-              <w:top w:w="40" w:type="dxa"/>
-              <w:bottom w:w="40" w:type="dxa"/>
-              <w:left w:w="40" w:type="dxa"/>
-              <w:right w:w="40" w:type="dxa"/>
+              <w:top w:w="35" w:type="dxa"/>
+              <w:bottom w:w="35" w:type="dxa"/>
+              <w:left w:w="35" w:type="dxa"/>
+              <w:right w:w="35" w:type="dxa"/>
             </w:tcMar>
           </w:tcPr>
           <w:p>
@@ -4369,7 +4527,7 @@
         </w:tc>
         <w:tc>
           <w:tcPr>
-            <w:tcW w:type="dxa" w:w="1872"/>
+            <w:tcW w:type="dxa" w:w="1930"/>
             <w:tcBorders>
               <w:top w:val="single" w:sz="4" w:space="0" w:color="000000"/>
               <w:bottom w:val="single" w:sz="4" w:space="0" w:color="000000"/>
@@ -4377,10 +4535,10 @@
               <w:right w:val="single" w:sz="4" w:space="0" w:color="000000"/>
             </w:tcBorders>
             <w:tcMar>
-              <w:top w:w="40" w:type="dxa"/>
-              <w:bottom w:w="40" w:type="dxa"/>
-              <w:left w:w="40" w:type="dxa"/>
-              <w:right w:w="40" w:type="dxa"/>
+              <w:top w:w="35" w:type="dxa"/>
+              <w:bottom w:w="35" w:type="dxa"/>
+              <w:left w:w="35" w:type="dxa"/>
+              <w:right w:w="35" w:type="dxa"/>
             </w:tcMar>
           </w:tcPr>
           <w:p>
@@ -4398,7 +4556,7 @@
         </w:tc>
         <w:tc>
           <w:tcPr>
-            <w:tcW w:type="dxa" w:w="1872"/>
+            <w:tcW w:type="dxa" w:w="1930"/>
             <w:tcBorders>
               <w:top w:val="single" w:sz="4" w:space="0" w:color="000000"/>
               <w:bottom w:val="single" w:sz="4" w:space="0" w:color="000000"/>
@@ -4406,10 +4564,10 @@
               <w:right w:val="single" w:sz="4" w:space="0" w:color="000000"/>
             </w:tcBorders>
             <w:tcMar>
-              <w:top w:w="40" w:type="dxa"/>
-              <w:bottom w:w="40" w:type="dxa"/>
-              <w:left w:w="40" w:type="dxa"/>
-              <w:right w:w="40" w:type="dxa"/>
+              <w:top w:w="35" w:type="dxa"/>
+              <w:bottom w:w="35" w:type="dxa"/>
+              <w:left w:w="35" w:type="dxa"/>
+              <w:right w:w="35" w:type="dxa"/>
             </w:tcMar>
           </w:tcPr>
           <w:p>
@@ -4427,7 +4585,7 @@
         </w:tc>
         <w:tc>
           <w:tcPr>
-            <w:tcW w:type="dxa" w:w="1872"/>
+            <w:tcW w:type="dxa" w:w="1930"/>
             <w:tcBorders>
               <w:top w:val="single" w:sz="4" w:space="0" w:color="000000"/>
               <w:bottom w:val="single" w:sz="4" w:space="0" w:color="000000"/>
@@ -4435,10 +4593,10 @@
               <w:right w:val="single" w:sz="4" w:space="0" w:color="000000"/>
             </w:tcBorders>
             <w:tcMar>
-              <w:top w:w="40" w:type="dxa"/>
-              <w:bottom w:w="40" w:type="dxa"/>
-              <w:left w:w="40" w:type="dxa"/>
-              <w:right w:w="40" w:type="dxa"/>
+              <w:top w:w="35" w:type="dxa"/>
+              <w:bottom w:w="35" w:type="dxa"/>
+              <w:left w:w="35" w:type="dxa"/>
+              <w:right w:w="35" w:type="dxa"/>
             </w:tcMar>
           </w:tcPr>
           <w:p>
@@ -4461,7 +4619,7 @@
       <w:tr>
         <w:tc>
           <w:tcPr>
-            <w:tcW w:type="dxa" w:w="1872"/>
+            <w:tcW w:type="dxa" w:w="1930"/>
             <w:tcBorders>
               <w:top w:val="single" w:sz="4" w:space="0" w:color="000000"/>
               <w:bottom w:val="single" w:sz="4" w:space="0" w:color="000000"/>
@@ -4469,10 +4627,10 @@
               <w:right w:val="single" w:sz="4" w:space="0" w:color="000000"/>
             </w:tcBorders>
             <w:tcMar>
-              <w:top w:w="40" w:type="dxa"/>
-              <w:bottom w:w="40" w:type="dxa"/>
-              <w:left w:w="40" w:type="dxa"/>
-              <w:right w:w="40" w:type="dxa"/>
+              <w:top w:w="35" w:type="dxa"/>
+              <w:bottom w:w="35" w:type="dxa"/>
+              <w:left w:w="35" w:type="dxa"/>
+              <w:right w:w="35" w:type="dxa"/>
             </w:tcMar>
           </w:tcPr>
           <w:p>
@@ -4493,7 +4651,7 @@
         </w:tc>
         <w:tc>
           <w:tcPr>
-            <w:tcW w:type="dxa" w:w="1872"/>
+            <w:tcW w:type="dxa" w:w="1930"/>
             <w:tcBorders>
               <w:top w:val="single" w:sz="4" w:space="0" w:color="000000"/>
               <w:bottom w:val="single" w:sz="4" w:space="0" w:color="000000"/>
@@ -4501,10 +4659,10 @@
               <w:right w:val="single" w:sz="4" w:space="0" w:color="000000"/>
             </w:tcBorders>
             <w:tcMar>
-              <w:top w:w="40" w:type="dxa"/>
-              <w:bottom w:w="40" w:type="dxa"/>
-              <w:left w:w="40" w:type="dxa"/>
-              <w:right w:w="40" w:type="dxa"/>
+              <w:top w:w="35" w:type="dxa"/>
+              <w:bottom w:w="35" w:type="dxa"/>
+              <w:left w:w="35" w:type="dxa"/>
+              <w:right w:w="35" w:type="dxa"/>
             </w:tcMar>
           </w:tcPr>
           <w:p>
@@ -4525,7 +4683,7 @@
         </w:tc>
         <w:tc>
           <w:tcPr>
-            <w:tcW w:type="dxa" w:w="1872"/>
+            <w:tcW w:type="dxa" w:w="1930"/>
             <w:tcBorders>
               <w:top w:val="single" w:sz="4" w:space="0" w:color="000000"/>
               <w:bottom w:val="single" w:sz="4" w:space="0" w:color="000000"/>
@@ -4533,10 +4691,10 @@
               <w:right w:val="single" w:sz="4" w:space="0" w:color="000000"/>
             </w:tcBorders>
             <w:tcMar>
-              <w:top w:w="40" w:type="dxa"/>
-              <w:bottom w:w="40" w:type="dxa"/>
-              <w:left w:w="40" w:type="dxa"/>
-              <w:right w:w="40" w:type="dxa"/>
+              <w:top w:w="35" w:type="dxa"/>
+              <w:bottom w:w="35" w:type="dxa"/>
+              <w:left w:w="35" w:type="dxa"/>
+              <w:right w:w="35" w:type="dxa"/>
             </w:tcMar>
           </w:tcPr>
           <w:p>
@@ -4554,7 +4712,7 @@
         </w:tc>
         <w:tc>
           <w:tcPr>
-            <w:tcW w:type="dxa" w:w="1872"/>
+            <w:tcW w:type="dxa" w:w="1930"/>
             <w:tcBorders>
               <w:top w:val="single" w:sz="4" w:space="0" w:color="000000"/>
               <w:bottom w:val="single" w:sz="4" w:space="0" w:color="000000"/>
@@ -4562,10 +4720,10 @@
               <w:right w:val="single" w:sz="4" w:space="0" w:color="000000"/>
             </w:tcBorders>
             <w:tcMar>
-              <w:top w:w="40" w:type="dxa"/>
-              <w:bottom w:w="40" w:type="dxa"/>
-              <w:left w:w="40" w:type="dxa"/>
-              <w:right w:w="40" w:type="dxa"/>
+              <w:top w:w="35" w:type="dxa"/>
+              <w:bottom w:w="35" w:type="dxa"/>
+              <w:left w:w="35" w:type="dxa"/>
+              <w:right w:w="35" w:type="dxa"/>
             </w:tcMar>
           </w:tcPr>
           <w:p>
@@ -4583,7 +4741,7 @@
         </w:tc>
         <w:tc>
           <w:tcPr>
-            <w:tcW w:type="dxa" w:w="1872"/>
+            <w:tcW w:type="dxa" w:w="1930"/>
             <w:tcBorders>
               <w:top w:val="single" w:sz="4" w:space="0" w:color="000000"/>
               <w:bottom w:val="single" w:sz="4" w:space="0" w:color="000000"/>
@@ -4591,10 +4749,10 @@
               <w:right w:val="single" w:sz="4" w:space="0" w:color="000000"/>
             </w:tcBorders>
             <w:tcMar>
-              <w:top w:w="40" w:type="dxa"/>
-              <w:bottom w:w="40" w:type="dxa"/>
-              <w:left w:w="40" w:type="dxa"/>
-              <w:right w:w="40" w:type="dxa"/>
+              <w:top w:w="35" w:type="dxa"/>
+              <w:bottom w:w="35" w:type="dxa"/>
+              <w:left w:w="35" w:type="dxa"/>
+              <w:right w:w="35" w:type="dxa"/>
             </w:tcMar>
           </w:tcPr>
           <w:p>
@@ -4617,7 +4775,7 @@
       <w:tr>
         <w:tc>
           <w:tcPr>
-            <w:tcW w:type="dxa" w:w="1872"/>
+            <w:tcW w:type="dxa" w:w="1930"/>
             <w:tcBorders>
               <w:top w:val="single" w:sz="4" w:space="0" w:color="000000"/>
               <w:bottom w:val="single" w:sz="4" w:space="0" w:color="000000"/>
@@ -4625,10 +4783,10 @@
               <w:right w:val="single" w:sz="4" w:space="0" w:color="000000"/>
             </w:tcBorders>
             <w:tcMar>
-              <w:top w:w="40" w:type="dxa"/>
-              <w:bottom w:w="40" w:type="dxa"/>
-              <w:left w:w="40" w:type="dxa"/>
-              <w:right w:w="40" w:type="dxa"/>
+              <w:top w:w="35" w:type="dxa"/>
+              <w:bottom w:w="35" w:type="dxa"/>
+              <w:left w:w="35" w:type="dxa"/>
+              <w:right w:w="35" w:type="dxa"/>
             </w:tcMar>
           </w:tcPr>
           <w:p>
@@ -4649,7 +4807,7 @@
         </w:tc>
         <w:tc>
           <w:tcPr>
-            <w:tcW w:type="dxa" w:w="1872"/>
+            <w:tcW w:type="dxa" w:w="1930"/>
             <w:tcBorders>
               <w:top w:val="single" w:sz="4" w:space="0" w:color="000000"/>
               <w:bottom w:val="single" w:sz="4" w:space="0" w:color="000000"/>
@@ -4657,10 +4815,10 @@
               <w:right w:val="single" w:sz="4" w:space="0" w:color="000000"/>
             </w:tcBorders>
             <w:tcMar>
-              <w:top w:w="40" w:type="dxa"/>
-              <w:bottom w:w="40" w:type="dxa"/>
-              <w:left w:w="40" w:type="dxa"/>
-              <w:right w:w="40" w:type="dxa"/>
+              <w:top w:w="35" w:type="dxa"/>
+              <w:bottom w:w="35" w:type="dxa"/>
+              <w:left w:w="35" w:type="dxa"/>
+              <w:right w:w="35" w:type="dxa"/>
             </w:tcMar>
           </w:tcPr>
           <w:p>
@@ -4681,7 +4839,7 @@
         </w:tc>
         <w:tc>
           <w:tcPr>
-            <w:tcW w:type="dxa" w:w="1872"/>
+            <w:tcW w:type="dxa" w:w="1930"/>
             <w:tcBorders>
               <w:top w:val="single" w:sz="4" w:space="0" w:color="000000"/>
               <w:bottom w:val="single" w:sz="4" w:space="0" w:color="000000"/>
@@ -4689,10 +4847,10 @@
               <w:right w:val="single" w:sz="4" w:space="0" w:color="000000"/>
             </w:tcBorders>
             <w:tcMar>
-              <w:top w:w="40" w:type="dxa"/>
-              <w:bottom w:w="40" w:type="dxa"/>
-              <w:left w:w="40" w:type="dxa"/>
-              <w:right w:w="40" w:type="dxa"/>
+              <w:top w:w="35" w:type="dxa"/>
+              <w:bottom w:w="35" w:type="dxa"/>
+              <w:left w:w="35" w:type="dxa"/>
+              <w:right w:w="35" w:type="dxa"/>
             </w:tcMar>
           </w:tcPr>
           <w:p>
@@ -4710,7 +4868,7 @@
         </w:tc>
         <w:tc>
           <w:tcPr>
-            <w:tcW w:type="dxa" w:w="1872"/>
+            <w:tcW w:type="dxa" w:w="1930"/>
             <w:tcBorders>
               <w:top w:val="single" w:sz="4" w:space="0" w:color="000000"/>
               <w:bottom w:val="single" w:sz="4" w:space="0" w:color="000000"/>
@@ -4718,10 +4876,10 @@
               <w:right w:val="single" w:sz="4" w:space="0" w:color="000000"/>
             </w:tcBorders>
             <w:tcMar>
-              <w:top w:w="40" w:type="dxa"/>
-              <w:bottom w:w="40" w:type="dxa"/>
-              <w:left w:w="40" w:type="dxa"/>
-              <w:right w:w="40" w:type="dxa"/>
+              <w:top w:w="35" w:type="dxa"/>
+              <w:bottom w:w="35" w:type="dxa"/>
+              <w:left w:w="35" w:type="dxa"/>
+              <w:right w:w="35" w:type="dxa"/>
             </w:tcMar>
           </w:tcPr>
           <w:p>
@@ -4739,7 +4897,7 @@
         </w:tc>
         <w:tc>
           <w:tcPr>
-            <w:tcW w:type="dxa" w:w="1872"/>
+            <w:tcW w:type="dxa" w:w="1930"/>
             <w:tcBorders>
               <w:top w:val="single" w:sz="4" w:space="0" w:color="000000"/>
               <w:bottom w:val="single" w:sz="4" w:space="0" w:color="000000"/>
@@ -4747,10 +4905,10 @@
               <w:right w:val="single" w:sz="4" w:space="0" w:color="000000"/>
             </w:tcBorders>
             <w:tcMar>
-              <w:top w:w="40" w:type="dxa"/>
-              <w:bottom w:w="40" w:type="dxa"/>
-              <w:left w:w="40" w:type="dxa"/>
-              <w:right w:w="40" w:type="dxa"/>
+              <w:top w:w="35" w:type="dxa"/>
+              <w:bottom w:w="35" w:type="dxa"/>
+              <w:left w:w="35" w:type="dxa"/>
+              <w:right w:w="35" w:type="dxa"/>
             </w:tcMar>
           </w:tcPr>
           <w:p>
@@ -4773,7 +4931,7 @@
       <w:tr>
         <w:tc>
           <w:tcPr>
-            <w:tcW w:type="dxa" w:w="1872"/>
+            <w:tcW w:type="dxa" w:w="1930"/>
             <w:tcBorders>
               <w:top w:val="single" w:sz="4" w:space="0" w:color="000000"/>
               <w:bottom w:val="single" w:sz="4" w:space="0" w:color="000000"/>
@@ -4781,10 +4939,10 @@
               <w:right w:val="single" w:sz="4" w:space="0" w:color="000000"/>
             </w:tcBorders>
             <w:tcMar>
-              <w:top w:w="40" w:type="dxa"/>
-              <w:bottom w:w="40" w:type="dxa"/>
-              <w:left w:w="40" w:type="dxa"/>
-              <w:right w:w="40" w:type="dxa"/>
+              <w:top w:w="35" w:type="dxa"/>
+              <w:bottom w:w="35" w:type="dxa"/>
+              <w:left w:w="35" w:type="dxa"/>
+              <w:right w:w="35" w:type="dxa"/>
             </w:tcMar>
           </w:tcPr>
           <w:p>
@@ -4805,7 +4963,7 @@
         </w:tc>
         <w:tc>
           <w:tcPr>
-            <w:tcW w:type="dxa" w:w="1872"/>
+            <w:tcW w:type="dxa" w:w="1930"/>
             <w:tcBorders>
               <w:top w:val="single" w:sz="4" w:space="0" w:color="000000"/>
               <w:bottom w:val="single" w:sz="4" w:space="0" w:color="000000"/>
@@ -4813,10 +4971,10 @@
               <w:right w:val="single" w:sz="4" w:space="0" w:color="000000"/>
             </w:tcBorders>
             <w:tcMar>
-              <w:top w:w="40" w:type="dxa"/>
-              <w:bottom w:w="40" w:type="dxa"/>
-              <w:left w:w="40" w:type="dxa"/>
-              <w:right w:w="40" w:type="dxa"/>
+              <w:top w:w="35" w:type="dxa"/>
+              <w:bottom w:w="35" w:type="dxa"/>
+              <w:left w:w="35" w:type="dxa"/>
+              <w:right w:w="35" w:type="dxa"/>
             </w:tcMar>
           </w:tcPr>
           <w:p>
@@ -4837,7 +4995,7 @@
         </w:tc>
         <w:tc>
           <w:tcPr>
-            <w:tcW w:type="dxa" w:w="1872"/>
+            <w:tcW w:type="dxa" w:w="1930"/>
             <w:tcBorders>
               <w:top w:val="single" w:sz="4" w:space="0" w:color="000000"/>
               <w:bottom w:val="single" w:sz="4" w:space="0" w:color="000000"/>
@@ -4845,10 +5003,10 @@
               <w:right w:val="single" w:sz="4" w:space="0" w:color="000000"/>
             </w:tcBorders>
             <w:tcMar>
-              <w:top w:w="40" w:type="dxa"/>
-              <w:bottom w:w="40" w:type="dxa"/>
-              <w:left w:w="40" w:type="dxa"/>
-              <w:right w:w="40" w:type="dxa"/>
+              <w:top w:w="35" w:type="dxa"/>
+              <w:bottom w:w="35" w:type="dxa"/>
+              <w:left w:w="35" w:type="dxa"/>
+              <w:right w:w="35" w:type="dxa"/>
             </w:tcMar>
           </w:tcPr>
           <w:p>
@@ -4866,7 +5024,7 @@
         </w:tc>
         <w:tc>
           <w:tcPr>
-            <w:tcW w:type="dxa" w:w="1872"/>
+            <w:tcW w:type="dxa" w:w="1930"/>
             <w:tcBorders>
               <w:top w:val="single" w:sz="4" w:space="0" w:color="000000"/>
               <w:bottom w:val="single" w:sz="4" w:space="0" w:color="000000"/>
@@ -4874,10 +5032,10 @@
               <w:right w:val="single" w:sz="4" w:space="0" w:color="000000"/>
             </w:tcBorders>
             <w:tcMar>
-              <w:top w:w="40" w:type="dxa"/>
-              <w:bottom w:w="40" w:type="dxa"/>
-              <w:left w:w="40" w:type="dxa"/>
-              <w:right w:w="40" w:type="dxa"/>
+              <w:top w:w="35" w:type="dxa"/>
+              <w:bottom w:w="35" w:type="dxa"/>
+              <w:left w:w="35" w:type="dxa"/>
+              <w:right w:w="35" w:type="dxa"/>
             </w:tcMar>
           </w:tcPr>
           <w:p>
@@ -4895,7 +5053,7 @@
         </w:tc>
         <w:tc>
           <w:tcPr>
-            <w:tcW w:type="dxa" w:w="1872"/>
+            <w:tcW w:type="dxa" w:w="1930"/>
             <w:tcBorders>
               <w:top w:val="single" w:sz="4" w:space="0" w:color="000000"/>
               <w:bottom w:val="single" w:sz="4" w:space="0" w:color="000000"/>
@@ -4903,10 +5061,10 @@
               <w:right w:val="single" w:sz="4" w:space="0" w:color="000000"/>
             </w:tcBorders>
             <w:tcMar>
-              <w:top w:w="40" w:type="dxa"/>
-              <w:bottom w:w="40" w:type="dxa"/>
-              <w:left w:w="40" w:type="dxa"/>
-              <w:right w:w="40" w:type="dxa"/>
+              <w:top w:w="35" w:type="dxa"/>
+              <w:bottom w:w="35" w:type="dxa"/>
+              <w:left w:w="35" w:type="dxa"/>
+              <w:right w:w="35" w:type="dxa"/>
             </w:tcMar>
           </w:tcPr>
           <w:p>
@@ -4929,7 +5087,7 @@
       <w:tr>
         <w:tc>
           <w:tcPr>
-            <w:tcW w:type="dxa" w:w="1872"/>
+            <w:tcW w:type="dxa" w:w="1930"/>
             <w:tcBorders>
               <w:top w:val="single" w:sz="4" w:space="0" w:color="000000"/>
               <w:bottom w:val="single" w:sz="4" w:space="0" w:color="000000"/>
@@ -4937,10 +5095,10 @@
               <w:right w:val="single" w:sz="4" w:space="0" w:color="000000"/>
             </w:tcBorders>
             <w:tcMar>
-              <w:top w:w="40" w:type="dxa"/>
-              <w:bottom w:w="40" w:type="dxa"/>
-              <w:left w:w="40" w:type="dxa"/>
-              <w:right w:w="40" w:type="dxa"/>
+              <w:top w:w="35" w:type="dxa"/>
+              <w:bottom w:w="35" w:type="dxa"/>
+              <w:left w:w="35" w:type="dxa"/>
+              <w:right w:w="35" w:type="dxa"/>
             </w:tcMar>
           </w:tcPr>
           <w:p>
@@ -4961,7 +5119,7 @@
         </w:tc>
         <w:tc>
           <w:tcPr>
-            <w:tcW w:type="dxa" w:w="1872"/>
+            <w:tcW w:type="dxa" w:w="1930"/>
             <w:tcBorders>
               <w:top w:val="single" w:sz="4" w:space="0" w:color="000000"/>
               <w:bottom w:val="single" w:sz="4" w:space="0" w:color="000000"/>
@@ -4969,10 +5127,10 @@
               <w:right w:val="single" w:sz="4" w:space="0" w:color="000000"/>
             </w:tcBorders>
             <w:tcMar>
-              <w:top w:w="40" w:type="dxa"/>
-              <w:bottom w:w="40" w:type="dxa"/>
-              <w:left w:w="40" w:type="dxa"/>
-              <w:right w:w="40" w:type="dxa"/>
+              <w:top w:w="35" w:type="dxa"/>
+              <w:bottom w:w="35" w:type="dxa"/>
+              <w:left w:w="35" w:type="dxa"/>
+              <w:right w:w="35" w:type="dxa"/>
             </w:tcMar>
           </w:tcPr>
           <w:p>
@@ -4993,7 +5151,7 @@
         </w:tc>
         <w:tc>
           <w:tcPr>
-            <w:tcW w:type="dxa" w:w="1872"/>
+            <w:tcW w:type="dxa" w:w="1930"/>
             <w:tcBorders>
               <w:top w:val="single" w:sz="4" w:space="0" w:color="000000"/>
               <w:bottom w:val="single" w:sz="4" w:space="0" w:color="000000"/>
@@ -5001,10 +5159,10 @@
               <w:right w:val="single" w:sz="4" w:space="0" w:color="000000"/>
             </w:tcBorders>
             <w:tcMar>
-              <w:top w:w="40" w:type="dxa"/>
-              <w:bottom w:w="40" w:type="dxa"/>
-              <w:left w:w="40" w:type="dxa"/>
-              <w:right w:w="40" w:type="dxa"/>
+              <w:top w:w="35" w:type="dxa"/>
+              <w:bottom w:w="35" w:type="dxa"/>
+              <w:left w:w="35" w:type="dxa"/>
+              <w:right w:w="35" w:type="dxa"/>
             </w:tcMar>
           </w:tcPr>
           <w:p>
@@ -5022,7 +5180,7 @@
         </w:tc>
         <w:tc>
           <w:tcPr>
-            <w:tcW w:type="dxa" w:w="1872"/>
+            <w:tcW w:type="dxa" w:w="1930"/>
             <w:tcBorders>
               <w:top w:val="single" w:sz="4" w:space="0" w:color="000000"/>
               <w:bottom w:val="single" w:sz="4" w:space="0" w:color="000000"/>
@@ -5030,10 +5188,10 @@
               <w:right w:val="single" w:sz="4" w:space="0" w:color="000000"/>
             </w:tcBorders>
             <w:tcMar>
-              <w:top w:w="40" w:type="dxa"/>
-              <w:bottom w:w="40" w:type="dxa"/>
-              <w:left w:w="40" w:type="dxa"/>
-              <w:right w:w="40" w:type="dxa"/>
+              <w:top w:w="35" w:type="dxa"/>
+              <w:bottom w:w="35" w:type="dxa"/>
+              <w:left w:w="35" w:type="dxa"/>
+              <w:right w:w="35" w:type="dxa"/>
             </w:tcMar>
           </w:tcPr>
           <w:p>
@@ -5051,7 +5209,7 @@
         </w:tc>
         <w:tc>
           <w:tcPr>
-            <w:tcW w:type="dxa" w:w="1872"/>
+            <w:tcW w:type="dxa" w:w="1930"/>
             <w:tcBorders>
               <w:top w:val="single" w:sz="4" w:space="0" w:color="000000"/>
               <w:bottom w:val="single" w:sz="4" w:space="0" w:color="000000"/>
@@ -5059,10 +5217,10 @@
               <w:right w:val="single" w:sz="4" w:space="0" w:color="000000"/>
             </w:tcBorders>
             <w:tcMar>
-              <w:top w:w="40" w:type="dxa"/>
-              <w:bottom w:w="40" w:type="dxa"/>
-              <w:left w:w="40" w:type="dxa"/>
-              <w:right w:w="40" w:type="dxa"/>
+              <w:top w:w="35" w:type="dxa"/>
+              <w:bottom w:w="35" w:type="dxa"/>
+              <w:left w:w="35" w:type="dxa"/>
+              <w:right w:w="35" w:type="dxa"/>
             </w:tcMar>
           </w:tcPr>
           <w:p>
@@ -5111,16 +5269,16 @@
         <w:tblLook w:firstColumn="1" w:firstRow="1" w:lastColumn="0" w:lastRow="0" w:noHBand="0" w:noVBand="1" w:val="04A0"/>
       </w:tblPr>
       <w:tblGrid>
-        <w:gridCol w:w="1872"/>
-        <w:gridCol w:w="1872"/>
-        <w:gridCol w:w="1872"/>
-        <w:gridCol w:w="1872"/>
-        <w:gridCol w:w="1872"/>
+        <w:gridCol w:w="1930"/>
+        <w:gridCol w:w="1930"/>
+        <w:gridCol w:w="1930"/>
+        <w:gridCol w:w="1930"/>
+        <w:gridCol w:w="1930"/>
       </w:tblGrid>
       <w:tr>
         <w:tc>
           <w:tcPr>
-            <w:tcW w:type="dxa" w:w="1872"/>
+            <w:tcW w:type="dxa" w:w="1930"/>
             <w:tcBorders>
               <w:top w:val="single" w:sz="4" w:space="0" w:color="000000"/>
               <w:bottom w:val="single" w:sz="4" w:space="0" w:color="000000"/>
@@ -5128,10 +5286,10 @@
               <w:right w:val="single" w:sz="4" w:space="0" w:color="000000"/>
             </w:tcBorders>
             <w:tcMar>
-              <w:top w:w="80" w:type="dxa"/>
-              <w:bottom w:w="80" w:type="dxa"/>
-              <w:left w:w="80" w:type="dxa"/>
-              <w:right w:w="80" w:type="dxa"/>
+              <w:top w:w="70" w:type="dxa"/>
+              <w:bottom w:w="70" w:type="dxa"/>
+              <w:left w:w="70" w:type="dxa"/>
+              <w:right w:w="70" w:type="dxa"/>
             </w:tcMar>
           </w:tcPr>
           <w:p>
@@ -5152,7 +5310,7 @@
         </w:tc>
         <w:tc>
           <w:tcPr>
-            <w:tcW w:type="dxa" w:w="1872"/>
+            <w:tcW w:type="dxa" w:w="1930"/>
             <w:tcBorders>
               <w:top w:val="single" w:sz="4" w:space="0" w:color="000000"/>
               <w:bottom w:val="single" w:sz="4" w:space="0" w:color="000000"/>
@@ -5160,10 +5318,10 @@
               <w:right w:val="single" w:sz="4" w:space="0" w:color="000000"/>
             </w:tcBorders>
             <w:tcMar>
-              <w:top w:w="80" w:type="dxa"/>
-              <w:bottom w:w="80" w:type="dxa"/>
-              <w:left w:w="80" w:type="dxa"/>
-              <w:right w:w="80" w:type="dxa"/>
+              <w:top w:w="70" w:type="dxa"/>
+              <w:bottom w:w="70" w:type="dxa"/>
+              <w:left w:w="70" w:type="dxa"/>
+              <w:right w:w="70" w:type="dxa"/>
             </w:tcMar>
           </w:tcPr>
           <w:p>
@@ -5184,7 +5342,7 @@
         </w:tc>
         <w:tc>
           <w:tcPr>
-            <w:tcW w:type="dxa" w:w="1872"/>
+            <w:tcW w:type="dxa" w:w="1930"/>
             <w:tcBorders>
               <w:top w:val="single" w:sz="4" w:space="0" w:color="000000"/>
               <w:bottom w:val="single" w:sz="4" w:space="0" w:color="000000"/>
@@ -5192,10 +5350,10 @@
               <w:right w:val="single" w:sz="4" w:space="0" w:color="000000"/>
             </w:tcBorders>
             <w:tcMar>
-              <w:top w:w="80" w:type="dxa"/>
-              <w:bottom w:w="80" w:type="dxa"/>
-              <w:left w:w="80" w:type="dxa"/>
-              <w:right w:w="80" w:type="dxa"/>
+              <w:top w:w="70" w:type="dxa"/>
+              <w:bottom w:w="70" w:type="dxa"/>
+              <w:left w:w="70" w:type="dxa"/>
+              <w:right w:w="70" w:type="dxa"/>
             </w:tcMar>
           </w:tcPr>
           <w:p>
@@ -5216,7 +5374,7 @@
         </w:tc>
         <w:tc>
           <w:tcPr>
-            <w:tcW w:type="dxa" w:w="1872"/>
+            <w:tcW w:type="dxa" w:w="1930"/>
             <w:tcBorders>
               <w:top w:val="single" w:sz="4" w:space="0" w:color="000000"/>
               <w:bottom w:val="single" w:sz="4" w:space="0" w:color="000000"/>
@@ -5224,10 +5382,10 @@
               <w:right w:val="single" w:sz="4" w:space="0" w:color="000000"/>
             </w:tcBorders>
             <w:tcMar>
-              <w:top w:w="80" w:type="dxa"/>
-              <w:bottom w:w="80" w:type="dxa"/>
-              <w:left w:w="80" w:type="dxa"/>
-              <w:right w:w="80" w:type="dxa"/>
+              <w:top w:w="70" w:type="dxa"/>
+              <w:bottom w:w="70" w:type="dxa"/>
+              <w:left w:w="70" w:type="dxa"/>
+              <w:right w:w="70" w:type="dxa"/>
             </w:tcMar>
           </w:tcPr>
           <w:p>
@@ -5248,7 +5406,7 @@
         </w:tc>
         <w:tc>
           <w:tcPr>
-            <w:tcW w:type="dxa" w:w="1872"/>
+            <w:tcW w:type="dxa" w:w="1930"/>
             <w:tcBorders>
               <w:top w:val="single" w:sz="4" w:space="0" w:color="000000"/>
               <w:bottom w:val="single" w:sz="4" w:space="0" w:color="000000"/>
@@ -5256,10 +5414,10 @@
               <w:right w:val="single" w:sz="4" w:space="0" w:color="000000"/>
             </w:tcBorders>
             <w:tcMar>
-              <w:top w:w="80" w:type="dxa"/>
-              <w:bottom w:w="80" w:type="dxa"/>
-              <w:left w:w="80" w:type="dxa"/>
-              <w:right w:w="80" w:type="dxa"/>
+              <w:top w:w="70" w:type="dxa"/>
+              <w:bottom w:w="70" w:type="dxa"/>
+              <w:left w:w="70" w:type="dxa"/>
+              <w:right w:w="70" w:type="dxa"/>
             </w:tcMar>
           </w:tcPr>
           <w:p>
@@ -5282,7 +5440,7 @@
       <w:tr>
         <w:tc>
           <w:tcPr>
-            <w:tcW w:type="dxa" w:w="1872"/>
+            <w:tcW w:type="dxa" w:w="1930"/>
             <w:tcBorders>
               <w:top w:val="single" w:sz="4" w:space="0" w:color="000000"/>
               <w:bottom w:val="single" w:sz="4" w:space="0" w:color="000000"/>
@@ -5290,10 +5448,10 @@
               <w:right w:val="single" w:sz="4" w:space="0" w:color="000000"/>
             </w:tcBorders>
             <w:tcMar>
-              <w:top w:w="60" w:type="dxa"/>
-              <w:bottom w:w="60" w:type="dxa"/>
-              <w:left w:w="60" w:type="dxa"/>
-              <w:right w:w="60" w:type="dxa"/>
+              <w:top w:w="50" w:type="dxa"/>
+              <w:bottom w:w="50" w:type="dxa"/>
+              <w:left w:w="50" w:type="dxa"/>
+              <w:right w:w="50" w:type="dxa"/>
             </w:tcMar>
           </w:tcPr>
           <w:p>
@@ -5314,7 +5472,7 @@
         </w:tc>
         <w:tc>
           <w:tcPr>
-            <w:tcW w:type="dxa" w:w="1872"/>
+            <w:tcW w:type="dxa" w:w="1930"/>
             <w:tcBorders>
               <w:top w:val="single" w:sz="4" w:space="0" w:color="000000"/>
               <w:bottom w:val="single" w:sz="4" w:space="0" w:color="000000"/>
@@ -5322,10 +5480,10 @@
               <w:right w:val="single" w:sz="4" w:space="0" w:color="000000"/>
             </w:tcBorders>
             <w:tcMar>
-              <w:top w:w="60" w:type="dxa"/>
-              <w:bottom w:w="60" w:type="dxa"/>
-              <w:left w:w="60" w:type="dxa"/>
-              <w:right w:w="60" w:type="dxa"/>
+              <w:top w:w="50" w:type="dxa"/>
+              <w:bottom w:w="50" w:type="dxa"/>
+              <w:left w:w="50" w:type="dxa"/>
+              <w:right w:w="50" w:type="dxa"/>
             </w:tcMar>
           </w:tcPr>
           <w:p>
@@ -5343,7 +5501,7 @@
         </w:tc>
         <w:tc>
           <w:tcPr>
-            <w:tcW w:type="dxa" w:w="1872"/>
+            <w:tcW w:type="dxa" w:w="1930"/>
             <w:tcBorders>
               <w:top w:val="single" w:sz="4" w:space="0" w:color="000000"/>
               <w:bottom w:val="single" w:sz="4" w:space="0" w:color="000000"/>
@@ -5351,10 +5509,10 @@
               <w:right w:val="single" w:sz="4" w:space="0" w:color="000000"/>
             </w:tcBorders>
             <w:tcMar>
-              <w:top w:w="60" w:type="dxa"/>
-              <w:bottom w:w="60" w:type="dxa"/>
-              <w:left w:w="60" w:type="dxa"/>
-              <w:right w:w="60" w:type="dxa"/>
+              <w:top w:w="50" w:type="dxa"/>
+              <w:bottom w:w="50" w:type="dxa"/>
+              <w:left w:w="50" w:type="dxa"/>
+              <w:right w:w="50" w:type="dxa"/>
             </w:tcMar>
           </w:tcPr>
           <w:p>
@@ -5375,7 +5533,7 @@
         </w:tc>
         <w:tc>
           <w:tcPr>
-            <w:tcW w:type="dxa" w:w="1872"/>
+            <w:tcW w:type="dxa" w:w="1930"/>
             <w:tcBorders>
               <w:top w:val="single" w:sz="4" w:space="0" w:color="000000"/>
               <w:bottom w:val="single" w:sz="4" w:space="0" w:color="000000"/>
@@ -5383,10 +5541,10 @@
               <w:right w:val="single" w:sz="4" w:space="0" w:color="000000"/>
             </w:tcBorders>
             <w:tcMar>
-              <w:top w:w="60" w:type="dxa"/>
-              <w:bottom w:w="60" w:type="dxa"/>
-              <w:left w:w="60" w:type="dxa"/>
-              <w:right w:w="60" w:type="dxa"/>
+              <w:top w:w="50" w:type="dxa"/>
+              <w:bottom w:w="50" w:type="dxa"/>
+              <w:left w:w="50" w:type="dxa"/>
+              <w:right w:w="50" w:type="dxa"/>
             </w:tcMar>
           </w:tcPr>
           <w:p>
@@ -5407,7 +5565,7 @@
         </w:tc>
         <w:tc>
           <w:tcPr>
-            <w:tcW w:type="dxa" w:w="1872"/>
+            <w:tcW w:type="dxa" w:w="1930"/>
             <w:tcBorders>
               <w:top w:val="single" w:sz="4" w:space="0" w:color="000000"/>
               <w:bottom w:val="single" w:sz="4" w:space="0" w:color="000000"/>
@@ -5415,10 +5573,10 @@
               <w:right w:val="single" w:sz="4" w:space="0" w:color="000000"/>
             </w:tcBorders>
             <w:tcMar>
-              <w:top w:w="60" w:type="dxa"/>
-              <w:bottom w:w="60" w:type="dxa"/>
-              <w:left w:w="60" w:type="dxa"/>
-              <w:right w:w="60" w:type="dxa"/>
+              <w:top w:w="50" w:type="dxa"/>
+              <w:bottom w:w="50" w:type="dxa"/>
+              <w:left w:w="50" w:type="dxa"/>
+              <w:right w:w="50" w:type="dxa"/>
             </w:tcMar>
           </w:tcPr>
           <w:p>
@@ -5441,7 +5599,7 @@
       <w:tr>
         <w:tc>
           <w:tcPr>
-            <w:tcW w:type="dxa" w:w="1872"/>
+            <w:tcW w:type="dxa" w:w="1930"/>
             <w:tcBorders>
               <w:top w:val="single" w:sz="4" w:space="0" w:color="000000"/>
               <w:bottom w:val="single" w:sz="4" w:space="0" w:color="000000"/>
@@ -5449,10 +5607,10 @@
               <w:right w:val="single" w:sz="4" w:space="0" w:color="000000"/>
             </w:tcBorders>
             <w:tcMar>
-              <w:top w:w="60" w:type="dxa"/>
-              <w:bottom w:w="60" w:type="dxa"/>
-              <w:left w:w="60" w:type="dxa"/>
-              <w:right w:w="60" w:type="dxa"/>
+              <w:top w:w="50" w:type="dxa"/>
+              <w:bottom w:w="50" w:type="dxa"/>
+              <w:left w:w="50" w:type="dxa"/>
+              <w:right w:w="50" w:type="dxa"/>
             </w:tcMar>
           </w:tcPr>
           <w:p>
@@ -5473,7 +5631,7 @@
         </w:tc>
         <w:tc>
           <w:tcPr>
-            <w:tcW w:type="dxa" w:w="1872"/>
+            <w:tcW w:type="dxa" w:w="1930"/>
             <w:tcBorders>
               <w:top w:val="single" w:sz="4" w:space="0" w:color="000000"/>
               <w:bottom w:val="single" w:sz="4" w:space="0" w:color="000000"/>
@@ -5481,10 +5639,10 @@
               <w:right w:val="single" w:sz="4" w:space="0" w:color="000000"/>
             </w:tcBorders>
             <w:tcMar>
-              <w:top w:w="60" w:type="dxa"/>
-              <w:bottom w:w="60" w:type="dxa"/>
-              <w:left w:w="60" w:type="dxa"/>
-              <w:right w:w="60" w:type="dxa"/>
+              <w:top w:w="50" w:type="dxa"/>
+              <w:bottom w:w="50" w:type="dxa"/>
+              <w:left w:w="50" w:type="dxa"/>
+              <w:right w:w="50" w:type="dxa"/>
             </w:tcMar>
           </w:tcPr>
           <w:p>
@@ -5502,7 +5660,7 @@
         </w:tc>
         <w:tc>
           <w:tcPr>
-            <w:tcW w:type="dxa" w:w="1872"/>
+            <w:tcW w:type="dxa" w:w="1930"/>
             <w:tcBorders>
               <w:top w:val="single" w:sz="4" w:space="0" w:color="000000"/>
               <w:bottom w:val="single" w:sz="4" w:space="0" w:color="000000"/>
@@ -5510,10 +5668,10 @@
               <w:right w:val="single" w:sz="4" w:space="0" w:color="000000"/>
             </w:tcBorders>
             <w:tcMar>
-              <w:top w:w="60" w:type="dxa"/>
-              <w:bottom w:w="60" w:type="dxa"/>
-              <w:left w:w="60" w:type="dxa"/>
-              <w:right w:w="60" w:type="dxa"/>
+              <w:top w:w="50" w:type="dxa"/>
+              <w:bottom w:w="50" w:type="dxa"/>
+              <w:left w:w="50" w:type="dxa"/>
+              <w:right w:w="50" w:type="dxa"/>
             </w:tcMar>
           </w:tcPr>
           <w:p>
@@ -5534,7 +5692,7 @@
         </w:tc>
         <w:tc>
           <w:tcPr>
-            <w:tcW w:type="dxa" w:w="1872"/>
+            <w:tcW w:type="dxa" w:w="1930"/>
             <w:tcBorders>
               <w:top w:val="single" w:sz="4" w:space="0" w:color="000000"/>
               <w:bottom w:val="single" w:sz="4" w:space="0" w:color="000000"/>
@@ -5542,10 +5700,10 @@
               <w:right w:val="single" w:sz="4" w:space="0" w:color="000000"/>
             </w:tcBorders>
             <w:tcMar>
-              <w:top w:w="60" w:type="dxa"/>
-              <w:bottom w:w="60" w:type="dxa"/>
-              <w:left w:w="60" w:type="dxa"/>
-              <w:right w:w="60" w:type="dxa"/>
+              <w:top w:w="50" w:type="dxa"/>
+              <w:bottom w:w="50" w:type="dxa"/>
+              <w:left w:w="50" w:type="dxa"/>
+              <w:right w:w="50" w:type="dxa"/>
             </w:tcMar>
           </w:tcPr>
           <w:p>
@@ -5566,7 +5724,7 @@
         </w:tc>
         <w:tc>
           <w:tcPr>
-            <w:tcW w:type="dxa" w:w="1872"/>
+            <w:tcW w:type="dxa" w:w="1930"/>
             <w:tcBorders>
               <w:top w:val="single" w:sz="4" w:space="0" w:color="000000"/>
               <w:bottom w:val="single" w:sz="4" w:space="0" w:color="000000"/>
@@ -5574,10 +5732,10 @@
               <w:right w:val="single" w:sz="4" w:space="0" w:color="000000"/>
             </w:tcBorders>
             <w:tcMar>
-              <w:top w:w="60" w:type="dxa"/>
-              <w:bottom w:w="60" w:type="dxa"/>
-              <w:left w:w="60" w:type="dxa"/>
-              <w:right w:w="60" w:type="dxa"/>
+              <w:top w:w="50" w:type="dxa"/>
+              <w:bottom w:w="50" w:type="dxa"/>
+              <w:left w:w="50" w:type="dxa"/>
+              <w:right w:w="50" w:type="dxa"/>
             </w:tcMar>
           </w:tcPr>
           <w:p>
@@ -5600,7 +5758,7 @@
       <w:tr>
         <w:tc>
           <w:tcPr>
-            <w:tcW w:type="dxa" w:w="1872"/>
+            <w:tcW w:type="dxa" w:w="1930"/>
             <w:tcBorders>
               <w:top w:val="single" w:sz="4" w:space="0" w:color="000000"/>
               <w:bottom w:val="single" w:sz="4" w:space="0" w:color="000000"/>
@@ -5608,10 +5766,10 @@
               <w:right w:val="single" w:sz="4" w:space="0" w:color="000000"/>
             </w:tcBorders>
             <w:tcMar>
-              <w:top w:w="60" w:type="dxa"/>
-              <w:bottom w:w="60" w:type="dxa"/>
-              <w:left w:w="60" w:type="dxa"/>
-              <w:right w:w="60" w:type="dxa"/>
+              <w:top w:w="50" w:type="dxa"/>
+              <w:bottom w:w="50" w:type="dxa"/>
+              <w:left w:w="50" w:type="dxa"/>
+              <w:right w:w="50" w:type="dxa"/>
             </w:tcMar>
           </w:tcPr>
           <w:p>
@@ -5632,7 +5790,7 @@
         </w:tc>
         <w:tc>
           <w:tcPr>
-            <w:tcW w:type="dxa" w:w="1872"/>
+            <w:tcW w:type="dxa" w:w="1930"/>
             <w:tcBorders>
               <w:top w:val="single" w:sz="4" w:space="0" w:color="000000"/>
               <w:bottom w:val="single" w:sz="4" w:space="0" w:color="000000"/>
@@ -5640,10 +5798,10 @@
               <w:right w:val="single" w:sz="4" w:space="0" w:color="000000"/>
             </w:tcBorders>
             <w:tcMar>
-              <w:top w:w="60" w:type="dxa"/>
-              <w:bottom w:w="60" w:type="dxa"/>
-              <w:left w:w="60" w:type="dxa"/>
-              <w:right w:w="60" w:type="dxa"/>
+              <w:top w:w="50" w:type="dxa"/>
+              <w:bottom w:w="50" w:type="dxa"/>
+              <w:left w:w="50" w:type="dxa"/>
+              <w:right w:w="50" w:type="dxa"/>
             </w:tcMar>
           </w:tcPr>
           <w:p>
@@ -5661,7 +5819,7 @@
         </w:tc>
         <w:tc>
           <w:tcPr>
-            <w:tcW w:type="dxa" w:w="1872"/>
+            <w:tcW w:type="dxa" w:w="1930"/>
             <w:tcBorders>
               <w:top w:val="single" w:sz="4" w:space="0" w:color="000000"/>
               <w:bottom w:val="single" w:sz="4" w:space="0" w:color="000000"/>
@@ -5669,10 +5827,10 @@
               <w:right w:val="single" w:sz="4" w:space="0" w:color="000000"/>
             </w:tcBorders>
             <w:tcMar>
-              <w:top w:w="60" w:type="dxa"/>
-              <w:bottom w:w="60" w:type="dxa"/>
-              <w:left w:w="60" w:type="dxa"/>
-              <w:right w:w="60" w:type="dxa"/>
+              <w:top w:w="50" w:type="dxa"/>
+              <w:bottom w:w="50" w:type="dxa"/>
+              <w:left w:w="50" w:type="dxa"/>
+              <w:right w:w="50" w:type="dxa"/>
             </w:tcMar>
           </w:tcPr>
           <w:p>
@@ -5693,7 +5851,7 @@
         </w:tc>
         <w:tc>
           <w:tcPr>
-            <w:tcW w:type="dxa" w:w="1872"/>
+            <w:tcW w:type="dxa" w:w="1930"/>
             <w:tcBorders>
               <w:top w:val="single" w:sz="4" w:space="0" w:color="000000"/>
               <w:bottom w:val="single" w:sz="4" w:space="0" w:color="000000"/>
@@ -5701,10 +5859,10 @@
               <w:right w:val="single" w:sz="4" w:space="0" w:color="000000"/>
             </w:tcBorders>
             <w:tcMar>
-              <w:top w:w="60" w:type="dxa"/>
-              <w:bottom w:w="60" w:type="dxa"/>
-              <w:left w:w="60" w:type="dxa"/>
-              <w:right w:w="60" w:type="dxa"/>
+              <w:top w:w="50" w:type="dxa"/>
+              <w:bottom w:w="50" w:type="dxa"/>
+              <w:left w:w="50" w:type="dxa"/>
+              <w:right w:w="50" w:type="dxa"/>
             </w:tcMar>
           </w:tcPr>
           <w:p>
@@ -5725,7 +5883,7 @@
         </w:tc>
         <w:tc>
           <w:tcPr>
-            <w:tcW w:type="dxa" w:w="1872"/>
+            <w:tcW w:type="dxa" w:w="1930"/>
             <w:tcBorders>
               <w:top w:val="single" w:sz="4" w:space="0" w:color="000000"/>
               <w:bottom w:val="single" w:sz="4" w:space="0" w:color="000000"/>
@@ -5733,10 +5891,10 @@
               <w:right w:val="single" w:sz="4" w:space="0" w:color="000000"/>
             </w:tcBorders>
             <w:tcMar>
-              <w:top w:w="60" w:type="dxa"/>
-              <w:bottom w:w="60" w:type="dxa"/>
-              <w:left w:w="60" w:type="dxa"/>
-              <w:right w:w="60" w:type="dxa"/>
+              <w:top w:w="50" w:type="dxa"/>
+              <w:bottom w:w="50" w:type="dxa"/>
+              <w:left w:w="50" w:type="dxa"/>
+              <w:right w:w="50" w:type="dxa"/>
             </w:tcMar>
           </w:tcPr>
           <w:p>
@@ -5759,7 +5917,7 @@
       <w:tr>
         <w:tc>
           <w:tcPr>
-            <w:tcW w:type="dxa" w:w="1872"/>
+            <w:tcW w:type="dxa" w:w="1930"/>
             <w:tcBorders>
               <w:top w:val="single" w:sz="4" w:space="0" w:color="000000"/>
               <w:bottom w:val="single" w:sz="4" w:space="0" w:color="000000"/>
@@ -5767,10 +5925,10 @@
               <w:right w:val="single" w:sz="4" w:space="0" w:color="000000"/>
             </w:tcBorders>
             <w:tcMar>
-              <w:top w:w="60" w:type="dxa"/>
-              <w:bottom w:w="60" w:type="dxa"/>
-              <w:left w:w="60" w:type="dxa"/>
-              <w:right w:w="60" w:type="dxa"/>
+              <w:top w:w="50" w:type="dxa"/>
+              <w:bottom w:w="50" w:type="dxa"/>
+              <w:left w:w="50" w:type="dxa"/>
+              <w:right w:w="50" w:type="dxa"/>
             </w:tcMar>
           </w:tcPr>
           <w:p>
@@ -5791,7 +5949,7 @@
         </w:tc>
         <w:tc>
           <w:tcPr>
-            <w:tcW w:type="dxa" w:w="1872"/>
+            <w:tcW w:type="dxa" w:w="1930"/>
             <w:tcBorders>
               <w:top w:val="single" w:sz="4" w:space="0" w:color="000000"/>
               <w:bottom w:val="single" w:sz="4" w:space="0" w:color="000000"/>
@@ -5799,10 +5957,10 @@
               <w:right w:val="single" w:sz="4" w:space="0" w:color="000000"/>
             </w:tcBorders>
             <w:tcMar>
-              <w:top w:w="60" w:type="dxa"/>
-              <w:bottom w:w="60" w:type="dxa"/>
-              <w:left w:w="60" w:type="dxa"/>
-              <w:right w:w="60" w:type="dxa"/>
+              <w:top w:w="50" w:type="dxa"/>
+              <w:bottom w:w="50" w:type="dxa"/>
+              <w:left w:w="50" w:type="dxa"/>
+              <w:right w:w="50" w:type="dxa"/>
             </w:tcMar>
           </w:tcPr>
           <w:p>
@@ -5820,7 +5978,7 @@
         </w:tc>
         <w:tc>
           <w:tcPr>
-            <w:tcW w:type="dxa" w:w="1872"/>
+            <w:tcW w:type="dxa" w:w="1930"/>
             <w:tcBorders>
               <w:top w:val="single" w:sz="4" w:space="0" w:color="000000"/>
               <w:bottom w:val="single" w:sz="4" w:space="0" w:color="000000"/>
@@ -5828,10 +5986,10 @@
               <w:right w:val="single" w:sz="4" w:space="0" w:color="000000"/>
             </w:tcBorders>
             <w:tcMar>
-              <w:top w:w="60" w:type="dxa"/>
-              <w:bottom w:w="60" w:type="dxa"/>
-              <w:left w:w="60" w:type="dxa"/>
-              <w:right w:w="60" w:type="dxa"/>
+              <w:top w:w="50" w:type="dxa"/>
+              <w:bottom w:w="50" w:type="dxa"/>
+              <w:left w:w="50" w:type="dxa"/>
+              <w:right w:w="50" w:type="dxa"/>
             </w:tcMar>
           </w:tcPr>
           <w:p>
@@ -5852,7 +6010,7 @@
         </w:tc>
         <w:tc>
           <w:tcPr>
-            <w:tcW w:type="dxa" w:w="1872"/>
+            <w:tcW w:type="dxa" w:w="1930"/>
             <w:tcBorders>
               <w:top w:val="single" w:sz="4" w:space="0" w:color="000000"/>
               <w:bottom w:val="single" w:sz="4" w:space="0" w:color="000000"/>
@@ -5860,10 +6018,10 @@
               <w:right w:val="single" w:sz="4" w:space="0" w:color="000000"/>
             </w:tcBorders>
             <w:tcMar>
-              <w:top w:w="60" w:type="dxa"/>
-              <w:bottom w:w="60" w:type="dxa"/>
-              <w:left w:w="60" w:type="dxa"/>
-              <w:right w:w="60" w:type="dxa"/>
+              <w:top w:w="50" w:type="dxa"/>
+              <w:bottom w:w="50" w:type="dxa"/>
+              <w:left w:w="50" w:type="dxa"/>
+              <w:right w:w="50" w:type="dxa"/>
             </w:tcMar>
           </w:tcPr>
           <w:p>
@@ -5884,7 +6042,7 @@
         </w:tc>
         <w:tc>
           <w:tcPr>
-            <w:tcW w:type="dxa" w:w="1872"/>
+            <w:tcW w:type="dxa" w:w="1930"/>
             <w:tcBorders>
               <w:top w:val="single" w:sz="4" w:space="0" w:color="000000"/>
               <w:bottom w:val="single" w:sz="4" w:space="0" w:color="000000"/>
@@ -5892,10 +6050,10 @@
               <w:right w:val="single" w:sz="4" w:space="0" w:color="000000"/>
             </w:tcBorders>
             <w:tcMar>
-              <w:top w:w="60" w:type="dxa"/>
-              <w:bottom w:w="60" w:type="dxa"/>
-              <w:left w:w="60" w:type="dxa"/>
-              <w:right w:w="60" w:type="dxa"/>
+              <w:top w:w="50" w:type="dxa"/>
+              <w:bottom w:w="50" w:type="dxa"/>
+              <w:left w:w="50" w:type="dxa"/>
+              <w:right w:w="50" w:type="dxa"/>
             </w:tcMar>
           </w:tcPr>
           <w:p>
@@ -5918,7 +6076,7 @@
       <w:tr>
         <w:tc>
           <w:tcPr>
-            <w:tcW w:type="dxa" w:w="1872"/>
+            <w:tcW w:type="dxa" w:w="1930"/>
             <w:tcBorders>
               <w:top w:val="single" w:sz="4" w:space="0" w:color="000000"/>
               <w:bottom w:val="single" w:sz="4" w:space="0" w:color="000000"/>
@@ -5926,10 +6084,10 @@
               <w:right w:val="single" w:sz="4" w:space="0" w:color="000000"/>
             </w:tcBorders>
             <w:tcMar>
-              <w:top w:w="60" w:type="dxa"/>
-              <w:bottom w:w="60" w:type="dxa"/>
-              <w:left w:w="60" w:type="dxa"/>
-              <w:right w:w="60" w:type="dxa"/>
+              <w:top w:w="50" w:type="dxa"/>
+              <w:bottom w:w="50" w:type="dxa"/>
+              <w:left w:w="50" w:type="dxa"/>
+              <w:right w:w="50" w:type="dxa"/>
             </w:tcMar>
           </w:tcPr>
           <w:p>
@@ -5950,7 +6108,7 @@
         </w:tc>
         <w:tc>
           <w:tcPr>
-            <w:tcW w:type="dxa" w:w="1872"/>
+            <w:tcW w:type="dxa" w:w="1930"/>
             <w:tcBorders>
               <w:top w:val="single" w:sz="4" w:space="0" w:color="000000"/>
               <w:bottom w:val="single" w:sz="4" w:space="0" w:color="000000"/>
@@ -5958,10 +6116,10 @@
               <w:right w:val="single" w:sz="4" w:space="0" w:color="000000"/>
             </w:tcBorders>
             <w:tcMar>
-              <w:top w:w="60" w:type="dxa"/>
-              <w:bottom w:w="60" w:type="dxa"/>
-              <w:left w:w="60" w:type="dxa"/>
-              <w:right w:w="60" w:type="dxa"/>
+              <w:top w:w="50" w:type="dxa"/>
+              <w:bottom w:w="50" w:type="dxa"/>
+              <w:left w:w="50" w:type="dxa"/>
+              <w:right w:w="50" w:type="dxa"/>
             </w:tcMar>
           </w:tcPr>
           <w:p>
@@ -5979,7 +6137,7 @@
         </w:tc>
         <w:tc>
           <w:tcPr>
-            <w:tcW w:type="dxa" w:w="1872"/>
+            <w:tcW w:type="dxa" w:w="1930"/>
             <w:tcBorders>
               <w:top w:val="single" w:sz="4" w:space="0" w:color="000000"/>
               <w:bottom w:val="single" w:sz="4" w:space="0" w:color="000000"/>
@@ -5987,10 +6145,10 @@
               <w:right w:val="single" w:sz="4" w:space="0" w:color="000000"/>
             </w:tcBorders>
             <w:tcMar>
-              <w:top w:w="60" w:type="dxa"/>
-              <w:bottom w:w="60" w:type="dxa"/>
-              <w:left w:w="60" w:type="dxa"/>
-              <w:right w:w="60" w:type="dxa"/>
+              <w:top w:w="50" w:type="dxa"/>
+              <w:bottom w:w="50" w:type="dxa"/>
+              <w:left w:w="50" w:type="dxa"/>
+              <w:right w:w="50" w:type="dxa"/>
             </w:tcMar>
           </w:tcPr>
           <w:p>
@@ -6011,7 +6169,7 @@
         </w:tc>
         <w:tc>
           <w:tcPr>
-            <w:tcW w:type="dxa" w:w="1872"/>
+            <w:tcW w:type="dxa" w:w="1930"/>
             <w:tcBorders>
               <w:top w:val="single" w:sz="4" w:space="0" w:color="000000"/>
               <w:bottom w:val="single" w:sz="4" w:space="0" w:color="000000"/>
@@ -6019,10 +6177,10 @@
               <w:right w:val="single" w:sz="4" w:space="0" w:color="000000"/>
             </w:tcBorders>
             <w:tcMar>
-              <w:top w:w="60" w:type="dxa"/>
-              <w:bottom w:w="60" w:type="dxa"/>
-              <w:left w:w="60" w:type="dxa"/>
-              <w:right w:w="60" w:type="dxa"/>
+              <w:top w:w="50" w:type="dxa"/>
+              <w:bottom w:w="50" w:type="dxa"/>
+              <w:left w:w="50" w:type="dxa"/>
+              <w:right w:w="50" w:type="dxa"/>
             </w:tcMar>
           </w:tcPr>
           <w:p>
@@ -6043,7 +6201,7 @@
         </w:tc>
         <w:tc>
           <w:tcPr>
-            <w:tcW w:type="dxa" w:w="1872"/>
+            <w:tcW w:type="dxa" w:w="1930"/>
             <w:tcBorders>
               <w:top w:val="single" w:sz="4" w:space="0" w:color="000000"/>
               <w:bottom w:val="single" w:sz="4" w:space="0" w:color="000000"/>
@@ -6051,10 +6209,10 @@
               <w:right w:val="single" w:sz="4" w:space="0" w:color="000000"/>
             </w:tcBorders>
             <w:tcMar>
-              <w:top w:w="60" w:type="dxa"/>
-              <w:bottom w:w="60" w:type="dxa"/>
-              <w:left w:w="60" w:type="dxa"/>
-              <w:right w:w="60" w:type="dxa"/>
+              <w:top w:w="50" w:type="dxa"/>
+              <w:bottom w:w="50" w:type="dxa"/>
+              <w:left w:w="50" w:type="dxa"/>
+              <w:right w:w="50" w:type="dxa"/>
             </w:tcMar>
           </w:tcPr>
           <w:p>
@@ -6077,13 +6235,13 @@
     </w:tbl>
     <w:p>
       <w:pPr>
-        <w:spacing w:after="360" w:before="0" w:line="276" w:lineRule="auto"/>
+        <w:spacing w:after="280" w:before="0" w:line="276" w:lineRule="auto"/>
         <w:jc w:val="left"/>
       </w:pPr>
     </w:p>
     <w:p>
       <w:pPr>
-        <w:spacing w:after="200" w:before="0" w:line="276" w:lineRule="auto"/>
+        <w:spacing w:after="160" w:before="0" w:line="276" w:lineRule="auto"/>
         <w:jc w:val="left"/>
       </w:pPr>
       <w:r>
@@ -6099,7 +6257,7 @@
     </w:p>
     <w:p>
       <w:pPr>
-        <w:spacing w:after="200" w:before="0" w:line="276" w:lineRule="auto"/>
+        <w:spacing w:after="160" w:before="0" w:line="276" w:lineRule="auto"/>
         <w:jc w:val="left"/>
       </w:pPr>
       <w:r>
@@ -6115,7 +6273,7 @@
     </w:p>
     <w:sectPr>
       <w:pgSz w:w="12240" w:h="15840"/>
-      <w:pgMar w:top="1440" w:right="1440" w:bottom="1440" w:left="1440" w:header="720" w:footer="720" w:gutter="0"/>
+      <w:pgMar w:top="1152" w:right="1296" w:bottom="1152" w:left="1296" w:header="720" w:footer="720" w:gutter="0"/>
       <w:cols w:space="720"/>
       <w:docGrid w:linePitch="360"/>
     </w:sectPr>

</xml_diff>

<commit_message>
docs: sync project report with VPPCOE&VA sample report template, update official banner logo, clean dummy files
</commit_message>
<xml_diff>
--- a/CampusNotify_Mini_Project_Logbook.docx
+++ b/CampusNotify_Mini_Project_Logbook.docx
@@ -37,7 +37,7 @@
             <w:r>
               <w:drawing>
                 <wp:inline xmlns:a="http://schemas.openxmlformats.org/drawingml/2006/main" xmlns:pic="http://schemas.openxmlformats.org/drawingml/2006/picture">
-                  <wp:extent cx="960120" cy="1222754"/>
+                  <wp:extent cx="960120" cy="1104138"/>
                   <wp:docPr id="1" name="Picture 1"/>
                   <wp:cNvGraphicFramePr>
                     <a:graphicFrameLocks noChangeAspect="1"/>
@@ -58,7 +58,7 @@
                         <pic:spPr>
                           <a:xfrm>
                             <a:off x="0" y="0"/>
-                            <a:ext cx="960120" cy="1222754"/>
+                            <a:ext cx="960120" cy="1104138"/>
                           </a:xfrm>
                           <a:prstGeom prst="rect"/>
                         </pic:spPr>
@@ -163,7 +163,7 @@
             <w:r>
               <w:drawing>
                 <wp:inline xmlns:a="http://schemas.openxmlformats.org/drawingml/2006/main" xmlns:pic="http://schemas.openxmlformats.org/drawingml/2006/picture">
-                  <wp:extent cx="960120" cy="1286198"/>
+                  <wp:extent cx="960120" cy="1298986"/>
                   <wp:docPr id="2" name="Picture 2"/>
                   <wp:cNvGraphicFramePr>
                     <a:graphicFrameLocks noChangeAspect="1"/>
@@ -184,7 +184,7 @@
                         <pic:spPr>
                           <a:xfrm>
                             <a:off x="0" y="0"/>
-                            <a:ext cx="960120" cy="1286198"/>
+                            <a:ext cx="960120" cy="1298986"/>
                           </a:xfrm>
                           <a:prstGeom prst="rect"/>
                         </pic:spPr>

</xml_diff>